<commit_message>
update structure for second workshop
</commit_message>
<xml_diff>
--- a/2. Markov model/Markov_Sick-Sicker Exercise instructions.docx
+++ b/2. Markov model/Markov_Sick-Sicker Exercise instructions.docx
@@ -1,22 +1,16 @@
 
 <file path=word/document.xml><?xml version="1.0" encoding="utf-8"?>
-<w:document xmlns:wpc="http://schemas.microsoft.com/office/word/2010/wordprocessingCanvas" xmlns:mo="http://schemas.microsoft.com/office/mac/office/2008/main" xmlns:mc="http://schemas.openxmlformats.org/markup-compatibility/2006" xmlns:mv="urn:schemas-microsoft-com:mac:vml" xmlns:o="urn:schemas-microsoft-com:office:office" xmlns:r="http://schemas.openxmlformats.org/officeDocument/2006/relationships" xmlns:m="http://schemas.openxmlformats.org/officeDocument/2006/math" xmlns:v="urn:schemas-microsoft-com:vml" xmlns:wp14="http://schemas.microsoft.com/office/word/2010/wordprocessingDrawing" xmlns:wp="http://schemas.openxmlformats.org/drawingml/2006/wordprocessingDrawing" xmlns:w10="urn:schemas-microsoft-com:office:word" xmlns:w="http://schemas.openxmlformats.org/wordprocessingml/2006/main" xmlns:w14="http://schemas.microsoft.com/office/word/2010/wordml" xmlns:wpg="http://schemas.microsoft.com/office/word/2010/wordprocessingGroup" xmlns:wpi="http://schemas.microsoft.com/office/word/2010/wordprocessingInk" xmlns:wne="http://schemas.microsoft.com/office/word/2006/wordml" xmlns:wps="http://schemas.microsoft.com/office/word/2010/wordprocessingShape" mc:Ignorable="w14 wp14">
+<w:document xmlns:wpc="http://schemas.microsoft.com/office/word/2010/wordprocessingCanvas" xmlns:cx="http://schemas.microsoft.com/office/drawing/2014/chartex" xmlns:cx1="http://schemas.microsoft.com/office/drawing/2015/9/8/chartex" xmlns:cx2="http://schemas.microsoft.com/office/drawing/2015/10/21/chartex" xmlns:cx3="http://schemas.microsoft.com/office/drawing/2016/5/9/chartex" xmlns:cx4="http://schemas.microsoft.com/office/drawing/2016/5/10/chartex" xmlns:cx5="http://schemas.microsoft.com/office/drawing/2016/5/11/chartex" xmlns:cx6="http://schemas.microsoft.com/office/drawing/2016/5/12/chartex" xmlns:cx7="http://schemas.microsoft.com/office/drawing/2016/5/13/chartex" xmlns:cx8="http://schemas.microsoft.com/office/drawing/2016/5/14/chartex" xmlns:mc="http://schemas.openxmlformats.org/markup-compatibility/2006" xmlns:aink="http://schemas.microsoft.com/office/drawing/2016/ink" xmlns:am3d="http://schemas.microsoft.com/office/drawing/2017/model3d" xmlns:o="urn:schemas-microsoft-com:office:office" xmlns:r="http://schemas.openxmlformats.org/officeDocument/2006/relationships" xmlns:m="http://schemas.openxmlformats.org/officeDocument/2006/math" xmlns:v="urn:schemas-microsoft-com:vml" xmlns:wp14="http://schemas.microsoft.com/office/word/2010/wordprocessingDrawing" xmlns:wp="http://schemas.openxmlformats.org/drawingml/2006/wordprocessingDrawing" xmlns:w10="urn:schemas-microsoft-com:office:word" xmlns:w="http://schemas.openxmlformats.org/wordprocessingml/2006/main" xmlns:w14="http://schemas.microsoft.com/office/word/2010/wordml" xmlns:w15="http://schemas.microsoft.com/office/word/2012/wordml" xmlns:w16cid="http://schemas.microsoft.com/office/word/2016/wordml/cid" xmlns:w16se="http://schemas.microsoft.com/office/word/2015/wordml/symex" xmlns:wpg="http://schemas.microsoft.com/office/word/2010/wordprocessingGroup" xmlns:wpi="http://schemas.microsoft.com/office/word/2010/wordprocessingInk" xmlns:wne="http://schemas.microsoft.com/office/word/2006/wordml" xmlns:wps="http://schemas.microsoft.com/office/word/2010/wordprocessingShape" mc:Ignorable="w14 w15 w16se w16cid wp14">
   <w:body>
     <w:p>
       <w:pPr>
-        <w:pStyle w:val="Titel"/>
-        <w:rPr>
-          <w:lang w:val="en-US"/>
-        </w:rPr>
-      </w:pPr>
-    </w:p>
-    <w:p>
-      <w:pPr>
-        <w:pStyle w:val="Titel"/>
-        <w:rPr>
-          <w:lang w:val="en-US"/>
-        </w:rPr>
-      </w:pPr>
+        <w:pStyle w:val="Title"/>
+        <w:rPr>
+          <w:lang w:val="en-US"/>
+        </w:rPr>
+      </w:pPr>
+      <w:bookmarkStart w:id="0" w:name="_GoBack"/>
+      <w:bookmarkEnd w:id="0"/>
       <w:r>
         <w:rPr>
           <w:noProof/>
@@ -98,7 +92,7 @@
               </wp:anchor>
             </w:drawing>
           </mc:Choice>
-          <mc:Fallback xmlns:w16se="http://schemas.microsoft.com/office/word/2015/wordml/symex" xmlns:w16cid="http://schemas.microsoft.com/office/word/2016/wordml/cid" xmlns:w15="http://schemas.microsoft.com/office/word/2012/wordml" xmlns:am3d="http://schemas.microsoft.com/office/drawing/2017/model3d" xmlns:aink="http://schemas.microsoft.com/office/drawing/2016/ink" xmlns:cx8="http://schemas.microsoft.com/office/drawing/2016/5/14/chartex" xmlns:cx7="http://schemas.microsoft.com/office/drawing/2016/5/13/chartex" xmlns:cx6="http://schemas.microsoft.com/office/drawing/2016/5/12/chartex" xmlns:cx5="http://schemas.microsoft.com/office/drawing/2016/5/11/chartex" xmlns:cx4="http://schemas.microsoft.com/office/drawing/2016/5/10/chartex" xmlns:cx3="http://schemas.microsoft.com/office/drawing/2016/5/9/chartex" xmlns:cx2="http://schemas.microsoft.com/office/drawing/2015/10/21/chartex" xmlns:cx1="http://schemas.microsoft.com/office/drawing/2015/9/8/chartex" xmlns:cx="http://schemas.microsoft.com/office/drawing/2014/chartex">
+          <mc:Fallback>
             <w:pict>
               <v:rect w14:anchorId="780047C7" id="Rectangle 2" o:spid="_x0000_s1026" style="position:absolute;left:0;text-align:left;margin-left:-73.25pt;margin-top:-120.05pt;width:60.6pt;height:840.9pt;z-index:251656704;visibility:visible;mso-wrap-style:square;mso-width-percent:0;mso-height-percent:0;mso-wrap-distance-left:9pt;mso-wrap-distance-top:0;mso-wrap-distance-right:9pt;mso-wrap-distance-bottom:0;mso-position-horizontal:absolute;mso-position-horizontal-relative:text;mso-position-vertical:absolute;mso-position-vertical-relative:text;mso-width-percent:0;mso-height-percent:0;mso-width-relative:page;mso-height-relative:page;v-text-anchor:top" o:gfxdata="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" fillcolor="#099" stroked="f">
                 <v:shadow on="t" color="white" opacity=".5" offset="1pt"/>
@@ -129,7 +123,7 @@
     </w:p>
     <w:p>
       <w:pPr>
-        <w:pStyle w:val="Titel"/>
+        <w:pStyle w:val="Title"/>
         <w:rPr>
           <w:sz w:val="24"/>
           <w:szCs w:val="28"/>
@@ -394,28 +388,17 @@
                 <w:rFonts w:ascii="Verdana" w:eastAsia="Times New Roman" w:hAnsi="Verdana"/>
                 <w:bCs/>
                 <w:sz w:val="24"/>
-                <w:lang w:val="en-US"/>
-              </w:rPr>
-            </w:pPr>
-            <w:proofErr w:type="spellStart"/>
+                <w:lang w:val="nl-NL"/>
+              </w:rPr>
+            </w:pPr>
             <w:r>
               <w:rPr>
                 <w:rFonts w:ascii="Verdana" w:eastAsia="Times New Roman" w:hAnsi="Verdana"/>
                 <w:bCs/>
                 <w:sz w:val="24"/>
-                <w:lang w:val="en-US"/>
-              </w:rPr>
-              <w:t>Hawre</w:t>
-            </w:r>
-            <w:proofErr w:type="spellEnd"/>
-            <w:r>
-              <w:rPr>
-                <w:rFonts w:ascii="Verdana" w:eastAsia="Times New Roman" w:hAnsi="Verdana"/>
-                <w:bCs/>
-                <w:sz w:val="24"/>
-                <w:lang w:val="en-US"/>
-              </w:rPr>
-              <w:t xml:space="preserve"> J. Jalal, MD, PhD</w:t>
+                <w:lang w:val="nl-NL"/>
+              </w:rPr>
+              <w:t>Hawre J. Jalal, MD, PhD</w:t>
             </w:r>
             <w:r>
               <w:rPr>
@@ -423,7 +406,7 @@
                 <w:bCs/>
                 <w:sz w:val="24"/>
                 <w:vertAlign w:val="superscript"/>
-                <w:lang w:val="en-US"/>
+                <w:lang w:val="nl-NL"/>
               </w:rPr>
               <w:t>4</w:t>
             </w:r>
@@ -432,7 +415,7 @@
                 <w:rFonts w:ascii="Verdana" w:eastAsia="Times New Roman" w:hAnsi="Verdana"/>
                 <w:bCs/>
                 <w:sz w:val="24"/>
-                <w:lang w:val="en-US"/>
+                <w:lang w:val="nl-NL"/>
               </w:rPr>
               <w:t xml:space="preserve"> </w:t>
             </w:r>
@@ -449,7 +432,7 @@
                 <w:bCs/>
                 <w:sz w:val="24"/>
                 <w:vertAlign w:val="superscript"/>
-                <w:lang w:val="en-US"/>
+                <w:lang w:val="nl-NL"/>
               </w:rPr>
             </w:pPr>
             <w:r>
@@ -457,29 +440,9 @@
                 <w:rFonts w:ascii="Verdana" w:eastAsia="Times New Roman" w:hAnsi="Verdana"/>
                 <w:bCs/>
                 <w:sz w:val="24"/>
-                <w:lang w:val="en-US"/>
-              </w:rPr>
-              <w:t xml:space="preserve">Eline M. </w:t>
-            </w:r>
-            <w:proofErr w:type="spellStart"/>
-            <w:r>
-              <w:rPr>
-                <w:rFonts w:ascii="Verdana" w:eastAsia="Times New Roman" w:hAnsi="Verdana"/>
-                <w:bCs/>
-                <w:sz w:val="24"/>
-                <w:lang w:val="en-US"/>
-              </w:rPr>
-              <w:t>Krijkamp</w:t>
-            </w:r>
-            <w:proofErr w:type="spellEnd"/>
-            <w:r>
-              <w:rPr>
-                <w:rFonts w:ascii="Verdana" w:eastAsia="Times New Roman" w:hAnsi="Verdana"/>
-                <w:bCs/>
-                <w:sz w:val="24"/>
-                <w:lang w:val="en-US"/>
-              </w:rPr>
-              <w:t>, MSc</w:t>
+                <w:lang w:val="nl-NL"/>
+              </w:rPr>
+              <w:t>Eline M. Krijkamp, MSc</w:t>
             </w:r>
             <w:r>
               <w:rPr>
@@ -487,7 +450,7 @@
                 <w:bCs/>
                 <w:sz w:val="24"/>
                 <w:vertAlign w:val="superscript"/>
-                <w:lang w:val="en-US"/>
+                <w:lang w:val="nl-NL"/>
               </w:rPr>
               <w:t>2</w:t>
             </w:r>
@@ -497,7 +460,7 @@
                 <w:bCs/>
                 <w:sz w:val="24"/>
                 <w:vertAlign w:val="superscript"/>
-                <w:lang w:val="en-US"/>
+                <w:lang w:val="nl-NL"/>
               </w:rPr>
               <w:tab/>
             </w:r>
@@ -601,7 +564,7 @@
           </w:p>
           <w:p>
             <w:pPr>
-              <w:pStyle w:val="Citaat"/>
+              <w:pStyle w:val="Quote"/>
               <w:rPr>
                 <w:lang w:val="en-US"/>
               </w:rPr>
@@ -705,7 +668,7 @@
           <w:lang w:val="en-US"/>
         </w:rPr>
       </w:pPr>
-      <w:hyperlink r:id="rId9" w:history="1">
+      <w:hyperlink r:id="rId8" w:history="1">
         <w:r>
           <w:rPr>
             <w:rStyle w:val="Hyperlink"/>
@@ -859,7 +822,6 @@
           <w:lang w:val="en-US"/>
         </w:rPr>
       </w:pPr>
-      <w:proofErr w:type="spellStart"/>
       <w:r>
         <w:rPr>
           <w:rFonts w:ascii="Verdana" w:hAnsi="Verdana"/>
@@ -868,9 +830,9 @@
           <w:szCs w:val="20"/>
           <w:lang w:val="en-US"/>
         </w:rPr>
-        <w:t>Krijkamp</w:t>
-      </w:r>
-      <w:proofErr w:type="spellEnd"/>
+        <w:t xml:space="preserve">Krijkamp EM, et al. Microsimulation modeling for health decision sciences using R: a tutorial. Med. </w:t>
+      </w:r>
+      <w:proofErr w:type="spellStart"/>
       <w:r>
         <w:rPr>
           <w:rFonts w:ascii="Verdana" w:hAnsi="Verdana"/>
@@ -879,9 +841,8 @@
           <w:szCs w:val="20"/>
           <w:lang w:val="en-US"/>
         </w:rPr>
-        <w:t xml:space="preserve"> EM, et al. Microsimulation modeling for health decision sciences using R: a tutorial. Med. </w:t>
-      </w:r>
-      <w:proofErr w:type="spellStart"/>
+        <w:t>Dec</w:t>
+      </w:r>
       <w:r>
         <w:rPr>
           <w:rFonts w:ascii="Verdana" w:hAnsi="Verdana"/>
@@ -890,8 +851,9 @@
           <w:szCs w:val="20"/>
           <w:lang w:val="en-US"/>
         </w:rPr>
-        <w:t>Dec</w:t>
-      </w:r>
+        <w:t>is</w:t>
+      </w:r>
+      <w:proofErr w:type="spellEnd"/>
       <w:r>
         <w:rPr>
           <w:rFonts w:ascii="Verdana" w:hAnsi="Verdana"/>
@@ -900,9 +862,8 @@
           <w:szCs w:val="20"/>
           <w:lang w:val="en-US"/>
         </w:rPr>
-        <w:t>is</w:t>
-      </w:r>
-      <w:proofErr w:type="spellEnd"/>
+        <w:t>. Mak</w:t>
+      </w:r>
       <w:r>
         <w:rPr>
           <w:rFonts w:ascii="Verdana" w:hAnsi="Verdana"/>
@@ -911,7 +872,7 @@
           <w:szCs w:val="20"/>
           <w:lang w:val="en-US"/>
         </w:rPr>
-        <w:t>. Mak</w:t>
+        <w:t>ing</w:t>
       </w:r>
       <w:r>
         <w:rPr>
@@ -921,16 +882,6 @@
           <w:szCs w:val="20"/>
           <w:lang w:val="en-US"/>
         </w:rPr>
-        <w:t>ing</w:t>
-      </w:r>
-      <w:r>
-        <w:rPr>
-          <w:rFonts w:ascii="Verdana" w:hAnsi="Verdana"/>
-          <w:color w:val="009999"/>
-          <w:sz w:val="16"/>
-          <w:szCs w:val="20"/>
-          <w:lang w:val="en-US"/>
-        </w:rPr>
         <w:t xml:space="preserve">. 2018; (in press). </w:t>
       </w:r>
     </w:p>
@@ -946,7 +897,7 @@
           <w:lang w:val="en-US"/>
         </w:rPr>
       </w:pPr>
-      <w:hyperlink r:id="rId10" w:history="1">
+      <w:hyperlink r:id="rId9" w:history="1">
         <w:r>
           <w:rPr>
             <w:rStyle w:val="Hyperlink"/>
@@ -1309,7 +1260,7 @@
     </w:p>
     <w:p>
       <w:pPr>
-        <w:pStyle w:val="Koptekst"/>
+        <w:pStyle w:val="Header"/>
         <w:ind w:left="720"/>
         <w:rPr>
           <w:rFonts w:ascii="Verdana" w:hAnsi="Verdana"/>
@@ -1953,7 +1904,7 @@
     </w:p>
     <w:p>
       <w:pPr>
-        <w:pStyle w:val="Kop3"/>
+        <w:pStyle w:val="Heading3"/>
         <w:rPr>
           <w:lang w:val="en-US"/>
         </w:rPr>
@@ -2140,7 +2091,7 @@
         </w:rPr>
         <w:t xml:space="preserve">, first described by </w:t>
       </w:r>
-      <w:hyperlink r:id="rId11" w:history="1">
+      <w:hyperlink r:id="rId10" w:history="1">
         <w:r>
           <w:rPr>
             <w:rStyle w:val="Hyperlink"/>
@@ -2265,7 +2216,7 @@
     </w:p>
     <w:p>
       <w:pPr>
-        <w:pStyle w:val="Kop4"/>
+        <w:pStyle w:val="Heading4"/>
         <w:rPr>
           <w:lang w:val="en-US"/>
         </w:rPr>
@@ -2279,7 +2230,7 @@
     </w:p>
     <w:tbl>
       <w:tblPr>
-        <w:tblStyle w:val="Tabelraster"/>
+        <w:tblStyle w:val="TableGrid"/>
         <w:tblW w:w="0" w:type="auto"/>
         <w:tblBorders>
           <w:top w:val="none" w:sz="0" w:space="0" w:color="auto"/>
@@ -3176,9 +3127,19 @@
                 <w:szCs w:val="20"/>
                 <w:lang w:eastAsia="nl-NL"/>
               </w:rPr>
-              <w:t>p.S1S2</w:t>
+              <w:t>p.S</w:t>
             </w:r>
             <w:proofErr w:type="gramEnd"/>
+            <w:r>
+              <w:rPr>
+                <w:rFonts w:ascii="Consolas" w:eastAsia="Arial" w:hAnsi="Consolas" w:cs="Arial"/>
+                <w:color w:val="000000"/>
+                <w:sz w:val="22"/>
+                <w:szCs w:val="20"/>
+                <w:lang w:eastAsia="nl-NL"/>
+              </w:rPr>
+              <w:t>1S2</w:t>
+            </w:r>
           </w:p>
         </w:tc>
         <w:tc>
@@ -3449,9 +3410,19 @@
                 <w:szCs w:val="20"/>
                 <w:lang w:eastAsia="nl-NL"/>
               </w:rPr>
-              <w:t>rr.S1</w:t>
+              <w:t>rr.S</w:t>
             </w:r>
             <w:proofErr w:type="gramEnd"/>
+            <w:r>
+              <w:rPr>
+                <w:rFonts w:ascii="Consolas" w:eastAsia="Arial" w:hAnsi="Consolas" w:cs="Arial"/>
+                <w:color w:val="000000"/>
+                <w:sz w:val="22"/>
+                <w:szCs w:val="20"/>
+                <w:lang w:eastAsia="nl-NL"/>
+              </w:rPr>
+              <w:t>1</w:t>
+            </w:r>
           </w:p>
         </w:tc>
         <w:tc>
@@ -3515,8 +3486,6 @@
               </w:rPr>
               <w:t>Hazard r</w:t>
             </w:r>
-            <w:bookmarkStart w:id="0" w:name="_GoBack"/>
-            <w:bookmarkEnd w:id="0"/>
             <w:r>
               <w:rPr>
                 <w:rFonts w:ascii="Verdana" w:hAnsi="Verdana"/>
@@ -3562,9 +3531,19 @@
                 <w:szCs w:val="20"/>
                 <w:lang w:eastAsia="nl-NL"/>
               </w:rPr>
-              <w:t>rr.S2</w:t>
+              <w:t>rr.S</w:t>
             </w:r>
             <w:proofErr w:type="gramEnd"/>
+            <w:r>
+              <w:rPr>
+                <w:rFonts w:ascii="Consolas" w:eastAsia="Arial" w:hAnsi="Consolas" w:cs="Arial"/>
+                <w:color w:val="000000"/>
+                <w:sz w:val="22"/>
+                <w:szCs w:val="20"/>
+                <w:lang w:eastAsia="nl-NL"/>
+              </w:rPr>
+              <w:t>2</w:t>
+            </w:r>
           </w:p>
         </w:tc>
         <w:tc>
@@ -4322,9 +4301,19 @@
                 <w:szCs w:val="20"/>
                 <w:lang w:eastAsia="nl-NL"/>
               </w:rPr>
-              <w:t>u.S1</w:t>
+              <w:t>u.S</w:t>
             </w:r>
             <w:proofErr w:type="gramEnd"/>
+            <w:r>
+              <w:rPr>
+                <w:rFonts w:ascii="Consolas" w:eastAsia="Arial" w:hAnsi="Consolas" w:cs="Arial"/>
+                <w:color w:val="000000"/>
+                <w:sz w:val="22"/>
+                <w:szCs w:val="20"/>
+                <w:lang w:eastAsia="nl-NL"/>
+              </w:rPr>
+              <w:t>1</w:t>
+            </w:r>
           </w:p>
         </w:tc>
         <w:tc>
@@ -4417,9 +4406,19 @@
                 <w:szCs w:val="20"/>
                 <w:lang w:eastAsia="nl-NL"/>
               </w:rPr>
-              <w:t>u.S2</w:t>
+              <w:t>u.S</w:t>
             </w:r>
             <w:proofErr w:type="gramEnd"/>
+            <w:r>
+              <w:rPr>
+                <w:rFonts w:ascii="Consolas" w:eastAsia="Arial" w:hAnsi="Consolas" w:cs="Arial"/>
+                <w:color w:val="000000"/>
+                <w:sz w:val="22"/>
+                <w:szCs w:val="20"/>
+                <w:lang w:eastAsia="nl-NL"/>
+              </w:rPr>
+              <w:t>2</w:t>
+            </w:r>
           </w:p>
         </w:tc>
         <w:tc>
@@ -4885,7 +4884,7 @@
     </w:p>
     <w:p>
       <w:pPr>
-        <w:pStyle w:val="Kop4"/>
+        <w:pStyle w:val="Heading4"/>
         <w:rPr>
           <w:lang w:val="en-US"/>
         </w:rPr>
@@ -4941,7 +4940,7 @@
                     <pic:cNvPicPr/>
                   </pic:nvPicPr>
                   <pic:blipFill>
-                    <a:blip r:embed="rId12">
+                    <a:blip r:embed="rId11">
                       <a:extLst>
                         <a:ext uri="{28A0092B-C50C-407E-A947-70E740481C1C}">
                           <a14:useLocalDpi xmlns:a14="http://schemas.microsoft.com/office/drawing/2010/main" val="0"/>
@@ -4982,7 +4981,7 @@
     </w:p>
     <w:p>
       <w:pPr>
-        <w:pStyle w:val="Kop2"/>
+        <w:pStyle w:val="Heading2"/>
         <w:rPr>
           <w:lang w:val="en-US"/>
         </w:rPr>
@@ -4996,7 +4995,7 @@
     </w:p>
     <w:p>
       <w:pPr>
-        <w:pStyle w:val="Lijstalinea"/>
+        <w:pStyle w:val="ListParagraph"/>
         <w:numPr>
           <w:ilvl w:val="0"/>
           <w:numId w:val="14"/>
@@ -5037,7 +5036,7 @@
     </w:p>
     <w:p>
       <w:pPr>
-        <w:pStyle w:val="Lijstalinea"/>
+        <w:pStyle w:val="ListParagraph"/>
         <w:numPr>
           <w:ilvl w:val="0"/>
           <w:numId w:val="14"/>
@@ -5071,7 +5070,7 @@
     </w:p>
     <w:p>
       <w:pPr>
-        <w:pStyle w:val="Lijstalinea"/>
+        <w:pStyle w:val="ListParagraph"/>
         <w:numPr>
           <w:ilvl w:val="0"/>
           <w:numId w:val="14"/>
@@ -5105,7 +5104,7 @@
     </w:p>
     <w:p>
       <w:pPr>
-        <w:pStyle w:val="Lijstalinea"/>
+        <w:pStyle w:val="ListParagraph"/>
         <w:numPr>
           <w:ilvl w:val="0"/>
           <w:numId w:val="14"/>
@@ -5146,7 +5145,7 @@
     </w:p>
     <w:p>
       <w:pPr>
-        <w:pStyle w:val="Lijstalinea"/>
+        <w:pStyle w:val="ListParagraph"/>
         <w:numPr>
           <w:ilvl w:val="0"/>
           <w:numId w:val="14"/>
@@ -5173,7 +5172,7 @@
     </w:p>
     <w:p>
       <w:pPr>
-        <w:pStyle w:val="Lijstalinea"/>
+        <w:pStyle w:val="ListParagraph"/>
         <w:numPr>
           <w:ilvl w:val="0"/>
           <w:numId w:val="14"/>
@@ -5214,7 +5213,7 @@
     </w:p>
     <w:p>
       <w:pPr>
-        <w:pStyle w:val="Lijstalinea"/>
+        <w:pStyle w:val="ListParagraph"/>
         <w:numPr>
           <w:ilvl w:val="1"/>
           <w:numId w:val="14"/>
@@ -5252,7 +5251,7 @@
     </w:p>
     <w:p>
       <w:pPr>
-        <w:pStyle w:val="Lijstalinea"/>
+        <w:pStyle w:val="ListParagraph"/>
         <w:numPr>
           <w:ilvl w:val="1"/>
           <w:numId w:val="14"/>
@@ -5302,7 +5301,7 @@
     </w:p>
     <w:p>
       <w:pPr>
-        <w:pStyle w:val="Lijstalinea"/>
+        <w:pStyle w:val="ListParagraph"/>
         <w:numPr>
           <w:ilvl w:val="1"/>
           <w:numId w:val="14"/>
@@ -5312,7 +5311,6 @@
           <w:lang w:val="en-US"/>
         </w:rPr>
       </w:pPr>
-      <w:proofErr w:type="gramStart"/>
       <w:r>
         <w:rPr>
           <w:rFonts w:ascii="Consolas" w:hAnsi="Consolas"/>
@@ -5320,7 +5318,6 @@
         </w:rPr>
         <w:t>u.S2</w:t>
       </w:r>
-      <w:proofErr w:type="gramEnd"/>
       <w:r>
         <w:rPr>
           <w:rFonts w:ascii="Consolas" w:hAnsi="Consolas"/>
@@ -5359,7 +5356,7 @@
     </w:p>
     <w:p>
       <w:pPr>
-        <w:pStyle w:val="Normaalweb"/>
+        <w:pStyle w:val="NormalWeb"/>
         <w:rPr>
           <w:rFonts w:asciiTheme="minorHAnsi" w:hAnsiTheme="minorHAnsi"/>
           <w:sz w:val="20"/>
@@ -5875,7 +5872,7 @@
     </w:p>
     <w:p>
       <w:pPr>
-        <w:pStyle w:val="Kop3"/>
+        <w:pStyle w:val="Heading3"/>
         <w:rPr>
           <w:lang w:val="en-US"/>
         </w:rPr>
@@ -5982,7 +5979,7 @@
         </w:rPr>
         <w:t>The Human Mortality Database (HMD) (</w:t>
       </w:r>
-      <w:hyperlink r:id="rId13" w:history="1">
+      <w:hyperlink r:id="rId12" w:history="1">
         <w:r>
           <w:rPr>
             <w:rStyle w:val="Hyperlink"/>
@@ -6232,7 +6229,7 @@
     </w:p>
     <w:p>
       <w:pPr>
-        <w:pStyle w:val="Kop2"/>
+        <w:pStyle w:val="Heading2"/>
         <w:rPr>
           <w:lang w:val="en-US"/>
         </w:rPr>
@@ -6246,7 +6243,7 @@
     </w:p>
     <w:p>
       <w:pPr>
-        <w:pStyle w:val="Lijstalinea"/>
+        <w:pStyle w:val="ListParagraph"/>
         <w:numPr>
           <w:ilvl w:val="0"/>
           <w:numId w:val="16"/>
@@ -6316,7 +6313,7 @@
     </w:p>
     <w:p>
       <w:pPr>
-        <w:pStyle w:val="Lijstalinea"/>
+        <w:pStyle w:val="ListParagraph"/>
         <w:spacing w:after="0" w:line="240" w:lineRule="auto"/>
         <w:ind w:left="1440"/>
         <w:rPr>
@@ -6350,7 +6347,7 @@
     </w:p>
     <w:p>
       <w:pPr>
-        <w:pStyle w:val="Lijstalinea"/>
+        <w:pStyle w:val="ListParagraph"/>
         <w:numPr>
           <w:ilvl w:val="1"/>
           <w:numId w:val="16"/>
@@ -6380,7 +6377,7 @@
     </w:p>
     <w:p>
       <w:pPr>
-        <w:pStyle w:val="Lijstalinea"/>
+        <w:pStyle w:val="ListParagraph"/>
         <w:numPr>
           <w:ilvl w:val="2"/>
           <w:numId w:val="16"/>
@@ -6401,7 +6398,7 @@
     </w:p>
     <w:p>
       <w:pPr>
-        <w:pStyle w:val="Lijstalinea"/>
+        <w:pStyle w:val="ListParagraph"/>
         <w:numPr>
           <w:ilvl w:val="2"/>
           <w:numId w:val="16"/>
@@ -6422,7 +6419,7 @@
     </w:p>
     <w:p>
       <w:pPr>
-        <w:pStyle w:val="Lijstalinea"/>
+        <w:pStyle w:val="ListParagraph"/>
         <w:numPr>
           <w:ilvl w:val="2"/>
           <w:numId w:val="16"/>
@@ -6479,28 +6476,12 @@
           <w:rFonts w:ascii="Consolas" w:hAnsi="Consolas" w:cs="Consolas"/>
           <w:lang w:val="en-US"/>
         </w:rPr>
-        <w:t>(</w:t>
-      </w:r>
-      <w:proofErr w:type="spellStart"/>
-      <w:r>
-        <w:rPr>
-          <w:rFonts w:ascii="Consolas" w:hAnsi="Consolas" w:cs="Consolas"/>
-          <w:lang w:val="en-US"/>
-        </w:rPr>
-        <w:t>CNTRY</w:t>
-      </w:r>
-      <w:proofErr w:type="spellEnd"/>
-      <w:r>
-        <w:rPr>
-          <w:rFonts w:ascii="Consolas" w:hAnsi="Consolas" w:cs="Consolas"/>
-          <w:lang w:val="en-US"/>
-        </w:rPr>
-        <w:t xml:space="preserve"> = "USA", item = "Mx_1x1",</w:t>
+        <w:t>(CNTRY = "USA", item = "Mx_1x1",</w:t>
       </w:r>
     </w:p>
     <w:p>
       <w:pPr>
-        <w:pStyle w:val="Lijstalinea"/>
+        <w:pStyle w:val="ListParagraph"/>
         <w:spacing w:after="0" w:line="240" w:lineRule="auto"/>
         <w:ind w:left="1440"/>
         <w:rPr>
@@ -6518,7 +6499,7 @@
     </w:p>
     <w:p>
       <w:pPr>
-        <w:pStyle w:val="Lijstalinea"/>
+        <w:pStyle w:val="ListParagraph"/>
         <w:numPr>
           <w:ilvl w:val="0"/>
           <w:numId w:val="16"/>
@@ -6574,7 +6555,7 @@
     </w:p>
     <w:p>
       <w:pPr>
-        <w:pStyle w:val="Lijstalinea"/>
+        <w:pStyle w:val="ListParagraph"/>
         <w:numPr>
           <w:ilvl w:val="0"/>
           <w:numId w:val="17"/>
@@ -6666,7 +6647,7 @@
     </w:p>
     <w:p>
       <w:pPr>
-        <w:pStyle w:val="Lijstalinea"/>
+        <w:pStyle w:val="ListParagraph"/>
         <w:numPr>
           <w:ilvl w:val="0"/>
           <w:numId w:val="17"/>
@@ -6729,7 +6710,7 @@
     </w:p>
     <w:p>
       <w:pPr>
-        <w:pStyle w:val="Lijstalinea"/>
+        <w:pStyle w:val="ListParagraph"/>
         <w:numPr>
           <w:ilvl w:val="0"/>
           <w:numId w:val="16"/>
@@ -6764,7 +6745,7 @@
     </w:p>
     <w:p>
       <w:pPr>
-        <w:pStyle w:val="Lijstalinea"/>
+        <w:pStyle w:val="ListParagraph"/>
         <w:numPr>
           <w:ilvl w:val="0"/>
           <w:numId w:val="16"/>
@@ -6784,7 +6765,7 @@
     </w:p>
     <w:p>
       <w:pPr>
-        <w:pStyle w:val="Lijstalinea"/>
+        <w:pStyle w:val="ListParagraph"/>
         <w:numPr>
           <w:ilvl w:val="1"/>
           <w:numId w:val="16"/>
@@ -6853,7 +6834,7 @@
     </w:p>
     <w:p>
       <w:pPr>
-        <w:pStyle w:val="Lijstalinea"/>
+        <w:pStyle w:val="ListParagraph"/>
         <w:numPr>
           <w:ilvl w:val="0"/>
           <w:numId w:val="16"/>
@@ -6887,7 +6868,7 @@
     </w:p>
     <w:p>
       <w:pPr>
-        <w:pStyle w:val="Lijstalinea"/>
+        <w:pStyle w:val="ListParagraph"/>
         <w:numPr>
           <w:ilvl w:val="0"/>
           <w:numId w:val="16"/>
@@ -6921,7 +6902,7 @@
     </w:p>
     <w:p>
       <w:pPr>
-        <w:pStyle w:val="Lijstalinea"/>
+        <w:pStyle w:val="ListParagraph"/>
         <w:numPr>
           <w:ilvl w:val="0"/>
           <w:numId w:val="16"/>
@@ -6955,7 +6936,7 @@
     </w:p>
     <w:p>
       <w:pPr>
-        <w:pStyle w:val="Lijstalinea"/>
+        <w:pStyle w:val="ListParagraph"/>
         <w:spacing w:after="0" w:line="240" w:lineRule="auto"/>
         <w:rPr>
           <w:rFonts w:ascii="Verdana" w:hAnsi="Verdana"/>
@@ -7457,7 +7438,7 @@
     </w:p>
     <w:p>
       <w:pPr>
-        <w:pStyle w:val="Kop3"/>
+        <w:pStyle w:val="Heading3"/>
         <w:rPr>
           <w:lang w:val="en-US"/>
         </w:rPr>
@@ -7575,7 +7556,7 @@
     </w:p>
     <w:p>
       <w:pPr>
-        <w:pStyle w:val="Kop4"/>
+        <w:pStyle w:val="Heading4"/>
         <w:rPr>
           <w:lang w:val="en-US"/>
         </w:rPr>
@@ -7595,7 +7576,7 @@
     </w:p>
     <w:tbl>
       <w:tblPr>
-        <w:tblStyle w:val="Tabelraster"/>
+        <w:tblStyle w:val="TableGrid"/>
         <w:tblW w:w="10015" w:type="dxa"/>
         <w:tblLook w:val="04A0" w:firstRow="1" w:lastRow="0" w:firstColumn="1" w:lastColumn="0" w:noHBand="0" w:noVBand="1"/>
       </w:tblPr>
@@ -10041,7 +10022,7 @@
     </w:p>
     <w:p>
       <w:pPr>
-        <w:pStyle w:val="Kop2"/>
+        <w:pStyle w:val="Heading2"/>
         <w:rPr>
           <w:lang w:val="en-US"/>
         </w:rPr>
@@ -10056,7 +10037,7 @@
     </w:p>
     <w:p>
       <w:pPr>
-        <w:pStyle w:val="Lijstalinea"/>
+        <w:pStyle w:val="ListParagraph"/>
         <w:numPr>
           <w:ilvl w:val="0"/>
           <w:numId w:val="15"/>
@@ -10083,7 +10064,7 @@
     </w:p>
     <w:p>
       <w:pPr>
-        <w:pStyle w:val="Lijstalinea"/>
+        <w:pStyle w:val="ListParagraph"/>
         <w:numPr>
           <w:ilvl w:val="0"/>
           <w:numId w:val="15"/>
@@ -10110,7 +10091,7 @@
     </w:p>
     <w:p>
       <w:pPr>
-        <w:pStyle w:val="Lijstalinea"/>
+        <w:pStyle w:val="ListParagraph"/>
         <w:numPr>
           <w:ilvl w:val="0"/>
           <w:numId w:val="20"/>
@@ -10153,7 +10134,7 @@
     </w:p>
     <w:p>
       <w:pPr>
-        <w:pStyle w:val="Lijstalinea"/>
+        <w:pStyle w:val="ListParagraph"/>
         <w:numPr>
           <w:ilvl w:val="0"/>
           <w:numId w:val="15"/>
@@ -10173,7 +10154,7 @@
     </w:p>
     <w:p>
       <w:pPr>
-        <w:pStyle w:val="Lijstalinea"/>
+        <w:pStyle w:val="ListParagraph"/>
         <w:numPr>
           <w:ilvl w:val="0"/>
           <w:numId w:val="15"/>
@@ -10200,7 +10181,7 @@
     </w:p>
     <w:p>
       <w:pPr>
-        <w:pStyle w:val="Lijstalinea"/>
+        <w:pStyle w:val="ListParagraph"/>
         <w:numPr>
           <w:ilvl w:val="0"/>
           <w:numId w:val="15"/>
@@ -10241,7 +10222,7 @@
     </w:p>
     <w:p>
       <w:pPr>
-        <w:pStyle w:val="Lijstalinea"/>
+        <w:pStyle w:val="ListParagraph"/>
         <w:numPr>
           <w:ilvl w:val="0"/>
           <w:numId w:val="15"/>
@@ -10303,7 +10284,7 @@
     </w:p>
     <w:p>
       <w:pPr>
-        <w:pStyle w:val="Lijstalinea"/>
+        <w:pStyle w:val="ListParagraph"/>
         <w:numPr>
           <w:ilvl w:val="0"/>
           <w:numId w:val="15"/>
@@ -10337,7 +10318,7 @@
     </w:p>
     <w:p>
       <w:pPr>
-        <w:pStyle w:val="Lijstalinea"/>
+        <w:pStyle w:val="ListParagraph"/>
         <w:numPr>
           <w:ilvl w:val="0"/>
           <w:numId w:val="15"/>
@@ -10378,7 +10359,7 @@
     </w:p>
     <w:p>
       <w:pPr>
-        <w:pStyle w:val="Kop3"/>
+        <w:pStyle w:val="Heading3"/>
       </w:pPr>
       <w:r>
         <w:rPr>
@@ -10393,7 +10374,7 @@
     </w:p>
     <w:p>
       <w:pPr>
-        <w:pStyle w:val="Kop3"/>
+        <w:pStyle w:val="Heading3"/>
         <w:rPr>
           <w:lang w:val="en-US"/>
         </w:rPr>
@@ -10427,7 +10408,7 @@
                     <pic:cNvPicPr/>
                   </pic:nvPicPr>
                   <pic:blipFill>
-                    <a:blip r:embed="rId14">
+                    <a:blip r:embed="rId13">
                       <a:extLst>
                         <a:ext uri="{28A0092B-C50C-407E-A947-70E740481C1C}">
                           <a14:useLocalDpi xmlns:a14="http://schemas.microsoft.com/office/drawing/2010/main" val="0"/>
@@ -10494,7 +10475,7 @@
                     <pic:cNvPicPr/>
                   </pic:nvPicPr>
                   <pic:blipFill>
-                    <a:blip r:embed="rId15">
+                    <a:blip r:embed="rId14">
                       <a:extLst>
                         <a:ext uri="{28A0092B-C50C-407E-A947-70E740481C1C}">
                           <a14:useLocalDpi xmlns:a14="http://schemas.microsoft.com/office/drawing/2010/main" val="0"/>
@@ -10523,7 +10504,7 @@
     </w:p>
     <w:tbl>
       <w:tblPr>
-        <w:tblStyle w:val="Tabelraster"/>
+        <w:tblStyle w:val="TableGrid"/>
         <w:tblW w:w="0" w:type="auto"/>
         <w:shd w:val="clear" w:color="auto" w:fill="FFFFFF" w:themeFill="background1"/>
         <w:tblLayout w:type="fixed"/>
@@ -10984,7 +10965,7 @@
                     <pic:cNvPicPr/>
                   </pic:nvPicPr>
                   <pic:blipFill>
-                    <a:blip r:embed="rId16">
+                    <a:blip r:embed="rId15">
                       <a:extLst>
                         <a:ext uri="{28A0092B-C50C-407E-A947-70E740481C1C}">
                           <a14:useLocalDpi xmlns:a14="http://schemas.microsoft.com/office/drawing/2010/main" val="0"/>
@@ -11047,7 +11028,7 @@
     </w:p>
     <w:tbl>
       <w:tblPr>
-        <w:tblStyle w:val="Tabelraster"/>
+        <w:tblStyle w:val="TableGrid"/>
         <w:tblW w:w="0" w:type="auto"/>
         <w:shd w:val="clear" w:color="auto" w:fill="FFFFFF" w:themeFill="background1"/>
         <w:tblLayout w:type="fixed"/>
@@ -11449,7 +11430,7 @@
                     <pic:cNvPicPr/>
                   </pic:nvPicPr>
                   <pic:blipFill>
-                    <a:blip r:embed="rId17">
+                    <a:blip r:embed="rId16">
                       <a:extLst>
                         <a:ext uri="{28A0092B-C50C-407E-A947-70E740481C1C}">
                           <a14:useLocalDpi xmlns:a14="http://schemas.microsoft.com/office/drawing/2010/main" val="0"/>
@@ -11519,7 +11500,7 @@
     </w:p>
     <w:p>
       <w:pPr>
-        <w:pStyle w:val="Kop3"/>
+        <w:pStyle w:val="Heading3"/>
         <w:rPr>
           <w:lang w:val="en-US"/>
         </w:rPr>
@@ -11587,7 +11568,7 @@
                     <pic:cNvPicPr/>
                   </pic:nvPicPr>
                   <pic:blipFill>
-                    <a:blip r:embed="rId18">
+                    <a:blip r:embed="rId17">
                       <a:extLst>
                         <a:ext uri="{28A0092B-C50C-407E-A947-70E740481C1C}">
                           <a14:useLocalDpi xmlns:a14="http://schemas.microsoft.com/office/drawing/2010/main" val="0"/>
@@ -11640,7 +11621,7 @@
                     <pic:cNvPicPr/>
                   </pic:nvPicPr>
                   <pic:blipFill>
-                    <a:blip r:embed="rId19">
+                    <a:blip r:embed="rId18">
                       <a:extLst>
                         <a:ext uri="{28A0092B-C50C-407E-A947-70E740481C1C}">
                           <a14:useLocalDpi xmlns:a14="http://schemas.microsoft.com/office/drawing/2010/main" val="0"/>
@@ -11669,7 +11650,7 @@
     </w:p>
     <w:tbl>
       <w:tblPr>
-        <w:tblStyle w:val="Tabelraster"/>
+        <w:tblStyle w:val="TableGrid"/>
         <w:tblW w:w="0" w:type="auto"/>
         <w:shd w:val="clear" w:color="auto" w:fill="FFFFFF" w:themeFill="background1"/>
         <w:tblLayout w:type="fixed"/>
@@ -12217,7 +12198,7 @@
                     <pic:cNvPicPr/>
                   </pic:nvPicPr>
                   <pic:blipFill>
-                    <a:blip r:embed="rId20">
+                    <a:blip r:embed="rId19">
                       <a:extLst>
                         <a:ext uri="{28A0092B-C50C-407E-A947-70E740481C1C}">
                           <a14:useLocalDpi xmlns:a14="http://schemas.microsoft.com/office/drawing/2010/main" val="0"/>
@@ -12261,7 +12242,7 @@
     </w:p>
     <w:p>
       <w:pPr>
-        <w:pStyle w:val="Kop3"/>
+        <w:pStyle w:val="Heading3"/>
         <w:rPr>
           <w:lang w:val="en-US"/>
         </w:rPr>
@@ -12323,7 +12304,7 @@
                     <pic:cNvPicPr/>
                   </pic:nvPicPr>
                   <pic:blipFill>
-                    <a:blip r:embed="rId21">
+                    <a:blip r:embed="rId20">
                       <a:extLst>
                         <a:ext uri="{28A0092B-C50C-407E-A947-70E740481C1C}">
                           <a14:useLocalDpi xmlns:a14="http://schemas.microsoft.com/office/drawing/2010/main" val="0"/>
@@ -12376,7 +12357,7 @@
                     <pic:cNvPicPr/>
                   </pic:nvPicPr>
                   <pic:blipFill>
-                    <a:blip r:embed="rId22">
+                    <a:blip r:embed="rId21">
                       <a:extLst>
                         <a:ext uri="{28A0092B-C50C-407E-A947-70E740481C1C}">
                           <a14:useLocalDpi xmlns:a14="http://schemas.microsoft.com/office/drawing/2010/main" val="0"/>
@@ -12423,7 +12404,7 @@
                     <pic:cNvPicPr/>
                   </pic:nvPicPr>
                   <pic:blipFill>
-                    <a:blip r:embed="rId22">
+                    <a:blip r:embed="rId21">
                       <a:extLst>
                         <a:ext uri="{28A0092B-C50C-407E-A947-70E740481C1C}">
                           <a14:useLocalDpi xmlns:a14="http://schemas.microsoft.com/office/drawing/2010/main" val="0"/>
@@ -12470,7 +12451,7 @@
                     <pic:cNvPicPr/>
                   </pic:nvPicPr>
                   <pic:blipFill>
-                    <a:blip r:embed="rId23">
+                    <a:blip r:embed="rId22">
                       <a:extLst>
                         <a:ext uri="{28A0092B-C50C-407E-A947-70E740481C1C}">
                           <a14:useLocalDpi xmlns:a14="http://schemas.microsoft.com/office/drawing/2010/main" val="0"/>
@@ -12534,7 +12515,7 @@
                     <pic:cNvPicPr/>
                   </pic:nvPicPr>
                   <pic:blipFill>
-                    <a:blip r:embed="rId24">
+                    <a:blip r:embed="rId23">
                       <a:extLst>
                         <a:ext uri="{28A0092B-C50C-407E-A947-70E740481C1C}">
                           <a14:useLocalDpi xmlns:a14="http://schemas.microsoft.com/office/drawing/2010/main" val="0"/>
@@ -12589,7 +12570,7 @@
                     <pic:cNvPicPr/>
                   </pic:nvPicPr>
                   <pic:blipFill>
-                    <a:blip r:embed="rId25">
+                    <a:blip r:embed="rId24">
                       <a:extLst>
                         <a:ext uri="{28A0092B-C50C-407E-A947-70E740481C1C}">
                           <a14:useLocalDpi xmlns:a14="http://schemas.microsoft.com/office/drawing/2010/main" val="0"/>
@@ -12650,7 +12631,7 @@
                     <pic:cNvPicPr/>
                   </pic:nvPicPr>
                   <pic:blipFill>
-                    <a:blip r:embed="rId26">
+                    <a:blip r:embed="rId25">
                       <a:extLst>
                         <a:ext uri="{28A0092B-C50C-407E-A947-70E740481C1C}">
                           <a14:useLocalDpi xmlns:a14="http://schemas.microsoft.com/office/drawing/2010/main" val="0"/>
@@ -12704,7 +12685,7 @@
                     <pic:cNvPicPr/>
                   </pic:nvPicPr>
                   <pic:blipFill>
-                    <a:blip r:embed="rId27">
+                    <a:blip r:embed="rId26">
                       <a:extLst>
                         <a:ext uri="{28A0092B-C50C-407E-A947-70E740481C1C}">
                           <a14:useLocalDpi xmlns:a14="http://schemas.microsoft.com/office/drawing/2010/main" val="0"/>
@@ -12765,7 +12746,7 @@
                     <pic:cNvPicPr/>
                   </pic:nvPicPr>
                   <pic:blipFill>
-                    <a:blip r:embed="rId28">
+                    <a:blip r:embed="rId27">
                       <a:extLst>
                         <a:ext uri="{28A0092B-C50C-407E-A947-70E740481C1C}">
                           <a14:useLocalDpi xmlns:a14="http://schemas.microsoft.com/office/drawing/2010/main" val="0"/>
@@ -12843,7 +12824,7 @@
       </w:pPr>
     </w:p>
     <w:sectPr>
-      <w:footerReference w:type="default" r:id="rId29"/>
+      <w:footerReference w:type="default" r:id="rId28"/>
       <w:pgSz w:w="12240" w:h="15840"/>
       <w:pgMar w:top="1440" w:right="1440" w:bottom="1440" w:left="1440" w:header="720" w:footer="720" w:gutter="0"/>
       <w:cols w:space="720"/>
@@ -12855,7 +12836,7 @@
 </file>
 
 <file path=word/endnotes.xml><?xml version="1.0" encoding="utf-8"?>
-<w:endnotes xmlns:wpc="http://schemas.microsoft.com/office/word/2010/wordprocessingCanvas" xmlns:mo="http://schemas.microsoft.com/office/mac/office/2008/main" xmlns:mc="http://schemas.openxmlformats.org/markup-compatibility/2006" xmlns:mv="urn:schemas-microsoft-com:mac:vml" xmlns:o="urn:schemas-microsoft-com:office:office" xmlns:r="http://schemas.openxmlformats.org/officeDocument/2006/relationships" xmlns:m="http://schemas.openxmlformats.org/officeDocument/2006/math" xmlns:v="urn:schemas-microsoft-com:vml" xmlns:wp14="http://schemas.microsoft.com/office/word/2010/wordprocessingDrawing" xmlns:wp="http://schemas.openxmlformats.org/drawingml/2006/wordprocessingDrawing" xmlns:w10="urn:schemas-microsoft-com:office:word" xmlns:w="http://schemas.openxmlformats.org/wordprocessingml/2006/main" xmlns:w14="http://schemas.microsoft.com/office/word/2010/wordml" xmlns:wpg="http://schemas.microsoft.com/office/word/2010/wordprocessingGroup" xmlns:wpi="http://schemas.microsoft.com/office/word/2010/wordprocessingInk" xmlns:wne="http://schemas.microsoft.com/office/word/2006/wordml" xmlns:wps="http://schemas.microsoft.com/office/word/2010/wordprocessingShape" mc:Ignorable="w14 wp14">
+<w:endnotes xmlns:wpc="http://schemas.microsoft.com/office/word/2010/wordprocessingCanvas" xmlns:cx="http://schemas.microsoft.com/office/drawing/2014/chartex" xmlns:cx1="http://schemas.microsoft.com/office/drawing/2015/9/8/chartex" xmlns:cx2="http://schemas.microsoft.com/office/drawing/2015/10/21/chartex" xmlns:cx3="http://schemas.microsoft.com/office/drawing/2016/5/9/chartex" xmlns:cx4="http://schemas.microsoft.com/office/drawing/2016/5/10/chartex" xmlns:cx5="http://schemas.microsoft.com/office/drawing/2016/5/11/chartex" xmlns:cx6="http://schemas.microsoft.com/office/drawing/2016/5/12/chartex" xmlns:cx7="http://schemas.microsoft.com/office/drawing/2016/5/13/chartex" xmlns:cx8="http://schemas.microsoft.com/office/drawing/2016/5/14/chartex" xmlns:mc="http://schemas.openxmlformats.org/markup-compatibility/2006" xmlns:aink="http://schemas.microsoft.com/office/drawing/2016/ink" xmlns:am3d="http://schemas.microsoft.com/office/drawing/2017/model3d" xmlns:o="urn:schemas-microsoft-com:office:office" xmlns:r="http://schemas.openxmlformats.org/officeDocument/2006/relationships" xmlns:m="http://schemas.openxmlformats.org/officeDocument/2006/math" xmlns:v="urn:schemas-microsoft-com:vml" xmlns:wp14="http://schemas.microsoft.com/office/word/2010/wordprocessingDrawing" xmlns:wp="http://schemas.openxmlformats.org/drawingml/2006/wordprocessingDrawing" xmlns:w10="urn:schemas-microsoft-com:office:word" xmlns:w="http://schemas.openxmlformats.org/wordprocessingml/2006/main" xmlns:w14="http://schemas.microsoft.com/office/word/2010/wordml" xmlns:w15="http://schemas.microsoft.com/office/word/2012/wordml" xmlns:w16cid="http://schemas.microsoft.com/office/word/2016/wordml/cid" xmlns:w16se="http://schemas.microsoft.com/office/word/2015/wordml/symex" xmlns:wpg="http://schemas.microsoft.com/office/word/2010/wordprocessingGroup" xmlns:wpi="http://schemas.microsoft.com/office/word/2010/wordprocessingInk" xmlns:wne="http://schemas.microsoft.com/office/word/2006/wordml" xmlns:wps="http://schemas.microsoft.com/office/word/2010/wordprocessingShape" mc:Ignorable="w14 w15 w16se w16cid wp14">
   <w:endnote w:type="separator" w:id="-1">
     <w:p>
       <w:pPr>
@@ -12880,16 +12861,16 @@
 </file>
 
 <file path=word/footer1.xml><?xml version="1.0" encoding="utf-8"?>
-<w:ftr xmlns:wpc="http://schemas.microsoft.com/office/word/2010/wordprocessingCanvas" xmlns:mo="http://schemas.microsoft.com/office/mac/office/2008/main" xmlns:mc="http://schemas.openxmlformats.org/markup-compatibility/2006" xmlns:mv="urn:schemas-microsoft-com:mac:vml" xmlns:o="urn:schemas-microsoft-com:office:office" xmlns:r="http://schemas.openxmlformats.org/officeDocument/2006/relationships" xmlns:m="http://schemas.openxmlformats.org/officeDocument/2006/math" xmlns:v="urn:schemas-microsoft-com:vml" xmlns:wp14="http://schemas.microsoft.com/office/word/2010/wordprocessingDrawing" xmlns:wp="http://schemas.openxmlformats.org/drawingml/2006/wordprocessingDrawing" xmlns:w10="urn:schemas-microsoft-com:office:word" xmlns:w="http://schemas.openxmlformats.org/wordprocessingml/2006/main" xmlns:w14="http://schemas.microsoft.com/office/word/2010/wordml" xmlns:wpg="http://schemas.microsoft.com/office/word/2010/wordprocessingGroup" xmlns:wpi="http://schemas.microsoft.com/office/word/2010/wordprocessingInk" xmlns:wne="http://schemas.microsoft.com/office/word/2006/wordml" xmlns:wps="http://schemas.microsoft.com/office/word/2010/wordprocessingShape" mc:Ignorable="w14 wp14">
+<w:ftr xmlns:wpc="http://schemas.microsoft.com/office/word/2010/wordprocessingCanvas" xmlns:cx="http://schemas.microsoft.com/office/drawing/2014/chartex" xmlns:cx1="http://schemas.microsoft.com/office/drawing/2015/9/8/chartex" xmlns:cx2="http://schemas.microsoft.com/office/drawing/2015/10/21/chartex" xmlns:cx3="http://schemas.microsoft.com/office/drawing/2016/5/9/chartex" xmlns:cx4="http://schemas.microsoft.com/office/drawing/2016/5/10/chartex" xmlns:cx5="http://schemas.microsoft.com/office/drawing/2016/5/11/chartex" xmlns:cx6="http://schemas.microsoft.com/office/drawing/2016/5/12/chartex" xmlns:cx7="http://schemas.microsoft.com/office/drawing/2016/5/13/chartex" xmlns:cx8="http://schemas.microsoft.com/office/drawing/2016/5/14/chartex" xmlns:mc="http://schemas.openxmlformats.org/markup-compatibility/2006" xmlns:aink="http://schemas.microsoft.com/office/drawing/2016/ink" xmlns:am3d="http://schemas.microsoft.com/office/drawing/2017/model3d" xmlns:o="urn:schemas-microsoft-com:office:office" xmlns:r="http://schemas.openxmlformats.org/officeDocument/2006/relationships" xmlns:m="http://schemas.openxmlformats.org/officeDocument/2006/math" xmlns:v="urn:schemas-microsoft-com:vml" xmlns:wp14="http://schemas.microsoft.com/office/word/2010/wordprocessingDrawing" xmlns:wp="http://schemas.openxmlformats.org/drawingml/2006/wordprocessingDrawing" xmlns:w10="urn:schemas-microsoft-com:office:word" xmlns:w="http://schemas.openxmlformats.org/wordprocessingml/2006/main" xmlns:w14="http://schemas.microsoft.com/office/word/2010/wordml" xmlns:w15="http://schemas.microsoft.com/office/word/2012/wordml" xmlns:w16cid="http://schemas.microsoft.com/office/word/2016/wordml/cid" xmlns:w16se="http://schemas.microsoft.com/office/word/2015/wordml/symex" xmlns:wpg="http://schemas.microsoft.com/office/word/2010/wordprocessingGroup" xmlns:wpi="http://schemas.microsoft.com/office/word/2010/wordprocessingInk" xmlns:wne="http://schemas.microsoft.com/office/word/2006/wordml" xmlns:wps="http://schemas.microsoft.com/office/word/2010/wordprocessingShape" mc:Ignorable="w14 w15 w16se w16cid wp14">
   <w:p>
     <w:pPr>
-      <w:pStyle w:val="Voettekst"/>
+      <w:pStyle w:val="Footer"/>
       <w:jc w:val="right"/>
     </w:pPr>
   </w:p>
   <w:p>
     <w:pPr>
-      <w:pStyle w:val="Voettekst"/>
+      <w:pStyle w:val="Footer"/>
       <w:rPr>
         <w:lang w:val="en-GB"/>
       </w:rPr>
@@ -12903,47 +12884,47 @@
   </w:p>
   <w:p>
     <w:pPr>
-      <w:pStyle w:val="Voettekst"/>
+      <w:pStyle w:val="Footer"/>
       <w:framePr w:wrap="around" w:vAnchor="text" w:hAnchor="margin" w:xAlign="right" w:y="1"/>
       <w:rPr>
-        <w:rStyle w:val="Paginanummer"/>
+        <w:rStyle w:val="PageNumber"/>
       </w:rPr>
     </w:pPr>
     <w:r>
       <w:rPr>
-        <w:rStyle w:val="Paginanummer"/>
+        <w:rStyle w:val="PageNumber"/>
       </w:rPr>
       <w:fldChar w:fldCharType="begin"/>
     </w:r>
     <w:r>
       <w:rPr>
-        <w:rStyle w:val="Paginanummer"/>
+        <w:rStyle w:val="PageNumber"/>
       </w:rPr>
       <w:instrText xml:space="preserve">PAGE  </w:instrText>
     </w:r>
     <w:r>
       <w:rPr>
-        <w:rStyle w:val="Paginanummer"/>
+        <w:rStyle w:val="PageNumber"/>
       </w:rPr>
       <w:fldChar w:fldCharType="separate"/>
     </w:r>
     <w:r>
       <w:rPr>
-        <w:rStyle w:val="Paginanummer"/>
+        <w:rStyle w:val="PageNumber"/>
         <w:noProof/>
       </w:rPr>
       <w:t>3</w:t>
     </w:r>
     <w:r>
       <w:rPr>
-        <w:rStyle w:val="Paginanummer"/>
+        <w:rStyle w:val="PageNumber"/>
       </w:rPr>
       <w:fldChar w:fldCharType="end"/>
     </w:r>
   </w:p>
   <w:p>
     <w:pPr>
-      <w:pStyle w:val="Voettekst"/>
+      <w:pStyle w:val="Footer"/>
       <w:rPr>
         <w:lang w:val="en-GB"/>
       </w:rPr>
@@ -12961,7 +12942,7 @@
 </file>
 
 <file path=word/footnotes.xml><?xml version="1.0" encoding="utf-8"?>
-<w:footnotes xmlns:wpc="http://schemas.microsoft.com/office/word/2010/wordprocessingCanvas" xmlns:mo="http://schemas.microsoft.com/office/mac/office/2008/main" xmlns:mc="http://schemas.openxmlformats.org/markup-compatibility/2006" xmlns:mv="urn:schemas-microsoft-com:mac:vml" xmlns:o="urn:schemas-microsoft-com:office:office" xmlns:r="http://schemas.openxmlformats.org/officeDocument/2006/relationships" xmlns:m="http://schemas.openxmlformats.org/officeDocument/2006/math" xmlns:v="urn:schemas-microsoft-com:vml" xmlns:wp14="http://schemas.microsoft.com/office/word/2010/wordprocessingDrawing" xmlns:wp="http://schemas.openxmlformats.org/drawingml/2006/wordprocessingDrawing" xmlns:w10="urn:schemas-microsoft-com:office:word" xmlns:w="http://schemas.openxmlformats.org/wordprocessingml/2006/main" xmlns:w14="http://schemas.microsoft.com/office/word/2010/wordml" xmlns:wpg="http://schemas.microsoft.com/office/word/2010/wordprocessingGroup" xmlns:wpi="http://schemas.microsoft.com/office/word/2010/wordprocessingInk" xmlns:wne="http://schemas.microsoft.com/office/word/2006/wordml" xmlns:wps="http://schemas.microsoft.com/office/word/2010/wordprocessingShape" mc:Ignorable="w14 wp14">
+<w:footnotes xmlns:wpc="http://schemas.microsoft.com/office/word/2010/wordprocessingCanvas" xmlns:cx="http://schemas.microsoft.com/office/drawing/2014/chartex" xmlns:cx1="http://schemas.microsoft.com/office/drawing/2015/9/8/chartex" xmlns:cx2="http://schemas.microsoft.com/office/drawing/2015/10/21/chartex" xmlns:cx3="http://schemas.microsoft.com/office/drawing/2016/5/9/chartex" xmlns:cx4="http://schemas.microsoft.com/office/drawing/2016/5/10/chartex" xmlns:cx5="http://schemas.microsoft.com/office/drawing/2016/5/11/chartex" xmlns:cx6="http://schemas.microsoft.com/office/drawing/2016/5/12/chartex" xmlns:cx7="http://schemas.microsoft.com/office/drawing/2016/5/13/chartex" xmlns:cx8="http://schemas.microsoft.com/office/drawing/2016/5/14/chartex" xmlns:mc="http://schemas.openxmlformats.org/markup-compatibility/2006" xmlns:aink="http://schemas.microsoft.com/office/drawing/2016/ink" xmlns:am3d="http://schemas.microsoft.com/office/drawing/2017/model3d" xmlns:o="urn:schemas-microsoft-com:office:office" xmlns:r="http://schemas.openxmlformats.org/officeDocument/2006/relationships" xmlns:m="http://schemas.openxmlformats.org/officeDocument/2006/math" xmlns:v="urn:schemas-microsoft-com:vml" xmlns:wp14="http://schemas.microsoft.com/office/word/2010/wordprocessingDrawing" xmlns:wp="http://schemas.openxmlformats.org/drawingml/2006/wordprocessingDrawing" xmlns:w10="urn:schemas-microsoft-com:office:word" xmlns:w="http://schemas.openxmlformats.org/wordprocessingml/2006/main" xmlns:w14="http://schemas.microsoft.com/office/word/2010/wordml" xmlns:w15="http://schemas.microsoft.com/office/word/2012/wordml" xmlns:w16cid="http://schemas.microsoft.com/office/word/2016/wordml/cid" xmlns:w16se="http://schemas.microsoft.com/office/word/2015/wordml/symex" xmlns:wpg="http://schemas.microsoft.com/office/word/2010/wordprocessingGroup" xmlns:wpi="http://schemas.microsoft.com/office/word/2010/wordprocessingInk" xmlns:wne="http://schemas.microsoft.com/office/word/2006/wordml" xmlns:wps="http://schemas.microsoft.com/office/word/2010/wordprocessingShape" mc:Ignorable="w14 w15 w16se w16cid wp14">
   <w:footnote w:type="separator" w:id="-1">
     <w:p>
       <w:pPr>
@@ -12986,8 +12967,8 @@
 </file>
 
 <file path=word/numbering.xml><?xml version="1.0" encoding="utf-8"?>
-<w:numbering xmlns:wpc="http://schemas.microsoft.com/office/word/2010/wordprocessingCanvas" xmlns:mo="http://schemas.microsoft.com/office/mac/office/2008/main" xmlns:mc="http://schemas.openxmlformats.org/markup-compatibility/2006" xmlns:mv="urn:schemas-microsoft-com:mac:vml" xmlns:o="urn:schemas-microsoft-com:office:office" xmlns:r="http://schemas.openxmlformats.org/officeDocument/2006/relationships" xmlns:m="http://schemas.openxmlformats.org/officeDocument/2006/math" xmlns:v="urn:schemas-microsoft-com:vml" xmlns:wp14="http://schemas.microsoft.com/office/word/2010/wordprocessingDrawing" xmlns:wp="http://schemas.openxmlformats.org/drawingml/2006/wordprocessingDrawing" xmlns:w10="urn:schemas-microsoft-com:office:word" xmlns:w="http://schemas.openxmlformats.org/wordprocessingml/2006/main" xmlns:w14="http://schemas.microsoft.com/office/word/2010/wordml" xmlns:wpg="http://schemas.microsoft.com/office/word/2010/wordprocessingGroup" xmlns:wpi="http://schemas.microsoft.com/office/word/2010/wordprocessingInk" xmlns:wne="http://schemas.microsoft.com/office/word/2006/wordml" xmlns:wps="http://schemas.microsoft.com/office/word/2010/wordprocessingShape" mc:Ignorable="w14 wp14">
-  <w:abstractNum w:abstractNumId="0">
+<w:numbering xmlns:wpc="http://schemas.microsoft.com/office/word/2010/wordprocessingCanvas" xmlns:cx="http://schemas.microsoft.com/office/drawing/2014/chartex" xmlns:cx1="http://schemas.microsoft.com/office/drawing/2015/9/8/chartex" xmlns:cx2="http://schemas.microsoft.com/office/drawing/2015/10/21/chartex" xmlns:cx3="http://schemas.microsoft.com/office/drawing/2016/5/9/chartex" xmlns:cx4="http://schemas.microsoft.com/office/drawing/2016/5/10/chartex" xmlns:cx5="http://schemas.microsoft.com/office/drawing/2016/5/11/chartex" xmlns:cx6="http://schemas.microsoft.com/office/drawing/2016/5/12/chartex" xmlns:cx7="http://schemas.microsoft.com/office/drawing/2016/5/13/chartex" xmlns:cx8="http://schemas.microsoft.com/office/drawing/2016/5/14/chartex" xmlns:mc="http://schemas.openxmlformats.org/markup-compatibility/2006" xmlns:aink="http://schemas.microsoft.com/office/drawing/2016/ink" xmlns:am3d="http://schemas.microsoft.com/office/drawing/2017/model3d" xmlns:o="urn:schemas-microsoft-com:office:office" xmlns:r="http://schemas.openxmlformats.org/officeDocument/2006/relationships" xmlns:m="http://schemas.openxmlformats.org/officeDocument/2006/math" xmlns:v="urn:schemas-microsoft-com:vml" xmlns:wp14="http://schemas.microsoft.com/office/word/2010/wordprocessingDrawing" xmlns:wp="http://schemas.openxmlformats.org/drawingml/2006/wordprocessingDrawing" xmlns:w10="urn:schemas-microsoft-com:office:word" xmlns:w="http://schemas.openxmlformats.org/wordprocessingml/2006/main" xmlns:w14="http://schemas.microsoft.com/office/word/2010/wordml" xmlns:w15="http://schemas.microsoft.com/office/word/2012/wordml" xmlns:w16cid="http://schemas.microsoft.com/office/word/2016/wordml/cid" xmlns:w16se="http://schemas.microsoft.com/office/word/2015/wordml/symex" xmlns:wpg="http://schemas.microsoft.com/office/word/2010/wordprocessingGroup" xmlns:wpi="http://schemas.microsoft.com/office/word/2010/wordprocessingInk" xmlns:wne="http://schemas.microsoft.com/office/word/2006/wordml" xmlns:wps="http://schemas.microsoft.com/office/word/2010/wordprocessingShape" mc:Ignorable="w14 w15 w16se w16cid wp14">
+  <w:abstractNum w:abstractNumId="0" w15:restartNumberingAfterBreak="0">
     <w:nsid w:val="04404941"/>
     <w:multiLevelType w:val="hybridMultilevel"/>
     <w:tmpl w:val="7B4450CA"/>
@@ -13076,7 +13057,7 @@
       </w:pPr>
     </w:lvl>
   </w:abstractNum>
-  <w:abstractNum w:abstractNumId="1">
+  <w:abstractNum w:abstractNumId="1" w15:restartNumberingAfterBreak="0">
     <w:nsid w:val="0E0A5AAE"/>
     <w:multiLevelType w:val="hybridMultilevel"/>
     <w:tmpl w:val="FDAC409E"/>
@@ -13170,7 +13151,7 @@
       </w:pPr>
     </w:lvl>
   </w:abstractNum>
-  <w:abstractNum w:abstractNumId="2">
+  <w:abstractNum w:abstractNumId="2" w15:restartNumberingAfterBreak="0">
     <w:nsid w:val="0EAF0BD0"/>
     <w:multiLevelType w:val="hybridMultilevel"/>
     <w:tmpl w:val="97146026"/>
@@ -13310,7 +13291,7 @@
       </w:rPr>
     </w:lvl>
   </w:abstractNum>
-  <w:abstractNum w:abstractNumId="3">
+  <w:abstractNum w:abstractNumId="3" w15:restartNumberingAfterBreak="0">
     <w:nsid w:val="187E5A6D"/>
     <w:multiLevelType w:val="multilevel"/>
     <w:tmpl w:val="9B6E3A2A"/>
@@ -13459,7 +13440,7 @@
       </w:rPr>
     </w:lvl>
   </w:abstractNum>
-  <w:abstractNum w:abstractNumId="4">
+  <w:abstractNum w:abstractNumId="4" w15:restartNumberingAfterBreak="0">
     <w:nsid w:val="344D233F"/>
     <w:multiLevelType w:val="hybridMultilevel"/>
     <w:tmpl w:val="AF946592"/>
@@ -13572,7 +13553,7 @@
       </w:rPr>
     </w:lvl>
   </w:abstractNum>
-  <w:abstractNum w:abstractNumId="5">
+  <w:abstractNum w:abstractNumId="5" w15:restartNumberingAfterBreak="0">
     <w:nsid w:val="39AC4A18"/>
     <w:multiLevelType w:val="hybridMultilevel"/>
     <w:tmpl w:val="5B7896CC"/>
@@ -13686,7 +13667,7 @@
       </w:rPr>
     </w:lvl>
   </w:abstractNum>
-  <w:abstractNum w:abstractNumId="6">
+  <w:abstractNum w:abstractNumId="6" w15:restartNumberingAfterBreak="0">
     <w:nsid w:val="453B34C9"/>
     <w:multiLevelType w:val="hybridMultilevel"/>
     <w:tmpl w:val="66AEB6BE"/>
@@ -13800,7 +13781,7 @@
       </w:rPr>
     </w:lvl>
   </w:abstractNum>
-  <w:abstractNum w:abstractNumId="7">
+  <w:abstractNum w:abstractNumId="7" w15:restartNumberingAfterBreak="0">
     <w:nsid w:val="47902B93"/>
     <w:multiLevelType w:val="hybridMultilevel"/>
     <w:tmpl w:val="C27EE922"/>
@@ -13893,7 +13874,7 @@
       </w:pPr>
     </w:lvl>
   </w:abstractNum>
-  <w:abstractNum w:abstractNumId="8">
+  <w:abstractNum w:abstractNumId="8" w15:restartNumberingAfterBreak="0">
     <w:nsid w:val="4C9F2315"/>
     <w:multiLevelType w:val="hybridMultilevel"/>
     <w:tmpl w:val="1F2E9B6C"/>
@@ -14006,7 +13987,7 @@
       </w:rPr>
     </w:lvl>
   </w:abstractNum>
-  <w:abstractNum w:abstractNumId="9">
+  <w:abstractNum w:abstractNumId="9" w15:restartNumberingAfterBreak="0">
     <w:nsid w:val="4E014B08"/>
     <w:multiLevelType w:val="hybridMultilevel"/>
     <w:tmpl w:val="C016B718"/>
@@ -14119,7 +14100,7 @@
       </w:rPr>
     </w:lvl>
   </w:abstractNum>
-  <w:abstractNum w:abstractNumId="10">
+  <w:abstractNum w:abstractNumId="10" w15:restartNumberingAfterBreak="0">
     <w:nsid w:val="53603F39"/>
     <w:multiLevelType w:val="hybridMultilevel"/>
     <w:tmpl w:val="F4B8DC52"/>
@@ -14211,7 +14192,7 @@
       </w:pPr>
     </w:lvl>
   </w:abstractNum>
-  <w:abstractNum w:abstractNumId="11">
+  <w:abstractNum w:abstractNumId="11" w15:restartNumberingAfterBreak="0">
     <w:nsid w:val="545746B9"/>
     <w:multiLevelType w:val="hybridMultilevel"/>
     <w:tmpl w:val="BDC4A506"/>
@@ -14324,7 +14305,7 @@
       </w:rPr>
     </w:lvl>
   </w:abstractNum>
-  <w:abstractNum w:abstractNumId="12">
+  <w:abstractNum w:abstractNumId="12" w15:restartNumberingAfterBreak="0">
     <w:nsid w:val="574B17C2"/>
     <w:multiLevelType w:val="multilevel"/>
     <w:tmpl w:val="4AE0EC5A"/>
@@ -14473,7 +14454,7 @@
       </w:rPr>
     </w:lvl>
   </w:abstractNum>
-  <w:abstractNum w:abstractNumId="13">
+  <w:abstractNum w:abstractNumId="13" w15:restartNumberingAfterBreak="0">
     <w:nsid w:val="5BDB2357"/>
     <w:multiLevelType w:val="hybridMultilevel"/>
     <w:tmpl w:val="8AB00708"/>
@@ -14567,7 +14548,7 @@
       </w:pPr>
     </w:lvl>
   </w:abstractNum>
-  <w:abstractNum w:abstractNumId="14">
+  <w:abstractNum w:abstractNumId="14" w15:restartNumberingAfterBreak="0">
     <w:nsid w:val="61345E0A"/>
     <w:multiLevelType w:val="hybridMultilevel"/>
     <w:tmpl w:val="F8CE9D8A"/>
@@ -14680,7 +14661,7 @@
       </w:rPr>
     </w:lvl>
   </w:abstractNum>
-  <w:abstractNum w:abstractNumId="15">
+  <w:abstractNum w:abstractNumId="15" w15:restartNumberingAfterBreak="0">
     <w:nsid w:val="6BB67AA9"/>
     <w:multiLevelType w:val="hybridMultilevel"/>
     <w:tmpl w:val="0638D3EA"/>
@@ -14793,7 +14774,7 @@
       </w:rPr>
     </w:lvl>
   </w:abstractNum>
-  <w:abstractNum w:abstractNumId="16">
+  <w:abstractNum w:abstractNumId="16" w15:restartNumberingAfterBreak="0">
     <w:nsid w:val="74EC5ADA"/>
     <w:multiLevelType w:val="hybridMultilevel"/>
     <w:tmpl w:val="2FE0251E"/>
@@ -14906,7 +14887,7 @@
       </w:rPr>
     </w:lvl>
   </w:abstractNum>
-  <w:abstractNum w:abstractNumId="17">
+  <w:abstractNum w:abstractNumId="17" w15:restartNumberingAfterBreak="0">
     <w:nsid w:val="79520D63"/>
     <w:multiLevelType w:val="hybridMultilevel"/>
     <w:tmpl w:val="A1B07D0E"/>
@@ -15085,7 +15066,7 @@
 </file>
 
 <file path=word/styles.xml><?xml version="1.0" encoding="utf-8"?>
-<w:styles xmlns:mc="http://schemas.openxmlformats.org/markup-compatibility/2006" xmlns:r="http://schemas.openxmlformats.org/officeDocument/2006/relationships" xmlns:w="http://schemas.openxmlformats.org/wordprocessingml/2006/main" xmlns:w14="http://schemas.microsoft.com/office/word/2010/wordml" mc:Ignorable="w14">
+<w:styles xmlns:mc="http://schemas.openxmlformats.org/markup-compatibility/2006" xmlns:r="http://schemas.openxmlformats.org/officeDocument/2006/relationships" xmlns:w="http://schemas.openxmlformats.org/wordprocessingml/2006/main" xmlns:w14="http://schemas.microsoft.com/office/word/2010/wordml" xmlns:w15="http://schemas.microsoft.com/office/word/2012/wordml" xmlns:w16cid="http://schemas.microsoft.com/office/word/2016/wordml/cid" xmlns:w16se="http://schemas.microsoft.com/office/word/2015/wordml/symex" mc:Ignorable="w14 w15 w16se w16cid">
   <w:docDefaults>
     <w:rPrDefault>
       <w:rPr>
@@ -15095,158 +15076,379 @@
     </w:rPrDefault>
     <w:pPrDefault/>
   </w:docDefaults>
-  <w:latentStyles w:defLockedState="0" w:defUIPriority="99" w:defSemiHidden="1" w:defUnhideWhenUsed="1" w:defQFormat="0" w:count="276">
-    <w:lsdException w:name="Normal" w:semiHidden="0" w:uiPriority="0" w:unhideWhenUsed="0" w:qFormat="1"/>
-    <w:lsdException w:name="heading 1" w:semiHidden="0" w:uiPriority="9" w:unhideWhenUsed="0" w:qFormat="1"/>
-    <w:lsdException w:name="heading 2" w:uiPriority="9" w:qFormat="1"/>
-    <w:lsdException w:name="heading 3" w:uiPriority="9" w:qFormat="1"/>
-    <w:lsdException w:name="heading 4" w:uiPriority="9" w:qFormat="1"/>
-    <w:lsdException w:name="heading 5" w:uiPriority="9" w:qFormat="1"/>
-    <w:lsdException w:name="heading 6" w:uiPriority="9" w:qFormat="1"/>
-    <w:lsdException w:name="heading 7" w:uiPriority="9" w:qFormat="1"/>
-    <w:lsdException w:name="heading 8" w:uiPriority="9" w:qFormat="1"/>
-    <w:lsdException w:name="heading 9" w:uiPriority="9" w:qFormat="1"/>
-    <w:lsdException w:name="toc 1" w:uiPriority="39"/>
-    <w:lsdException w:name="toc 2" w:uiPriority="39"/>
-    <w:lsdException w:name="toc 3" w:uiPriority="39"/>
-    <w:lsdException w:name="toc 4" w:uiPriority="39"/>
-    <w:lsdException w:name="toc 5" w:uiPriority="39"/>
-    <w:lsdException w:name="toc 6" w:uiPriority="39"/>
-    <w:lsdException w:name="toc 7" w:uiPriority="39"/>
-    <w:lsdException w:name="toc 8" w:uiPriority="39"/>
-    <w:lsdException w:name="toc 9" w:uiPriority="39"/>
-    <w:lsdException w:name="footer" w:qFormat="1"/>
-    <w:lsdException w:name="caption" w:uiPriority="35" w:qFormat="1"/>
-    <w:lsdException w:name="page number" w:uiPriority="0"/>
-    <w:lsdException w:name="Title" w:semiHidden="0" w:uiPriority="10" w:unhideWhenUsed="0" w:qFormat="1"/>
-    <w:lsdException w:name="Default Paragraph Font" w:uiPriority="1"/>
-    <w:lsdException w:name="Subtitle" w:semiHidden="0" w:uiPriority="11" w:unhideWhenUsed="0" w:qFormat="1"/>
-    <w:lsdException w:name="Hyperlink" w:qFormat="1"/>
-    <w:lsdException w:name="Strong" w:semiHidden="0" w:uiPriority="22" w:unhideWhenUsed="0" w:qFormat="1"/>
-    <w:lsdException w:name="Emphasis" w:semiHidden="0" w:uiPriority="20" w:unhideWhenUsed="0" w:qFormat="1"/>
-    <w:lsdException w:name="Table Grid" w:semiHidden="0" w:uiPriority="59" w:unhideWhenUsed="0"/>
-    <w:lsdException w:name="Note Level 1" w:semiHidden="0" w:unhideWhenUsed="0"/>
-    <w:lsdException w:name="Note Level 2" w:semiHidden="0" w:unhideWhenUsed="0"/>
-    <w:lsdException w:name="Note Level 3" w:semiHidden="0" w:unhideWhenUsed="0"/>
-    <w:lsdException w:name="Note Level 4" w:semiHidden="0" w:unhideWhenUsed="0"/>
-    <w:lsdException w:name="Note Level 5" w:semiHidden="0" w:unhideWhenUsed="0"/>
-    <w:lsdException w:name="Note Level 6" w:semiHidden="0" w:unhideWhenUsed="0"/>
-    <w:lsdException w:name="Note Level 7" w:semiHidden="0" w:unhideWhenUsed="0"/>
-    <w:lsdException w:name="Note Level 8" w:semiHidden="0" w:unhideWhenUsed="0"/>
-    <w:lsdException w:name="Note Level 9" w:semiHidden="0" w:unhideWhenUsed="0"/>
-    <w:lsdException w:name="Placeholder Text" w:unhideWhenUsed="0"/>
-    <w:lsdException w:name="No Spacing" w:semiHidden="0" w:unhideWhenUsed="0" w:qFormat="1"/>
-    <w:lsdException w:name="Light Shading" w:semiHidden="0" w:unhideWhenUsed="0"/>
-    <w:lsdException w:name="Light List" w:semiHidden="0" w:unhideWhenUsed="0"/>
-    <w:lsdException w:name="Light Grid" w:semiHidden="0" w:unhideWhenUsed="0"/>
-    <w:lsdException w:name="Medium Shading 1" w:semiHidden="0" w:unhideWhenUsed="0"/>
-    <w:lsdException w:name="Medium Shading 2" w:semiHidden="0" w:unhideWhenUsed="0"/>
-    <w:lsdException w:name="Medium List 1" w:semiHidden="0" w:unhideWhenUsed="0"/>
-    <w:lsdException w:name="Medium List 2" w:semiHidden="0" w:unhideWhenUsed="0"/>
-    <w:lsdException w:name="Medium Grid 1" w:semiHidden="0" w:unhideWhenUsed="0"/>
-    <w:lsdException w:name="Medium Grid 2" w:semiHidden="0" w:unhideWhenUsed="0" w:qFormat="1"/>
-    <w:lsdException w:name="Medium Grid 3" w:semiHidden="0" w:unhideWhenUsed="0"/>
-    <w:lsdException w:name="Dark List" w:semiHidden="0" w:unhideWhenUsed="0"/>
-    <w:lsdException w:name="Colorful Shading" w:semiHidden="0" w:unhideWhenUsed="0"/>
-    <w:lsdException w:name="Colorful List" w:semiHidden="0" w:unhideWhenUsed="0"/>
-    <w:lsdException w:name="Colorful Grid" w:semiHidden="0" w:unhideWhenUsed="0"/>
-    <w:lsdException w:name="Light Shading Accent 1" w:semiHidden="0" w:unhideWhenUsed="0"/>
-    <w:lsdException w:name="Light List Accent 1" w:semiHidden="0" w:unhideWhenUsed="0"/>
-    <w:lsdException w:name="Light Grid Accent 1" w:semiHidden="0" w:unhideWhenUsed="0"/>
-    <w:lsdException w:name="Medium Shading 1 Accent 1" w:semiHidden="0" w:uiPriority="1" w:unhideWhenUsed="0" w:qFormat="1"/>
-    <w:lsdException w:name="Medium Shading 2 Accent 1" w:semiHidden="0" w:uiPriority="60" w:unhideWhenUsed="0"/>
-    <w:lsdException w:name="Medium List 1 Accent 1" w:semiHidden="0" w:uiPriority="61" w:unhideWhenUsed="0"/>
-    <w:lsdException w:name="Revision" w:uiPriority="62" w:unhideWhenUsed="0"/>
-    <w:lsdException w:name="List Paragraph" w:semiHidden="0" w:uiPriority="63" w:unhideWhenUsed="0" w:qFormat="1"/>
-    <w:lsdException w:name="Quote" w:semiHidden="0" w:uiPriority="64" w:unhideWhenUsed="0" w:qFormat="1"/>
-    <w:lsdException w:name="Intense Quote" w:semiHidden="0" w:uiPriority="65" w:unhideWhenUsed="0" w:qFormat="1"/>
-    <w:lsdException w:name="Medium List 2 Accent 1" w:semiHidden="0" w:uiPriority="66" w:unhideWhenUsed="0"/>
-    <w:lsdException w:name="Medium Grid 1 Accent 1" w:semiHidden="0" w:uiPriority="67" w:unhideWhenUsed="0"/>
-    <w:lsdException w:name="Medium Grid 2 Accent 1" w:semiHidden="0" w:uiPriority="68" w:unhideWhenUsed="0"/>
-    <w:lsdException w:name="Medium Grid 3 Accent 1" w:semiHidden="0" w:uiPriority="69" w:unhideWhenUsed="0"/>
-    <w:lsdException w:name="Dark List Accent 1" w:semiHidden="0" w:uiPriority="70" w:unhideWhenUsed="0"/>
-    <w:lsdException w:name="Colorful Shading Accent 1" w:semiHidden="0" w:uiPriority="71" w:unhideWhenUsed="0"/>
-    <w:lsdException w:name="Colorful List Accent 1" w:semiHidden="0" w:uiPriority="72" w:unhideWhenUsed="0" w:qFormat="1"/>
-    <w:lsdException w:name="Colorful Grid Accent 1" w:semiHidden="0" w:uiPriority="73" w:unhideWhenUsed="0" w:qFormat="1"/>
-    <w:lsdException w:name="Light Shading Accent 2" w:semiHidden="0" w:uiPriority="60" w:unhideWhenUsed="0" w:qFormat="1"/>
-    <w:lsdException w:name="Light List Accent 2" w:semiHidden="0" w:uiPriority="61" w:unhideWhenUsed="0"/>
-    <w:lsdException w:name="Light Grid Accent 2" w:semiHidden="0" w:uiPriority="62" w:unhideWhenUsed="0"/>
-    <w:lsdException w:name="Medium Shading 1 Accent 2" w:semiHidden="0" w:uiPriority="63" w:unhideWhenUsed="0"/>
-    <w:lsdException w:name="Medium Shading 2 Accent 2" w:semiHidden="0" w:uiPriority="64" w:unhideWhenUsed="0"/>
-    <w:lsdException w:name="Medium List 1 Accent 2" w:semiHidden="0" w:uiPriority="65" w:unhideWhenUsed="0"/>
-    <w:lsdException w:name="Medium List 2 Accent 2" w:semiHidden="0" w:unhideWhenUsed="0"/>
-    <w:lsdException w:name="Medium Grid 1 Accent 2" w:semiHidden="0" w:uiPriority="34" w:unhideWhenUsed="0" w:qFormat="1"/>
-    <w:lsdException w:name="Medium Grid 2 Accent 2" w:semiHidden="0" w:uiPriority="29" w:unhideWhenUsed="0" w:qFormat="1"/>
-    <w:lsdException w:name="Medium Grid 3 Accent 2" w:semiHidden="0" w:uiPriority="30" w:unhideWhenUsed="0" w:qFormat="1"/>
-    <w:lsdException w:name="Dark List Accent 2" w:semiHidden="0" w:uiPriority="66" w:unhideWhenUsed="0"/>
-    <w:lsdException w:name="Colorful Shading Accent 2" w:semiHidden="0" w:uiPriority="67" w:unhideWhenUsed="0"/>
-    <w:lsdException w:name="Colorful List Accent 2" w:semiHidden="0" w:uiPriority="68" w:unhideWhenUsed="0"/>
-    <w:lsdException w:name="Colorful Grid Accent 2" w:semiHidden="0" w:uiPriority="69" w:unhideWhenUsed="0"/>
-    <w:lsdException w:name="Light Shading Accent 3" w:semiHidden="0" w:uiPriority="70" w:unhideWhenUsed="0"/>
-    <w:lsdException w:name="Light List Accent 3" w:semiHidden="0" w:uiPriority="71" w:unhideWhenUsed="0"/>
-    <w:lsdException w:name="Light Grid Accent 3" w:semiHidden="0" w:uiPriority="72" w:unhideWhenUsed="0"/>
-    <w:lsdException w:name="Medium Shading 1 Accent 3" w:semiHidden="0" w:uiPriority="73" w:unhideWhenUsed="0"/>
-    <w:lsdException w:name="Medium Shading 2 Accent 3" w:semiHidden="0" w:uiPriority="60" w:unhideWhenUsed="0"/>
-    <w:lsdException w:name="Medium List 1 Accent 3" w:semiHidden="0" w:uiPriority="61" w:unhideWhenUsed="0"/>
-    <w:lsdException w:name="Medium List 2 Accent 3" w:semiHidden="0" w:uiPriority="62" w:unhideWhenUsed="0"/>
-    <w:lsdException w:name="Medium Grid 1 Accent 3" w:semiHidden="0" w:uiPriority="63" w:unhideWhenUsed="0"/>
-    <w:lsdException w:name="Medium Grid 2 Accent 3" w:semiHidden="0" w:uiPriority="64" w:unhideWhenUsed="0"/>
-    <w:lsdException w:name="Medium Grid 3 Accent 3" w:semiHidden="0" w:uiPriority="65" w:unhideWhenUsed="0"/>
-    <w:lsdException w:name="Dark List Accent 3" w:semiHidden="0" w:uiPriority="66" w:unhideWhenUsed="0"/>
-    <w:lsdException w:name="Colorful Shading Accent 3" w:semiHidden="0" w:uiPriority="67" w:unhideWhenUsed="0"/>
-    <w:lsdException w:name="Colorful List Accent 3" w:semiHidden="0" w:uiPriority="68" w:unhideWhenUsed="0"/>
-    <w:lsdException w:name="Colorful Grid Accent 3" w:semiHidden="0" w:uiPriority="69" w:unhideWhenUsed="0"/>
-    <w:lsdException w:name="Light Shading Accent 4" w:semiHidden="0" w:uiPriority="70" w:unhideWhenUsed="0"/>
-    <w:lsdException w:name="Light List Accent 4" w:semiHidden="0" w:uiPriority="71" w:unhideWhenUsed="0"/>
-    <w:lsdException w:name="Light Grid Accent 4" w:semiHidden="0" w:uiPriority="72" w:unhideWhenUsed="0"/>
-    <w:lsdException w:name="Medium Shading 1 Accent 4" w:semiHidden="0" w:uiPriority="73" w:unhideWhenUsed="0"/>
-    <w:lsdException w:name="Medium Shading 2 Accent 4" w:semiHidden="0" w:uiPriority="60" w:unhideWhenUsed="0"/>
-    <w:lsdException w:name="Medium List 1 Accent 4" w:semiHidden="0" w:uiPriority="61" w:unhideWhenUsed="0"/>
-    <w:lsdException w:name="Medium List 2 Accent 4" w:semiHidden="0" w:uiPriority="62" w:unhideWhenUsed="0"/>
-    <w:lsdException w:name="Medium Grid 1 Accent 4" w:semiHidden="0" w:uiPriority="63" w:unhideWhenUsed="0"/>
-    <w:lsdException w:name="Medium Grid 2 Accent 4" w:semiHidden="0" w:uiPriority="64" w:unhideWhenUsed="0"/>
-    <w:lsdException w:name="Medium Grid 3 Accent 4" w:semiHidden="0" w:uiPriority="65" w:unhideWhenUsed="0"/>
-    <w:lsdException w:name="Dark List Accent 4" w:semiHidden="0" w:uiPriority="66" w:unhideWhenUsed="0"/>
-    <w:lsdException w:name="Colorful Shading Accent 4" w:semiHidden="0" w:uiPriority="67" w:unhideWhenUsed="0"/>
-    <w:lsdException w:name="Colorful List Accent 4" w:semiHidden="0" w:uiPriority="68" w:unhideWhenUsed="0"/>
-    <w:lsdException w:name="Colorful Grid Accent 4" w:semiHidden="0" w:uiPriority="69" w:unhideWhenUsed="0"/>
-    <w:lsdException w:name="Light Shading Accent 5" w:semiHidden="0" w:uiPriority="70" w:unhideWhenUsed="0"/>
-    <w:lsdException w:name="Light List Accent 5" w:semiHidden="0" w:uiPriority="71" w:unhideWhenUsed="0"/>
-    <w:lsdException w:name="Light Grid Accent 5" w:semiHidden="0" w:uiPriority="72" w:unhideWhenUsed="0"/>
-    <w:lsdException w:name="Medium Shading 1 Accent 5" w:semiHidden="0" w:uiPriority="73" w:unhideWhenUsed="0"/>
-    <w:lsdException w:name="Medium Shading 2 Accent 5" w:semiHidden="0" w:uiPriority="60" w:unhideWhenUsed="0"/>
-    <w:lsdException w:name="Medium List 1 Accent 5" w:semiHidden="0" w:uiPriority="61" w:unhideWhenUsed="0"/>
-    <w:lsdException w:name="Medium List 2 Accent 5" w:semiHidden="0" w:uiPriority="62" w:unhideWhenUsed="0"/>
-    <w:lsdException w:name="Medium Grid 1 Accent 5" w:semiHidden="0" w:uiPriority="63" w:unhideWhenUsed="0"/>
-    <w:lsdException w:name="Medium Grid 2 Accent 5" w:semiHidden="0" w:uiPriority="64" w:unhideWhenUsed="0"/>
-    <w:lsdException w:name="Medium Grid 3 Accent 5" w:semiHidden="0" w:uiPriority="65" w:unhideWhenUsed="0"/>
-    <w:lsdException w:name="Dark List Accent 5" w:semiHidden="0" w:uiPriority="66" w:unhideWhenUsed="0"/>
-    <w:lsdException w:name="Colorful Shading Accent 5" w:semiHidden="0" w:uiPriority="67" w:unhideWhenUsed="0"/>
-    <w:lsdException w:name="Colorful List Accent 5" w:semiHidden="0" w:uiPriority="68" w:unhideWhenUsed="0"/>
-    <w:lsdException w:name="Colorful Grid Accent 5" w:semiHidden="0" w:uiPriority="69" w:unhideWhenUsed="0"/>
-    <w:lsdException w:name="Light Shading Accent 6" w:semiHidden="0" w:uiPriority="70" w:unhideWhenUsed="0"/>
-    <w:lsdException w:name="Light List Accent 6" w:semiHidden="0" w:uiPriority="71" w:unhideWhenUsed="0"/>
-    <w:lsdException w:name="Light Grid Accent 6" w:semiHidden="0" w:uiPriority="72" w:unhideWhenUsed="0"/>
-    <w:lsdException w:name="Medium Shading 1 Accent 6" w:semiHidden="0" w:uiPriority="73" w:unhideWhenUsed="0"/>
-    <w:lsdException w:name="Medium Shading 2 Accent 6" w:semiHidden="0" w:uiPriority="60" w:unhideWhenUsed="0"/>
-    <w:lsdException w:name="Medium List 1 Accent 6" w:semiHidden="0" w:uiPriority="61" w:unhideWhenUsed="0"/>
-    <w:lsdException w:name="Medium List 2 Accent 6" w:semiHidden="0" w:uiPriority="62" w:unhideWhenUsed="0"/>
-    <w:lsdException w:name="Medium Grid 1 Accent 6" w:semiHidden="0" w:uiPriority="63" w:unhideWhenUsed="0"/>
-    <w:lsdException w:name="Medium Grid 2 Accent 6" w:semiHidden="0" w:uiPriority="64" w:unhideWhenUsed="0"/>
-    <w:lsdException w:name="Medium Grid 3 Accent 6" w:semiHidden="0" w:uiPriority="65" w:unhideWhenUsed="0"/>
-    <w:lsdException w:name="Dark List Accent 6" w:semiHidden="0" w:uiPriority="66" w:unhideWhenUsed="0"/>
-    <w:lsdException w:name="Colorful Shading Accent 6" w:semiHidden="0" w:uiPriority="67" w:unhideWhenUsed="0"/>
-    <w:lsdException w:name="Colorful List Accent 6" w:semiHidden="0" w:uiPriority="68" w:unhideWhenUsed="0"/>
-    <w:lsdException w:name="Colorful Grid Accent 6" w:semiHidden="0" w:uiPriority="69" w:unhideWhenUsed="0"/>
-    <w:lsdException w:name="Subtle Emphasis" w:semiHidden="0" w:uiPriority="70" w:unhideWhenUsed="0" w:qFormat="1"/>
-    <w:lsdException w:name="Intense Emphasis" w:semiHidden="0" w:uiPriority="71" w:unhideWhenUsed="0" w:qFormat="1"/>
-    <w:lsdException w:name="Subtle Reference" w:semiHidden="0" w:uiPriority="72" w:unhideWhenUsed="0"/>
-    <w:lsdException w:name="Intense Reference" w:semiHidden="0" w:uiPriority="73" w:unhideWhenUsed="0" w:qFormat="1"/>
-    <w:lsdException w:name="Book Title" w:semiHidden="0" w:uiPriority="60" w:unhideWhenUsed="0" w:qFormat="1"/>
-    <w:lsdException w:name="Bibliography" w:uiPriority="61"/>
-    <w:lsdException w:name="TOC Heading" w:uiPriority="62" w:qFormat="1"/>
+  <w:latentStyles w:defLockedState="0" w:defUIPriority="99" w:defSemiHidden="0" w:defUnhideWhenUsed="0" w:defQFormat="0" w:count="375">
+    <w:lsdException w:name="Normal" w:uiPriority="0" w:qFormat="1"/>
+    <w:lsdException w:name="heading 1" w:uiPriority="9" w:qFormat="1"/>
+    <w:lsdException w:name="heading 2" w:semiHidden="1" w:uiPriority="9" w:unhideWhenUsed="1" w:qFormat="1"/>
+    <w:lsdException w:name="heading 3" w:semiHidden="1" w:uiPriority="9" w:unhideWhenUsed="1" w:qFormat="1"/>
+    <w:lsdException w:name="heading 4" w:semiHidden="1" w:uiPriority="9" w:unhideWhenUsed="1" w:qFormat="1"/>
+    <w:lsdException w:name="heading 5" w:semiHidden="1" w:uiPriority="9" w:unhideWhenUsed="1" w:qFormat="1"/>
+    <w:lsdException w:name="heading 6" w:semiHidden="1" w:uiPriority="9" w:unhideWhenUsed="1" w:qFormat="1"/>
+    <w:lsdException w:name="heading 7" w:semiHidden="1" w:uiPriority="9" w:unhideWhenUsed="1" w:qFormat="1"/>
+    <w:lsdException w:name="heading 8" w:semiHidden="1" w:uiPriority="9" w:unhideWhenUsed="1" w:qFormat="1"/>
+    <w:lsdException w:name="heading 9" w:semiHidden="1" w:uiPriority="9" w:unhideWhenUsed="1" w:qFormat="1"/>
+    <w:lsdException w:name="index 1" w:semiHidden="1" w:unhideWhenUsed="1"/>
+    <w:lsdException w:name="index 2" w:semiHidden="1" w:unhideWhenUsed="1"/>
+    <w:lsdException w:name="index 3" w:semiHidden="1" w:unhideWhenUsed="1"/>
+    <w:lsdException w:name="index 4" w:semiHidden="1" w:unhideWhenUsed="1"/>
+    <w:lsdException w:name="index 5" w:semiHidden="1" w:unhideWhenUsed="1"/>
+    <w:lsdException w:name="index 6" w:semiHidden="1" w:unhideWhenUsed="1"/>
+    <w:lsdException w:name="index 7" w:semiHidden="1" w:unhideWhenUsed="1"/>
+    <w:lsdException w:name="index 8" w:semiHidden="1" w:unhideWhenUsed="1"/>
+    <w:lsdException w:name="index 9" w:semiHidden="1" w:unhideWhenUsed="1"/>
+    <w:lsdException w:name="toc 1" w:semiHidden="1" w:uiPriority="39" w:unhideWhenUsed="1"/>
+    <w:lsdException w:name="toc 2" w:semiHidden="1" w:uiPriority="39" w:unhideWhenUsed="1"/>
+    <w:lsdException w:name="toc 3" w:semiHidden="1" w:uiPriority="39" w:unhideWhenUsed="1"/>
+    <w:lsdException w:name="toc 4" w:semiHidden="1" w:uiPriority="39" w:unhideWhenUsed="1"/>
+    <w:lsdException w:name="toc 5" w:semiHidden="1" w:uiPriority="39" w:unhideWhenUsed="1"/>
+    <w:lsdException w:name="toc 6" w:semiHidden="1" w:uiPriority="39" w:unhideWhenUsed="1"/>
+    <w:lsdException w:name="toc 7" w:semiHidden="1" w:uiPriority="39" w:unhideWhenUsed="1"/>
+    <w:lsdException w:name="toc 8" w:semiHidden="1" w:uiPriority="39" w:unhideWhenUsed="1"/>
+    <w:lsdException w:name="toc 9" w:semiHidden="1" w:uiPriority="39" w:unhideWhenUsed="1"/>
+    <w:lsdException w:name="Normal Indent" w:semiHidden="1" w:unhideWhenUsed="1"/>
+    <w:lsdException w:name="footnote text" w:semiHidden="1" w:unhideWhenUsed="1"/>
+    <w:lsdException w:name="annotation text" w:semiHidden="1" w:unhideWhenUsed="1"/>
+    <w:lsdException w:name="header" w:semiHidden="1" w:unhideWhenUsed="1"/>
+    <w:lsdException w:name="footer" w:semiHidden="1" w:unhideWhenUsed="1" w:qFormat="1"/>
+    <w:lsdException w:name="index heading" w:semiHidden="1" w:unhideWhenUsed="1"/>
+    <w:lsdException w:name="caption" w:semiHidden="1" w:uiPriority="35" w:unhideWhenUsed="1" w:qFormat="1"/>
+    <w:lsdException w:name="table of figures" w:semiHidden="1" w:unhideWhenUsed="1"/>
+    <w:lsdException w:name="envelope address" w:semiHidden="1" w:unhideWhenUsed="1"/>
+    <w:lsdException w:name="envelope return" w:semiHidden="1" w:unhideWhenUsed="1"/>
+    <w:lsdException w:name="footnote reference" w:semiHidden="1" w:unhideWhenUsed="1"/>
+    <w:lsdException w:name="annotation reference" w:semiHidden="1" w:unhideWhenUsed="1"/>
+    <w:lsdException w:name="line number" w:semiHidden="1" w:unhideWhenUsed="1"/>
+    <w:lsdException w:name="page number" w:semiHidden="1" w:uiPriority="0" w:unhideWhenUsed="1"/>
+    <w:lsdException w:name="endnote reference" w:semiHidden="1" w:unhideWhenUsed="1"/>
+    <w:lsdException w:name="endnote text" w:semiHidden="1" w:unhideWhenUsed="1"/>
+    <w:lsdException w:name="table of authorities" w:semiHidden="1" w:unhideWhenUsed="1"/>
+    <w:lsdException w:name="macro" w:semiHidden="1" w:unhideWhenUsed="1"/>
+    <w:lsdException w:name="toa heading" w:semiHidden="1" w:unhideWhenUsed="1"/>
+    <w:lsdException w:name="List" w:semiHidden="1" w:unhideWhenUsed="1"/>
+    <w:lsdException w:name="List Bullet" w:semiHidden="1" w:unhideWhenUsed="1"/>
+    <w:lsdException w:name="List Number" w:semiHidden="1" w:unhideWhenUsed="1"/>
+    <w:lsdException w:name="List 2" w:semiHidden="1" w:unhideWhenUsed="1"/>
+    <w:lsdException w:name="List 3" w:semiHidden="1" w:unhideWhenUsed="1"/>
+    <w:lsdException w:name="List 4" w:semiHidden="1" w:unhideWhenUsed="1"/>
+    <w:lsdException w:name="List 5" w:semiHidden="1" w:unhideWhenUsed="1"/>
+    <w:lsdException w:name="List Bullet 2" w:semiHidden="1" w:unhideWhenUsed="1"/>
+    <w:lsdException w:name="List Bullet 3" w:semiHidden="1" w:unhideWhenUsed="1"/>
+    <w:lsdException w:name="List Bullet 4" w:semiHidden="1" w:unhideWhenUsed="1"/>
+    <w:lsdException w:name="List Bullet 5" w:semiHidden="1" w:unhideWhenUsed="1"/>
+    <w:lsdException w:name="List Number 2" w:semiHidden="1" w:unhideWhenUsed="1"/>
+    <w:lsdException w:name="List Number 3" w:semiHidden="1" w:unhideWhenUsed="1"/>
+    <w:lsdException w:name="List Number 4" w:semiHidden="1" w:unhideWhenUsed="1"/>
+    <w:lsdException w:name="List Number 5" w:semiHidden="1" w:unhideWhenUsed="1"/>
+    <w:lsdException w:name="Title" w:uiPriority="10" w:qFormat="1"/>
+    <w:lsdException w:name="Closing" w:semiHidden="1" w:unhideWhenUsed="1"/>
+    <w:lsdException w:name="Signature" w:semiHidden="1" w:unhideWhenUsed="1"/>
+    <w:lsdException w:name="Default Paragraph Font" w:semiHidden="1" w:uiPriority="1" w:unhideWhenUsed="1"/>
+    <w:lsdException w:name="Body Text" w:semiHidden="1" w:unhideWhenUsed="1"/>
+    <w:lsdException w:name="Body Text Indent" w:semiHidden="1" w:unhideWhenUsed="1"/>
+    <w:lsdException w:name="List Continue" w:semiHidden="1" w:unhideWhenUsed="1"/>
+    <w:lsdException w:name="List Continue 2" w:semiHidden="1" w:unhideWhenUsed="1"/>
+    <w:lsdException w:name="List Continue 3" w:semiHidden="1" w:unhideWhenUsed="1"/>
+    <w:lsdException w:name="List Continue 4" w:semiHidden="1" w:unhideWhenUsed="1"/>
+    <w:lsdException w:name="List Continue 5" w:semiHidden="1" w:unhideWhenUsed="1"/>
+    <w:lsdException w:name="Message Header" w:semiHidden="1" w:unhideWhenUsed="1"/>
+    <w:lsdException w:name="Subtitle" w:uiPriority="11" w:qFormat="1"/>
+    <w:lsdException w:name="Salutation" w:semiHidden="1" w:unhideWhenUsed="1"/>
+    <w:lsdException w:name="Date" w:semiHidden="1" w:unhideWhenUsed="1"/>
+    <w:lsdException w:name="Body Text First Indent" w:semiHidden="1" w:unhideWhenUsed="1"/>
+    <w:lsdException w:name="Body Text First Indent 2" w:semiHidden="1" w:unhideWhenUsed="1"/>
+    <w:lsdException w:name="Note Heading" w:semiHidden="1" w:unhideWhenUsed="1"/>
+    <w:lsdException w:name="Body Text 2" w:semiHidden="1" w:unhideWhenUsed="1"/>
+    <w:lsdException w:name="Body Text 3" w:semiHidden="1" w:unhideWhenUsed="1"/>
+    <w:lsdException w:name="Body Text Indent 2" w:semiHidden="1" w:unhideWhenUsed="1"/>
+    <w:lsdException w:name="Body Text Indent 3" w:semiHidden="1" w:unhideWhenUsed="1"/>
+    <w:lsdException w:name="Block Text" w:semiHidden="1" w:unhideWhenUsed="1"/>
+    <w:lsdException w:name="Hyperlink" w:semiHidden="1" w:unhideWhenUsed="1" w:qFormat="1"/>
+    <w:lsdException w:name="FollowedHyperlink" w:semiHidden="1" w:unhideWhenUsed="1"/>
+    <w:lsdException w:name="Strong" w:uiPriority="22" w:qFormat="1"/>
+    <w:lsdException w:name="Emphasis" w:uiPriority="20" w:qFormat="1"/>
+    <w:lsdException w:name="Document Map" w:semiHidden="1" w:unhideWhenUsed="1"/>
+    <w:lsdException w:name="Plain Text" w:semiHidden="1" w:unhideWhenUsed="1"/>
+    <w:lsdException w:name="E-mail Signature" w:semiHidden="1" w:unhideWhenUsed="1"/>
+    <w:lsdException w:name="HTML Top of Form" w:semiHidden="1" w:unhideWhenUsed="1"/>
+    <w:lsdException w:name="HTML Bottom of Form" w:semiHidden="1" w:unhideWhenUsed="1"/>
+    <w:lsdException w:name="Normal (Web)" w:semiHidden="1" w:unhideWhenUsed="1"/>
+    <w:lsdException w:name="HTML Acronym" w:semiHidden="1" w:unhideWhenUsed="1"/>
+    <w:lsdException w:name="HTML Address" w:semiHidden="1" w:unhideWhenUsed="1"/>
+    <w:lsdException w:name="HTML Cite" w:semiHidden="1" w:unhideWhenUsed="1"/>
+    <w:lsdException w:name="HTML Code" w:semiHidden="1" w:unhideWhenUsed="1"/>
+    <w:lsdException w:name="HTML Definition" w:semiHidden="1" w:unhideWhenUsed="1"/>
+    <w:lsdException w:name="HTML Keyboard" w:semiHidden="1" w:unhideWhenUsed="1"/>
+    <w:lsdException w:name="HTML Preformatted" w:semiHidden="1" w:unhideWhenUsed="1"/>
+    <w:lsdException w:name="HTML Sample" w:semiHidden="1" w:unhideWhenUsed="1"/>
+    <w:lsdException w:name="HTML Typewriter" w:semiHidden="1" w:unhideWhenUsed="1"/>
+    <w:lsdException w:name="HTML Variable" w:semiHidden="1" w:unhideWhenUsed="1"/>
+    <w:lsdException w:name="Normal Table" w:semiHidden="1" w:unhideWhenUsed="1"/>
+    <w:lsdException w:name="annotation subject" w:semiHidden="1" w:unhideWhenUsed="1"/>
+    <w:lsdException w:name="No List" w:semiHidden="1" w:unhideWhenUsed="1"/>
+    <w:lsdException w:name="Outline List 1" w:semiHidden="1" w:unhideWhenUsed="1"/>
+    <w:lsdException w:name="Outline List 2" w:semiHidden="1" w:unhideWhenUsed="1"/>
+    <w:lsdException w:name="Outline List 3" w:semiHidden="1" w:unhideWhenUsed="1"/>
+    <w:lsdException w:name="Table Simple 1" w:semiHidden="1" w:unhideWhenUsed="1"/>
+    <w:lsdException w:name="Table Simple 2" w:semiHidden="1" w:unhideWhenUsed="1"/>
+    <w:lsdException w:name="Table Simple 3" w:semiHidden="1" w:unhideWhenUsed="1"/>
+    <w:lsdException w:name="Table Classic 1" w:semiHidden="1" w:unhideWhenUsed="1"/>
+    <w:lsdException w:name="Table Classic 2" w:semiHidden="1" w:unhideWhenUsed="1"/>
+    <w:lsdException w:name="Table Classic 3" w:semiHidden="1" w:unhideWhenUsed="1"/>
+    <w:lsdException w:name="Table Classic 4" w:semiHidden="1" w:unhideWhenUsed="1"/>
+    <w:lsdException w:name="Table Colorful 1" w:semiHidden="1" w:unhideWhenUsed="1"/>
+    <w:lsdException w:name="Table Colorful 2" w:semiHidden="1" w:unhideWhenUsed="1"/>
+    <w:lsdException w:name="Table Colorful 3" w:semiHidden="1" w:unhideWhenUsed="1"/>
+    <w:lsdException w:name="Table Columns 1" w:semiHidden="1" w:unhideWhenUsed="1"/>
+    <w:lsdException w:name="Table Columns 2" w:semiHidden="1" w:unhideWhenUsed="1"/>
+    <w:lsdException w:name="Table Columns 3" w:semiHidden="1" w:unhideWhenUsed="1"/>
+    <w:lsdException w:name="Table Columns 4" w:semiHidden="1" w:unhideWhenUsed="1"/>
+    <w:lsdException w:name="Table Columns 5" w:semiHidden="1" w:unhideWhenUsed="1"/>
+    <w:lsdException w:name="Table Grid 1" w:semiHidden="1" w:unhideWhenUsed="1"/>
+    <w:lsdException w:name="Table Grid 2" w:semiHidden="1" w:unhideWhenUsed="1"/>
+    <w:lsdException w:name="Table Grid 3" w:semiHidden="1" w:unhideWhenUsed="1"/>
+    <w:lsdException w:name="Table Grid 4" w:semiHidden="1" w:unhideWhenUsed="1"/>
+    <w:lsdException w:name="Table Grid 5" w:semiHidden="1" w:unhideWhenUsed="1"/>
+    <w:lsdException w:name="Table Grid 6" w:semiHidden="1" w:unhideWhenUsed="1"/>
+    <w:lsdException w:name="Table Grid 7" w:semiHidden="1" w:unhideWhenUsed="1"/>
+    <w:lsdException w:name="Table Grid 8" w:semiHidden="1" w:unhideWhenUsed="1"/>
+    <w:lsdException w:name="Table List 1" w:semiHidden="1" w:unhideWhenUsed="1"/>
+    <w:lsdException w:name="Table List 2" w:semiHidden="1" w:unhideWhenUsed="1"/>
+    <w:lsdException w:name="Table List 3" w:semiHidden="1" w:unhideWhenUsed="1"/>
+    <w:lsdException w:name="Table List 4" w:semiHidden="1" w:unhideWhenUsed="1"/>
+    <w:lsdException w:name="Table List 5" w:semiHidden="1" w:unhideWhenUsed="1"/>
+    <w:lsdException w:name="Table List 6" w:semiHidden="1" w:unhideWhenUsed="1"/>
+    <w:lsdException w:name="Table List 7" w:semiHidden="1" w:unhideWhenUsed="1"/>
+    <w:lsdException w:name="Table List 8" w:semiHidden="1" w:unhideWhenUsed="1"/>
+    <w:lsdException w:name="Table 3D effects 1" w:semiHidden="1" w:unhideWhenUsed="1"/>
+    <w:lsdException w:name="Table 3D effects 2" w:semiHidden="1" w:unhideWhenUsed="1"/>
+    <w:lsdException w:name="Table 3D effects 3" w:semiHidden="1" w:unhideWhenUsed="1"/>
+    <w:lsdException w:name="Table Contemporary" w:semiHidden="1" w:unhideWhenUsed="1"/>
+    <w:lsdException w:name="Table Elegant" w:semiHidden="1" w:unhideWhenUsed="1"/>
+    <w:lsdException w:name="Table Professional" w:semiHidden="1" w:unhideWhenUsed="1"/>
+    <w:lsdException w:name="Table Subtle 1" w:semiHidden="1" w:unhideWhenUsed="1"/>
+    <w:lsdException w:name="Table Subtle 2" w:semiHidden="1" w:unhideWhenUsed="1"/>
+    <w:lsdException w:name="Table Web 1" w:semiHidden="1" w:unhideWhenUsed="1"/>
+    <w:lsdException w:name="Table Web 2" w:semiHidden="1" w:unhideWhenUsed="1"/>
+    <w:lsdException w:name="Table Web 3" w:semiHidden="1" w:unhideWhenUsed="1"/>
+    <w:lsdException w:name="Balloon Text" w:semiHidden="1" w:unhideWhenUsed="1"/>
+    <w:lsdException w:name="Table Grid" w:uiPriority="59"/>
+    <w:lsdException w:name="Table Theme" w:semiHidden="1" w:unhideWhenUsed="1"/>
+    <w:lsdException w:name="Placeholder Text" w:semiHidden="1"/>
+    <w:lsdException w:name="No Spacing" w:qFormat="1"/>
+    <w:lsdException w:name="Light Shading"/>
+    <w:lsdException w:name="Light List"/>
+    <w:lsdException w:name="Light Grid"/>
+    <w:lsdException w:name="Medium Shading 1"/>
+    <w:lsdException w:name="Medium Shading 2"/>
+    <w:lsdException w:name="Medium List 1"/>
+    <w:lsdException w:name="Medium List 2"/>
+    <w:lsdException w:name="Medium Grid 1"/>
+    <w:lsdException w:name="Medium Grid 2" w:qFormat="1"/>
+    <w:lsdException w:name="Medium Grid 3"/>
+    <w:lsdException w:name="Dark List"/>
+    <w:lsdException w:name="Colorful Shading"/>
+    <w:lsdException w:name="Colorful List"/>
+    <w:lsdException w:name="Colorful Grid"/>
+    <w:lsdException w:name="Light Shading Accent 1"/>
+    <w:lsdException w:name="Light List Accent 1"/>
+    <w:lsdException w:name="Light Grid Accent 1"/>
+    <w:lsdException w:name="Medium Shading 1 Accent 1" w:uiPriority="1" w:qFormat="1"/>
+    <w:lsdException w:name="Medium Shading 2 Accent 1" w:uiPriority="60"/>
+    <w:lsdException w:name="Medium List 1 Accent 1" w:uiPriority="61"/>
+    <w:lsdException w:name="Revision" w:semiHidden="1" w:uiPriority="62"/>
+    <w:lsdException w:name="List Paragraph" w:uiPriority="63" w:qFormat="1"/>
+    <w:lsdException w:name="Quote" w:uiPriority="64" w:qFormat="1"/>
+    <w:lsdException w:name="Intense Quote" w:uiPriority="65" w:qFormat="1"/>
+    <w:lsdException w:name="Medium List 2 Accent 1" w:uiPriority="66"/>
+    <w:lsdException w:name="Medium Grid 1 Accent 1" w:uiPriority="67"/>
+    <w:lsdException w:name="Medium Grid 2 Accent 1" w:uiPriority="68"/>
+    <w:lsdException w:name="Medium Grid 3 Accent 1" w:uiPriority="69"/>
+    <w:lsdException w:name="Dark List Accent 1" w:uiPriority="70"/>
+    <w:lsdException w:name="Colorful Shading Accent 1" w:uiPriority="71"/>
+    <w:lsdException w:name="Colorful List Accent 1" w:uiPriority="72" w:qFormat="1"/>
+    <w:lsdException w:name="Colorful Grid Accent 1" w:uiPriority="73" w:qFormat="1"/>
+    <w:lsdException w:name="Light Shading Accent 2" w:uiPriority="60" w:qFormat="1"/>
+    <w:lsdException w:name="Light List Accent 2" w:uiPriority="61"/>
+    <w:lsdException w:name="Light Grid Accent 2" w:uiPriority="62"/>
+    <w:lsdException w:name="Medium Shading 1 Accent 2" w:uiPriority="63"/>
+    <w:lsdException w:name="Medium Shading 2 Accent 2" w:uiPriority="64"/>
+    <w:lsdException w:name="Medium List 1 Accent 2" w:uiPriority="65"/>
+    <w:lsdException w:name="Medium List 2 Accent 2"/>
+    <w:lsdException w:name="Medium Grid 1 Accent 2" w:uiPriority="34" w:qFormat="1"/>
+    <w:lsdException w:name="Medium Grid 2 Accent 2" w:uiPriority="29" w:qFormat="1"/>
+    <w:lsdException w:name="Medium Grid 3 Accent 2" w:uiPriority="30" w:qFormat="1"/>
+    <w:lsdException w:name="Dark List Accent 2" w:uiPriority="66"/>
+    <w:lsdException w:name="Colorful Shading Accent 2" w:uiPriority="67"/>
+    <w:lsdException w:name="Colorful List Accent 2" w:uiPriority="68"/>
+    <w:lsdException w:name="Colorful Grid Accent 2" w:uiPriority="69"/>
+    <w:lsdException w:name="Light Shading Accent 3" w:uiPriority="70"/>
+    <w:lsdException w:name="Light List Accent 3" w:uiPriority="71"/>
+    <w:lsdException w:name="Light Grid Accent 3" w:uiPriority="72"/>
+    <w:lsdException w:name="Medium Shading 1 Accent 3" w:uiPriority="73"/>
+    <w:lsdException w:name="Medium Shading 2 Accent 3" w:uiPriority="60"/>
+    <w:lsdException w:name="Medium List 1 Accent 3" w:uiPriority="61"/>
+    <w:lsdException w:name="Medium List 2 Accent 3" w:uiPriority="62"/>
+    <w:lsdException w:name="Medium Grid 1 Accent 3" w:uiPriority="63"/>
+    <w:lsdException w:name="Medium Grid 2 Accent 3" w:uiPriority="64"/>
+    <w:lsdException w:name="Medium Grid 3 Accent 3" w:uiPriority="65"/>
+    <w:lsdException w:name="Dark List Accent 3" w:uiPriority="66"/>
+    <w:lsdException w:name="Colorful Shading Accent 3" w:uiPriority="67"/>
+    <w:lsdException w:name="Colorful List Accent 3" w:uiPriority="68"/>
+    <w:lsdException w:name="Colorful Grid Accent 3" w:uiPriority="69"/>
+    <w:lsdException w:name="Light Shading Accent 4" w:uiPriority="70"/>
+    <w:lsdException w:name="Light List Accent 4" w:uiPriority="71"/>
+    <w:lsdException w:name="Light Grid Accent 4" w:uiPriority="72"/>
+    <w:lsdException w:name="Medium Shading 1 Accent 4" w:uiPriority="73"/>
+    <w:lsdException w:name="Medium Shading 2 Accent 4" w:uiPriority="60"/>
+    <w:lsdException w:name="Medium List 1 Accent 4" w:uiPriority="61"/>
+    <w:lsdException w:name="Medium List 2 Accent 4" w:uiPriority="62"/>
+    <w:lsdException w:name="Medium Grid 1 Accent 4" w:uiPriority="63"/>
+    <w:lsdException w:name="Medium Grid 2 Accent 4" w:uiPriority="64"/>
+    <w:lsdException w:name="Medium Grid 3 Accent 4" w:uiPriority="65"/>
+    <w:lsdException w:name="Dark List Accent 4" w:uiPriority="66"/>
+    <w:lsdException w:name="Colorful Shading Accent 4" w:uiPriority="67"/>
+    <w:lsdException w:name="Colorful List Accent 4" w:uiPriority="68"/>
+    <w:lsdException w:name="Colorful Grid Accent 4" w:uiPriority="69"/>
+    <w:lsdException w:name="Light Shading Accent 5" w:uiPriority="70"/>
+    <w:lsdException w:name="Light List Accent 5" w:uiPriority="71"/>
+    <w:lsdException w:name="Light Grid Accent 5" w:uiPriority="72"/>
+    <w:lsdException w:name="Medium Shading 1 Accent 5" w:uiPriority="73"/>
+    <w:lsdException w:name="Medium Shading 2 Accent 5" w:uiPriority="60"/>
+    <w:lsdException w:name="Medium List 1 Accent 5" w:uiPriority="61"/>
+    <w:lsdException w:name="Medium List 2 Accent 5" w:uiPriority="62"/>
+    <w:lsdException w:name="Medium Grid 1 Accent 5" w:uiPriority="63"/>
+    <w:lsdException w:name="Medium Grid 2 Accent 5" w:uiPriority="64"/>
+    <w:lsdException w:name="Medium Grid 3 Accent 5" w:uiPriority="65"/>
+    <w:lsdException w:name="Dark List Accent 5" w:uiPriority="66"/>
+    <w:lsdException w:name="Colorful Shading Accent 5" w:uiPriority="67"/>
+    <w:lsdException w:name="Colorful List Accent 5" w:uiPriority="68"/>
+    <w:lsdException w:name="Colorful Grid Accent 5" w:uiPriority="69"/>
+    <w:lsdException w:name="Light Shading Accent 6" w:uiPriority="70"/>
+    <w:lsdException w:name="Light List Accent 6" w:uiPriority="71"/>
+    <w:lsdException w:name="Light Grid Accent 6" w:uiPriority="72"/>
+    <w:lsdException w:name="Medium Shading 1 Accent 6" w:uiPriority="73"/>
+    <w:lsdException w:name="Medium Shading 2 Accent 6" w:uiPriority="60"/>
+    <w:lsdException w:name="Medium List 1 Accent 6" w:uiPriority="61"/>
+    <w:lsdException w:name="Medium List 2 Accent 6" w:uiPriority="62"/>
+    <w:lsdException w:name="Medium Grid 1 Accent 6" w:uiPriority="63"/>
+    <w:lsdException w:name="Medium Grid 2 Accent 6" w:uiPriority="64"/>
+    <w:lsdException w:name="Medium Grid 3 Accent 6" w:uiPriority="65"/>
+    <w:lsdException w:name="Dark List Accent 6" w:uiPriority="66"/>
+    <w:lsdException w:name="Colorful Shading Accent 6" w:uiPriority="67"/>
+    <w:lsdException w:name="Colorful List Accent 6" w:uiPriority="68"/>
+    <w:lsdException w:name="Colorful Grid Accent 6" w:uiPriority="69"/>
+    <w:lsdException w:name="Subtle Emphasis" w:uiPriority="70" w:qFormat="1"/>
+    <w:lsdException w:name="Intense Emphasis" w:uiPriority="71" w:qFormat="1"/>
+    <w:lsdException w:name="Subtle Reference" w:uiPriority="72"/>
+    <w:lsdException w:name="Intense Reference" w:uiPriority="73" w:qFormat="1"/>
+    <w:lsdException w:name="Book Title" w:uiPriority="60" w:qFormat="1"/>
+    <w:lsdException w:name="Bibliography" w:semiHidden="1" w:uiPriority="61" w:unhideWhenUsed="1"/>
+    <w:lsdException w:name="TOC Heading" w:semiHidden="1" w:uiPriority="62" w:unhideWhenUsed="1" w:qFormat="1"/>
+    <w:lsdException w:name="Grid Table Light" w:semiHidden="1" w:unhideWhenUsed="1"/>
+    <w:lsdException w:name="Grid Table 1 Light" w:semiHidden="1" w:unhideWhenUsed="1"/>
+    <w:lsdException w:name="Grid Table 2" w:semiHidden="1" w:unhideWhenUsed="1"/>
+    <w:lsdException w:name="Grid Table 3" w:semiHidden="1" w:unhideWhenUsed="1"/>
+    <w:lsdException w:name="Grid Table 4" w:uiPriority="49"/>
+    <w:lsdException w:name="Grid Table 5 Dark" w:uiPriority="50"/>
+    <w:lsdException w:name="Grid Table 6 Colorful" w:uiPriority="51"/>
+    <w:lsdException w:name="Grid Table 7 Colorful" w:uiPriority="52"/>
+    <w:lsdException w:name="Grid Table 1 Light Accent 1" w:uiPriority="46"/>
+    <w:lsdException w:name="Grid Table 2 Accent 1" w:uiPriority="47"/>
+    <w:lsdException w:name="Grid Table 3 Accent 1" w:uiPriority="48"/>
+    <w:lsdException w:name="Grid Table 4 Accent 1" w:uiPriority="49"/>
+    <w:lsdException w:name="Grid Table 5 Dark Accent 1" w:uiPriority="50"/>
+    <w:lsdException w:name="Grid Table 6 Colorful Accent 1" w:uiPriority="51"/>
+    <w:lsdException w:name="Grid Table 7 Colorful Accent 1" w:uiPriority="52"/>
+    <w:lsdException w:name="Grid Table 1 Light Accent 2" w:uiPriority="46"/>
+    <w:lsdException w:name="Grid Table 2 Accent 2" w:uiPriority="47"/>
+    <w:lsdException w:name="Grid Table 3 Accent 2" w:uiPriority="48"/>
+    <w:lsdException w:name="Grid Table 4 Accent 2" w:uiPriority="49"/>
+    <w:lsdException w:name="Grid Table 5 Dark Accent 2" w:uiPriority="50"/>
+    <w:lsdException w:name="Grid Table 6 Colorful Accent 2" w:uiPriority="51"/>
+    <w:lsdException w:name="Grid Table 7 Colorful Accent 2" w:uiPriority="52"/>
+    <w:lsdException w:name="Grid Table 1 Light Accent 3" w:uiPriority="46"/>
+    <w:lsdException w:name="Grid Table 2 Accent 3" w:uiPriority="47"/>
+    <w:lsdException w:name="Grid Table 3 Accent 3" w:uiPriority="48"/>
+    <w:lsdException w:name="Grid Table 4 Accent 3" w:uiPriority="49"/>
+    <w:lsdException w:name="Grid Table 5 Dark Accent 3" w:uiPriority="50"/>
+    <w:lsdException w:name="Grid Table 6 Colorful Accent 3" w:uiPriority="51"/>
+    <w:lsdException w:name="Grid Table 7 Colorful Accent 3" w:uiPriority="52"/>
+    <w:lsdException w:name="Grid Table 1 Light Accent 4" w:uiPriority="46"/>
+    <w:lsdException w:name="Grid Table 2 Accent 4" w:uiPriority="47"/>
+    <w:lsdException w:name="Grid Table 3 Accent 4" w:uiPriority="48"/>
+    <w:lsdException w:name="Grid Table 4 Accent 4" w:uiPriority="49"/>
+    <w:lsdException w:name="Grid Table 5 Dark Accent 4" w:uiPriority="50"/>
+    <w:lsdException w:name="Grid Table 6 Colorful Accent 4" w:uiPriority="51"/>
+    <w:lsdException w:name="Grid Table 7 Colorful Accent 4" w:uiPriority="52"/>
+    <w:lsdException w:name="Grid Table 1 Light Accent 5" w:uiPriority="46"/>
+    <w:lsdException w:name="Grid Table 2 Accent 5" w:uiPriority="47"/>
+    <w:lsdException w:name="Grid Table 3 Accent 5" w:uiPriority="48"/>
+    <w:lsdException w:name="Grid Table 4 Accent 5" w:uiPriority="49"/>
+    <w:lsdException w:name="Grid Table 5 Dark Accent 5" w:uiPriority="50"/>
+    <w:lsdException w:name="Grid Table 6 Colorful Accent 5" w:uiPriority="51"/>
+    <w:lsdException w:name="Grid Table 7 Colorful Accent 5" w:uiPriority="52"/>
+    <w:lsdException w:name="Grid Table 1 Light Accent 6" w:uiPriority="46"/>
+    <w:lsdException w:name="Grid Table 2 Accent 6" w:uiPriority="47"/>
+    <w:lsdException w:name="Grid Table 3 Accent 6" w:uiPriority="48"/>
+    <w:lsdException w:name="Grid Table 4 Accent 6" w:uiPriority="49"/>
+    <w:lsdException w:name="Grid Table 5 Dark Accent 6" w:uiPriority="50"/>
+    <w:lsdException w:name="Grid Table 6 Colorful Accent 6" w:uiPriority="51"/>
+    <w:lsdException w:name="Grid Table 7 Colorful Accent 6" w:uiPriority="52"/>
+    <w:lsdException w:name="List Table 1 Light" w:uiPriority="46"/>
+    <w:lsdException w:name="List Table 2" w:uiPriority="47"/>
+    <w:lsdException w:name="List Table 3" w:uiPriority="48"/>
+    <w:lsdException w:name="List Table 4" w:uiPriority="49"/>
+    <w:lsdException w:name="List Table 5 Dark" w:uiPriority="50"/>
+    <w:lsdException w:name="List Table 6 Colorful" w:uiPriority="51"/>
+    <w:lsdException w:name="List Table 7 Colorful" w:uiPriority="52"/>
+    <w:lsdException w:name="List Table 1 Light Accent 1" w:uiPriority="46"/>
+    <w:lsdException w:name="List Table 2 Accent 1" w:uiPriority="47"/>
+    <w:lsdException w:name="List Table 3 Accent 1" w:uiPriority="48"/>
+    <w:lsdException w:name="List Table 4 Accent 1" w:uiPriority="49"/>
+    <w:lsdException w:name="List Table 5 Dark Accent 1" w:uiPriority="50"/>
+    <w:lsdException w:name="List Table 6 Colorful Accent 1" w:uiPriority="51"/>
+    <w:lsdException w:name="List Table 7 Colorful Accent 1" w:uiPriority="52"/>
+    <w:lsdException w:name="List Table 1 Light Accent 2" w:uiPriority="46"/>
+    <w:lsdException w:name="List Table 2 Accent 2" w:uiPriority="47"/>
+    <w:lsdException w:name="List Table 3 Accent 2" w:uiPriority="48"/>
+    <w:lsdException w:name="List Table 4 Accent 2" w:uiPriority="49"/>
+    <w:lsdException w:name="List Table 5 Dark Accent 2" w:uiPriority="50"/>
+    <w:lsdException w:name="List Table 6 Colorful Accent 2" w:uiPriority="51"/>
+    <w:lsdException w:name="List Table 7 Colorful Accent 2" w:uiPriority="52"/>
+    <w:lsdException w:name="List Table 1 Light Accent 3" w:uiPriority="46"/>
+    <w:lsdException w:name="List Table 2 Accent 3" w:uiPriority="47"/>
+    <w:lsdException w:name="List Table 3 Accent 3" w:uiPriority="48"/>
+    <w:lsdException w:name="List Table 4 Accent 3" w:uiPriority="49"/>
+    <w:lsdException w:name="List Table 5 Dark Accent 3" w:uiPriority="50"/>
+    <w:lsdException w:name="List Table 6 Colorful Accent 3" w:uiPriority="51"/>
+    <w:lsdException w:name="List Table 7 Colorful Accent 3" w:uiPriority="52"/>
+    <w:lsdException w:name="List Table 1 Light Accent 4" w:uiPriority="46"/>
+    <w:lsdException w:name="List Table 2 Accent 4" w:uiPriority="47"/>
+    <w:lsdException w:name="List Table 3 Accent 4" w:uiPriority="48"/>
+    <w:lsdException w:name="List Table 4 Accent 4" w:uiPriority="49"/>
+    <w:lsdException w:name="List Table 5 Dark Accent 4" w:uiPriority="50"/>
+    <w:lsdException w:name="List Table 6 Colorful Accent 4" w:uiPriority="51"/>
+    <w:lsdException w:name="List Table 7 Colorful Accent 4" w:uiPriority="52"/>
+    <w:lsdException w:name="List Table 1 Light Accent 5" w:uiPriority="46"/>
+    <w:lsdException w:name="List Table 2 Accent 5" w:uiPriority="47"/>
+    <w:lsdException w:name="List Table 3 Accent 5" w:uiPriority="48"/>
+    <w:lsdException w:name="List Table 4 Accent 5" w:uiPriority="49"/>
+    <w:lsdException w:name="List Table 5 Dark Accent 5" w:uiPriority="50"/>
+    <w:lsdException w:name="List Table 6 Colorful Accent 5" w:uiPriority="51"/>
+    <w:lsdException w:name="List Table 7 Colorful Accent 5" w:uiPriority="52"/>
+    <w:lsdException w:name="List Table 1 Light Accent 6" w:uiPriority="46"/>
+    <w:lsdException w:name="List Table 2 Accent 6" w:uiPriority="47"/>
+    <w:lsdException w:name="List Table 3 Accent 6" w:uiPriority="48"/>
+    <w:lsdException w:name="List Table 4 Accent 6" w:uiPriority="49"/>
+    <w:lsdException w:name="List Table 5 Dark Accent 6" w:uiPriority="50"/>
+    <w:lsdException w:name="List Table 6 Colorful Accent 6" w:uiPriority="51"/>
+    <w:lsdException w:name="List Table 7 Colorful Accent 6" w:uiPriority="52"/>
+    <w:lsdException w:name="Mention" w:semiHidden="1" w:unhideWhenUsed="1"/>
+    <w:lsdException w:name="Smart Hyperlink" w:semiHidden="1" w:unhideWhenUsed="1"/>
+    <w:lsdException w:name="Hashtag" w:semiHidden="1" w:unhideWhenUsed="1"/>
+    <w:lsdException w:name="Unresolved Mention" w:semiHidden="1" w:unhideWhenUsed="1"/>
   </w:latentStyles>
-  <w:style w:type="paragraph" w:default="1" w:styleId="Normaal">
+  <w:style w:type="paragraph" w:default="1" w:styleId="Normal">
     <w:name w:val="Normal"/>
     <w:qFormat/>
     <w:rsid w:val="0022134A"/>
@@ -15259,11 +15461,11 @@
       <w:lang w:val="el-GR" w:eastAsia="en-US"/>
     </w:rPr>
   </w:style>
-  <w:style w:type="paragraph" w:styleId="Kop1">
+  <w:style w:type="paragraph" w:styleId="Heading1">
     <w:name w:val="heading 1"/>
-    <w:basedOn w:val="Normaal"/>
-    <w:next w:val="Normaal"/>
-    <w:link w:val="Kop1Teken"/>
+    <w:basedOn w:val="Normal"/>
+    <w:next w:val="Normal"/>
+    <w:link w:val="Heading1Char"/>
     <w:uiPriority w:val="9"/>
     <w:qFormat/>
     <w:rsid w:val="00887BC0"/>
@@ -15283,11 +15485,11 @@
       <w:szCs w:val="28"/>
     </w:rPr>
   </w:style>
-  <w:style w:type="paragraph" w:styleId="Kop2">
+  <w:style w:type="paragraph" w:styleId="Heading2">
     <w:name w:val="heading 2"/>
-    <w:basedOn w:val="Normaal"/>
-    <w:next w:val="Normaal"/>
-    <w:link w:val="Kop2Teken"/>
+    <w:basedOn w:val="Normal"/>
+    <w:next w:val="Normal"/>
+    <w:link w:val="Heading2Char"/>
     <w:uiPriority w:val="9"/>
     <w:unhideWhenUsed/>
     <w:qFormat/>
@@ -15307,12 +15509,12 @@
       <w:szCs w:val="26"/>
     </w:rPr>
   </w:style>
-  <w:style w:type="paragraph" w:styleId="Kop3">
+  <w:style w:type="paragraph" w:styleId="Heading3">
     <w:name w:val="heading 3"/>
     <w:aliases w:val="Exercise name"/>
-    <w:basedOn w:val="Normaal"/>
-    <w:next w:val="Normaal"/>
-    <w:link w:val="Kop3Teken"/>
+    <w:basedOn w:val="Normal"/>
+    <w:next w:val="Normal"/>
+    <w:link w:val="Heading3Char"/>
     <w:uiPriority w:val="9"/>
     <w:unhideWhenUsed/>
     <w:qFormat/>
@@ -15331,12 +15533,12 @@
       <w:sz w:val="24"/>
     </w:rPr>
   </w:style>
-  <w:style w:type="paragraph" w:styleId="Kop4">
+  <w:style w:type="paragraph" w:styleId="Heading4">
     <w:name w:val="heading 4"/>
     <w:aliases w:val="Table caption"/>
-    <w:basedOn w:val="Normaal"/>
-    <w:next w:val="Normaal"/>
-    <w:link w:val="Kop4Teken"/>
+    <w:basedOn w:val="Normal"/>
+    <w:next w:val="Normal"/>
+    <w:link w:val="Heading4Char"/>
     <w:uiPriority w:val="9"/>
     <w:unhideWhenUsed/>
     <w:qFormat/>
@@ -15354,13 +15556,13 @@
       <w:color w:val="009999" w:themeColor="accent1"/>
     </w:rPr>
   </w:style>
-  <w:style w:type="character" w:default="1" w:styleId="Standaardalinea-lettertype">
+  <w:style w:type="character" w:default="1" w:styleId="DefaultParagraphFont">
     <w:name w:val="Default Paragraph Font"/>
     <w:uiPriority w:val="1"/>
     <w:semiHidden/>
     <w:unhideWhenUsed/>
   </w:style>
-  <w:style w:type="table" w:default="1" w:styleId="Standaardtabel">
+  <w:style w:type="table" w:default="1" w:styleId="TableNormal">
     <w:name w:val="Normal Table"/>
     <w:uiPriority w:val="99"/>
     <w:semiHidden/>
@@ -15375,7 +15577,7 @@
       </w:tblCellMar>
     </w:tblPr>
   </w:style>
-  <w:style w:type="numbering" w:default="1" w:styleId="Geenlijst">
+  <w:style w:type="numbering" w:default="1" w:styleId="NoList">
     <w:name w:val="No List"/>
     <w:uiPriority w:val="99"/>
     <w:semiHidden/>
@@ -15383,7 +15585,7 @@
   </w:style>
   <w:style w:type="paragraph" w:customStyle="1" w:styleId="MediumGrid1-Accent21">
     <w:name w:val="Medium Grid 1 - Accent 21"/>
-    <w:basedOn w:val="Normaal"/>
+    <w:basedOn w:val="Normal"/>
     <w:uiPriority w:val="34"/>
     <w:qFormat/>
     <w:rsid w:val="003468F2"/>
@@ -15395,16 +15597,15 @@
       <w:rFonts w:ascii="Verdana" w:hAnsi="Verdana"/>
     </w:rPr>
   </w:style>
-  <w:style w:type="table" w:styleId="Tabelraster">
+  <w:style w:type="table" w:styleId="TableGrid">
     <w:name w:val="Table Grid"/>
-    <w:basedOn w:val="Standaardtabel"/>
+    <w:basedOn w:val="TableNormal"/>
     <w:uiPriority w:val="59"/>
     <w:rsid w:val="0022134A"/>
     <w:rPr>
       <w:lang w:val="el-GR"/>
     </w:rPr>
     <w:tblPr>
-      <w:tblInd w:w="0" w:type="dxa"/>
       <w:tblBorders>
         <w:top w:val="single" w:sz="4" w:space="0" w:color="auto"/>
         <w:left w:val="single" w:sz="4" w:space="0" w:color="auto"/>
@@ -15413,18 +15614,12 @@
         <w:insideH w:val="single" w:sz="4" w:space="0" w:color="auto"/>
         <w:insideV w:val="single" w:sz="4" w:space="0" w:color="auto"/>
       </w:tblBorders>
-      <w:tblCellMar>
-        <w:top w:w="0" w:type="dxa"/>
-        <w:left w:w="108" w:type="dxa"/>
-        <w:bottom w:w="0" w:type="dxa"/>
-        <w:right w:w="108" w:type="dxa"/>
-      </w:tblCellMar>
     </w:tblPr>
   </w:style>
   <w:style w:type="paragraph" w:customStyle="1" w:styleId="FirstParagraph">
     <w:name w:val="First Paragraph"/>
-    <w:basedOn w:val="Plattetekst"/>
-    <w:next w:val="Plattetekst"/>
+    <w:basedOn w:val="BodyText"/>
+    <w:next w:val="BodyText"/>
     <w:qFormat/>
     <w:rsid w:val="0022134A"/>
     <w:pPr>
@@ -15436,10 +15631,10 @@
       <w:lang w:val="en-US"/>
     </w:rPr>
   </w:style>
-  <w:style w:type="paragraph" w:styleId="Plattetekst">
+  <w:style w:type="paragraph" w:styleId="BodyText">
     <w:name w:val="Body Text"/>
-    <w:basedOn w:val="Normaal"/>
-    <w:link w:val="PlattetekstTeken"/>
+    <w:basedOn w:val="Normal"/>
+    <w:link w:val="BodyTextChar"/>
     <w:uiPriority w:val="99"/>
     <w:semiHidden/>
     <w:unhideWhenUsed/>
@@ -15448,9 +15643,9 @@
       <w:spacing w:after="120"/>
     </w:pPr>
   </w:style>
-  <w:style w:type="character" w:customStyle="1" w:styleId="PlattetekstTeken">
-    <w:name w:val="Platte tekst Teken"/>
-    <w:link w:val="Plattetekst"/>
+  <w:style w:type="character" w:customStyle="1" w:styleId="BodyTextChar">
+    <w:name w:val="Body Text Char"/>
+    <w:link w:val="BodyText"/>
     <w:uiPriority w:val="99"/>
     <w:semiHidden/>
     <w:rsid w:val="0022134A"/>
@@ -15458,10 +15653,10 @@
       <w:lang w:val="el-GR"/>
     </w:rPr>
   </w:style>
-  <w:style w:type="paragraph" w:styleId="Ballontekst">
+  <w:style w:type="paragraph" w:styleId="BalloonText">
     <w:name w:val="Balloon Text"/>
-    <w:basedOn w:val="Normaal"/>
-    <w:link w:val="BallontekstTeken"/>
+    <w:basedOn w:val="Normal"/>
+    <w:link w:val="BalloonTextChar"/>
     <w:uiPriority w:val="99"/>
     <w:semiHidden/>
     <w:unhideWhenUsed/>
@@ -15475,9 +15670,9 @@
       <w:szCs w:val="16"/>
     </w:rPr>
   </w:style>
-  <w:style w:type="character" w:customStyle="1" w:styleId="BallontekstTeken">
-    <w:name w:val="Ballontekst Teken"/>
-    <w:link w:val="Ballontekst"/>
+  <w:style w:type="character" w:customStyle="1" w:styleId="BalloonTextChar">
+    <w:name w:val="Balloon Text Char"/>
+    <w:link w:val="BalloonText"/>
     <w:uiPriority w:val="99"/>
     <w:semiHidden/>
     <w:rsid w:val="000D0C57"/>
@@ -15488,7 +15683,7 @@
       <w:lang w:val="el-GR"/>
     </w:rPr>
   </w:style>
-  <w:style w:type="character" w:styleId="Verwijzingopmerking">
+  <w:style w:type="character" w:styleId="CommentReference">
     <w:name w:val="annotation reference"/>
     <w:uiPriority w:val="99"/>
     <w:semiHidden/>
@@ -15499,10 +15694,10 @@
       <w:szCs w:val="16"/>
     </w:rPr>
   </w:style>
-  <w:style w:type="paragraph" w:styleId="Tekstopmerking">
+  <w:style w:type="paragraph" w:styleId="CommentText">
     <w:name w:val="annotation text"/>
-    <w:basedOn w:val="Normaal"/>
-    <w:link w:val="TekstopmerkingTeken"/>
+    <w:basedOn w:val="Normal"/>
+    <w:link w:val="CommentTextChar"/>
     <w:uiPriority w:val="99"/>
     <w:semiHidden/>
     <w:unhideWhenUsed/>
@@ -15515,9 +15710,9 @@
       <w:szCs w:val="20"/>
     </w:rPr>
   </w:style>
-  <w:style w:type="character" w:customStyle="1" w:styleId="TekstopmerkingTeken">
-    <w:name w:val="Tekst opmerking Teken"/>
-    <w:link w:val="Tekstopmerking"/>
+  <w:style w:type="character" w:customStyle="1" w:styleId="CommentTextChar">
+    <w:name w:val="Comment Text Char"/>
+    <w:link w:val="CommentText"/>
     <w:uiPriority w:val="99"/>
     <w:semiHidden/>
     <w:rsid w:val="00660C85"/>
@@ -15527,11 +15722,11 @@
       <w:lang w:val="el-GR"/>
     </w:rPr>
   </w:style>
-  <w:style w:type="paragraph" w:styleId="Onderwerpvanopmerking">
+  <w:style w:type="paragraph" w:styleId="CommentSubject">
     <w:name w:val="annotation subject"/>
-    <w:basedOn w:val="Tekstopmerking"/>
-    <w:next w:val="Tekstopmerking"/>
-    <w:link w:val="OnderwerpvanopmerkingTeken"/>
+    <w:basedOn w:val="CommentText"/>
+    <w:next w:val="CommentText"/>
+    <w:link w:val="CommentSubjectChar"/>
     <w:uiPriority w:val="99"/>
     <w:semiHidden/>
     <w:unhideWhenUsed/>
@@ -15541,9 +15736,9 @@
       <w:bCs/>
     </w:rPr>
   </w:style>
-  <w:style w:type="character" w:customStyle="1" w:styleId="OnderwerpvanopmerkingTeken">
-    <w:name w:val="Onderwerp van opmerking Teken"/>
-    <w:link w:val="Onderwerpvanopmerking"/>
+  <w:style w:type="character" w:customStyle="1" w:styleId="CommentSubjectChar">
+    <w:name w:val="Comment Subject Char"/>
+    <w:link w:val="CommentSubject"/>
     <w:uiPriority w:val="99"/>
     <w:semiHidden/>
     <w:rsid w:val="00660C85"/>
@@ -15555,10 +15750,10 @@
       <w:lang w:val="el-GR"/>
     </w:rPr>
   </w:style>
-  <w:style w:type="paragraph" w:styleId="Koptekst">
+  <w:style w:type="paragraph" w:styleId="Header">
     <w:name w:val="header"/>
-    <w:basedOn w:val="Normaal"/>
-    <w:link w:val="KoptekstTeken"/>
+    <w:basedOn w:val="Normal"/>
+    <w:link w:val="HeaderChar"/>
     <w:uiPriority w:val="99"/>
     <w:unhideWhenUsed/>
     <w:rsid w:val="006146D5"/>
@@ -15570,19 +15765,19 @@
       <w:spacing w:after="0" w:line="240" w:lineRule="auto"/>
     </w:pPr>
   </w:style>
-  <w:style w:type="character" w:customStyle="1" w:styleId="KoptekstTeken">
-    <w:name w:val="Koptekst Teken"/>
-    <w:link w:val="Koptekst"/>
+  <w:style w:type="character" w:customStyle="1" w:styleId="HeaderChar">
+    <w:name w:val="Header Char"/>
+    <w:link w:val="Header"/>
     <w:uiPriority w:val="99"/>
     <w:rsid w:val="006146D5"/>
     <w:rPr>
       <w:lang w:val="el-GR"/>
     </w:rPr>
   </w:style>
-  <w:style w:type="paragraph" w:styleId="Voettekst">
+  <w:style w:type="paragraph" w:styleId="Footer">
     <w:name w:val="footer"/>
-    <w:basedOn w:val="Normaal"/>
-    <w:link w:val="VoettekstTeken"/>
+    <w:basedOn w:val="Normal"/>
+    <w:link w:val="FooterChar"/>
     <w:uiPriority w:val="99"/>
     <w:unhideWhenUsed/>
     <w:qFormat/>
@@ -15600,9 +15795,9 @@
       <w:sz w:val="20"/>
     </w:rPr>
   </w:style>
-  <w:style w:type="character" w:customStyle="1" w:styleId="VoettekstTeken">
-    <w:name w:val="Voettekst Teken"/>
-    <w:link w:val="Voettekst"/>
+  <w:style w:type="character" w:customStyle="1" w:styleId="FooterChar">
+    <w:name w:val="Footer Char"/>
+    <w:link w:val="Footer"/>
     <w:uiPriority w:val="99"/>
     <w:rsid w:val="003468F2"/>
     <w:rPr>
@@ -15612,9 +15807,9 @@
       <w:lang w:val="el-GR" w:eastAsia="en-US"/>
     </w:rPr>
   </w:style>
-  <w:style w:type="paragraph" w:styleId="Normaalweb">
+  <w:style w:type="paragraph" w:styleId="NormalWeb">
     <w:name w:val="Normal (Web)"/>
-    <w:basedOn w:val="Normaal"/>
+    <w:basedOn w:val="Normal"/>
     <w:uiPriority w:val="99"/>
     <w:unhideWhenUsed/>
     <w:rsid w:val="006146D5"/>
@@ -15666,11 +15861,11 @@
       <w:u w:val="single"/>
     </w:rPr>
   </w:style>
-  <w:style w:type="paragraph" w:styleId="Subtitel">
+  <w:style w:type="paragraph" w:styleId="Subtitle">
     <w:name w:val="Subtitle"/>
-    <w:basedOn w:val="Normaal"/>
-    <w:next w:val="Normaal"/>
-    <w:link w:val="SubtitelTeken"/>
+    <w:basedOn w:val="Normal"/>
+    <w:next w:val="Normal"/>
+    <w:link w:val="SubtitleChar"/>
     <w:uiPriority w:val="11"/>
     <w:qFormat/>
     <w:rsid w:val="003468F2"/>
@@ -15685,9 +15880,9 @@
       <w:szCs w:val="24"/>
     </w:rPr>
   </w:style>
-  <w:style w:type="character" w:customStyle="1" w:styleId="SubtitelTeken">
-    <w:name w:val="Subtitel Teken"/>
-    <w:link w:val="Subtitel"/>
+  <w:style w:type="character" w:customStyle="1" w:styleId="SubtitleChar">
+    <w:name w:val="Subtitle Char"/>
+    <w:link w:val="Subtitle"/>
     <w:uiPriority w:val="11"/>
     <w:rsid w:val="003468F2"/>
     <w:rPr>
@@ -15710,11 +15905,11 @@
       <w:color w:val="4F81BD"/>
     </w:rPr>
   </w:style>
-  <w:style w:type="paragraph" w:styleId="Titel">
+  <w:style w:type="paragraph" w:styleId="Title">
     <w:name w:val="Title"/>
-    <w:basedOn w:val="Normaal"/>
-    <w:next w:val="Normaal"/>
-    <w:link w:val="TitelTeken"/>
+    <w:basedOn w:val="Normal"/>
+    <w:next w:val="Normal"/>
+    <w:link w:val="TitleChar"/>
     <w:uiPriority w:val="10"/>
     <w:qFormat/>
     <w:rsid w:val="00887BC0"/>
@@ -15732,9 +15927,9 @@
       <w:szCs w:val="32"/>
     </w:rPr>
   </w:style>
-  <w:style w:type="character" w:customStyle="1" w:styleId="TitelTeken">
-    <w:name w:val="Titel Teken"/>
-    <w:link w:val="Titel"/>
+  <w:style w:type="character" w:customStyle="1" w:styleId="TitleChar">
+    <w:name w:val="Title Char"/>
+    <w:link w:val="Title"/>
     <w:uiPriority w:val="10"/>
     <w:rsid w:val="00887BC0"/>
     <w:rPr>
@@ -15747,10 +15942,10 @@
       <w:lang w:val="el-GR" w:eastAsia="en-US"/>
     </w:rPr>
   </w:style>
-  <w:style w:type="character" w:customStyle="1" w:styleId="Kop2Teken">
-    <w:name w:val="Kop 2 Teken"/>
-    <w:basedOn w:val="Standaardalinea-lettertype"/>
-    <w:link w:val="Kop2"/>
+  <w:style w:type="character" w:customStyle="1" w:styleId="Heading2Char">
+    <w:name w:val="Heading 2 Char"/>
+    <w:basedOn w:val="DefaultParagraphFont"/>
+    <w:link w:val="Heading2"/>
     <w:uiPriority w:val="9"/>
     <w:rsid w:val="003468F2"/>
     <w:rPr>
@@ -15763,11 +15958,11 @@
       <w:lang w:val="el-GR" w:eastAsia="en-US"/>
     </w:rPr>
   </w:style>
-  <w:style w:type="paragraph" w:styleId="Citaat">
+  <w:style w:type="paragraph" w:styleId="Quote">
     <w:name w:val="Quote"/>
-    <w:basedOn w:val="Normaal"/>
-    <w:next w:val="Normaal"/>
-    <w:link w:val="CitaatTeken"/>
+    <w:basedOn w:val="Normal"/>
+    <w:next w:val="Normal"/>
+    <w:link w:val="QuoteChar"/>
     <w:uiPriority w:val="64"/>
     <w:qFormat/>
     <w:rsid w:val="003468F2"/>
@@ -15778,10 +15973,10 @@
       <w:color w:val="004D99"/>
     </w:rPr>
   </w:style>
-  <w:style w:type="character" w:customStyle="1" w:styleId="CitaatTeken">
-    <w:name w:val="Citaat Teken"/>
-    <w:basedOn w:val="Standaardalinea-lettertype"/>
-    <w:link w:val="Citaat"/>
+  <w:style w:type="character" w:customStyle="1" w:styleId="QuoteChar">
+    <w:name w:val="Quote Char"/>
+    <w:basedOn w:val="DefaultParagraphFont"/>
+    <w:link w:val="Quote"/>
     <w:uiPriority w:val="64"/>
     <w:rsid w:val="003468F2"/>
     <w:rPr>
@@ -15794,11 +15989,11 @@
       <w:lang w:val="el-GR" w:eastAsia="en-US"/>
     </w:rPr>
   </w:style>
-  <w:style w:type="paragraph" w:styleId="Duidelijkcitaat">
+  <w:style w:type="paragraph" w:styleId="IntenseQuote">
     <w:name w:val="Intense Quote"/>
-    <w:basedOn w:val="Normaal"/>
-    <w:next w:val="Normaal"/>
-    <w:link w:val="DuidelijkcitaatTeken"/>
+    <w:basedOn w:val="Normal"/>
+    <w:next w:val="Normal"/>
+    <w:link w:val="IntenseQuoteChar"/>
     <w:uiPriority w:val="65"/>
     <w:qFormat/>
     <w:rsid w:val="003468F2"/>
@@ -15818,10 +16013,10 @@
       <w:color w:val="004D99"/>
     </w:rPr>
   </w:style>
-  <w:style w:type="character" w:customStyle="1" w:styleId="DuidelijkcitaatTeken">
-    <w:name w:val="Duidelijk citaat Teken"/>
-    <w:basedOn w:val="Standaardalinea-lettertype"/>
-    <w:link w:val="Duidelijkcitaat"/>
+  <w:style w:type="character" w:customStyle="1" w:styleId="IntenseQuoteChar">
+    <w:name w:val="Intense Quote Char"/>
+    <w:basedOn w:val="DefaultParagraphFont"/>
+    <w:link w:val="IntenseQuote"/>
     <w:uiPriority w:val="65"/>
     <w:rsid w:val="003468F2"/>
     <w:rPr>
@@ -15836,9 +16031,9 @@
       <w:lang w:val="el-GR" w:eastAsia="en-US"/>
     </w:rPr>
   </w:style>
-  <w:style w:type="character" w:styleId="Nadruk">
+  <w:style w:type="character" w:styleId="Emphasis">
     <w:name w:val="Emphasis"/>
-    <w:basedOn w:val="Standaardalinea-lettertype"/>
+    <w:basedOn w:val="DefaultParagraphFont"/>
     <w:uiPriority w:val="20"/>
     <w:qFormat/>
     <w:rsid w:val="003468F2"/>
@@ -15848,19 +16043,19 @@
       <w:iCs/>
     </w:rPr>
   </w:style>
-  <w:style w:type="paragraph" w:styleId="Bibliografie">
+  <w:style w:type="paragraph" w:styleId="Bibliography">
     <w:name w:val="Bibliography"/>
-    <w:basedOn w:val="Normaal"/>
-    <w:next w:val="Normaal"/>
+    <w:basedOn w:val="Normal"/>
+    <w:next w:val="Normal"/>
     <w:uiPriority w:val="61"/>
     <w:rsid w:val="003468F2"/>
     <w:rPr>
       <w:rFonts w:ascii="Verdana" w:hAnsi="Verdana"/>
     </w:rPr>
   </w:style>
-  <w:style w:type="character" w:styleId="Zwaar">
+  <w:style w:type="character" w:styleId="Strong">
     <w:name w:val="Strong"/>
-    <w:basedOn w:val="Standaardalinea-lettertype"/>
+    <w:basedOn w:val="DefaultParagraphFont"/>
     <w:uiPriority w:val="22"/>
     <w:qFormat/>
     <w:rsid w:val="00887BC0"/>
@@ -15871,9 +16066,9 @@
       <w:color w:val="004D99"/>
     </w:rPr>
   </w:style>
-  <w:style w:type="character" w:styleId="Intensieveverwijzing">
+  <w:style w:type="character" w:styleId="IntenseReference">
     <w:name w:val="Intense Reference"/>
-    <w:basedOn w:val="Standaardalinea-lettertype"/>
+    <w:basedOn w:val="DefaultParagraphFont"/>
     <w:uiPriority w:val="73"/>
     <w:qFormat/>
     <w:rsid w:val="003468F2"/>
@@ -15887,10 +16082,10 @@
       <w:u w:val="single"/>
     </w:rPr>
   </w:style>
-  <w:style w:type="character" w:customStyle="1" w:styleId="Kop1Teken">
-    <w:name w:val="Kop 1 Teken"/>
-    <w:basedOn w:val="Standaardalinea-lettertype"/>
-    <w:link w:val="Kop1"/>
+  <w:style w:type="character" w:customStyle="1" w:styleId="Heading1Char">
+    <w:name w:val="Heading 1 Char"/>
+    <w:basedOn w:val="DefaultParagraphFont"/>
+    <w:link w:val="Heading1"/>
     <w:uiPriority w:val="9"/>
     <w:rsid w:val="00887BC0"/>
     <w:rPr>
@@ -15903,11 +16098,11 @@
       <w:lang w:val="el-GR" w:eastAsia="en-US"/>
     </w:rPr>
   </w:style>
-  <w:style w:type="character" w:customStyle="1" w:styleId="Kop3Teken">
-    <w:name w:val="Kop 3 Teken"/>
-    <w:aliases w:val="Exercise name Teken"/>
-    <w:basedOn w:val="Standaardalinea-lettertype"/>
-    <w:link w:val="Kop3"/>
+  <w:style w:type="character" w:customStyle="1" w:styleId="Heading3Char">
+    <w:name w:val="Heading 3 Char"/>
+    <w:aliases w:val="Exercise name Char"/>
+    <w:basedOn w:val="DefaultParagraphFont"/>
+    <w:link w:val="Heading3"/>
     <w:uiPriority w:val="9"/>
     <w:rsid w:val="00C76E28"/>
     <w:rPr>
@@ -15920,9 +16115,9 @@
       <w:lang w:val="el-GR" w:eastAsia="en-US"/>
     </w:rPr>
   </w:style>
-  <w:style w:type="character" w:styleId="Subtieleverwijzing">
+  <w:style w:type="character" w:styleId="SubtleReference">
     <w:name w:val="Subtle Reference"/>
-    <w:basedOn w:val="Standaardalinea-lettertype"/>
+    <w:basedOn w:val="DefaultParagraphFont"/>
     <w:uiPriority w:val="72"/>
     <w:rsid w:val="003468F2"/>
     <w:rPr>
@@ -15932,11 +16127,11 @@
       <w:u w:val="single"/>
     </w:rPr>
   </w:style>
-  <w:style w:type="character" w:customStyle="1" w:styleId="Kop4Teken">
-    <w:name w:val="Kop 4 Teken"/>
-    <w:aliases w:val="Table caption Teken"/>
-    <w:basedOn w:val="Standaardalinea-lettertype"/>
-    <w:link w:val="Kop4"/>
+  <w:style w:type="character" w:customStyle="1" w:styleId="Heading4Char">
+    <w:name w:val="Heading 4 Char"/>
+    <w:aliases w:val="Table caption Char"/>
+    <w:basedOn w:val="DefaultParagraphFont"/>
+    <w:link w:val="Heading4"/>
     <w:uiPriority w:val="9"/>
     <w:rsid w:val="00186603"/>
     <w:rPr>
@@ -15949,9 +16144,9 @@
       <w:lang w:val="el-GR" w:eastAsia="en-US"/>
     </w:rPr>
   </w:style>
-  <w:style w:type="paragraph" w:styleId="Lijstalinea">
+  <w:style w:type="paragraph" w:styleId="ListParagraph">
     <w:name w:val="List Paragraph"/>
-    <w:basedOn w:val="Normaal"/>
+    <w:basedOn w:val="Normal"/>
     <w:uiPriority w:val="63"/>
     <w:qFormat/>
     <w:rsid w:val="00B951D0"/>
@@ -15960,14 +16155,14 @@
       <w:contextualSpacing/>
     </w:pPr>
   </w:style>
-  <w:style w:type="character" w:styleId="Paginanummer">
+  <w:style w:type="character" w:styleId="PageNumber">
     <w:name w:val="page number"/>
-    <w:basedOn w:val="Standaardalinea-lettertype"/>
+    <w:basedOn w:val="DefaultParagraphFont"/>
     <w:rsid w:val="0068790D"/>
   </w:style>
-  <w:style w:type="character" w:styleId="GevolgdeHyperlink">
+  <w:style w:type="character" w:styleId="FollowedHyperlink">
     <w:name w:val="FollowedHyperlink"/>
-    <w:basedOn w:val="Standaardalinea-lettertype"/>
+    <w:basedOn w:val="DefaultParagraphFont"/>
     <w:uiPriority w:val="99"/>
     <w:semiHidden/>
     <w:unhideWhenUsed/>
@@ -15977,9 +16172,9 @@
       <w:u w:val="single"/>
     </w:rPr>
   </w:style>
-  <w:style w:type="character" w:styleId="Tekstvantijdelijkeaanduiding">
+  <w:style w:type="character" w:styleId="PlaceholderText">
     <w:name w:val="Placeholder Text"/>
-    <w:basedOn w:val="Standaardalinea-lettertype"/>
+    <w:basedOn w:val="DefaultParagraphFont"/>
     <w:uiPriority w:val="99"/>
     <w:unhideWhenUsed/>
     <w:rsid w:val="000F4E6D"/>
@@ -15987,16 +16182,15 @@
       <w:color w:val="808080"/>
     </w:rPr>
   </w:style>
-  <w:style w:type="table" w:styleId="Gemiddeldearcering1-accent1">
+  <w:style w:type="table" w:styleId="MediumShading1-Accent1">
     <w:name w:val="Medium Shading 1 Accent 1"/>
-    <w:basedOn w:val="Standaardtabel"/>
+    <w:basedOn w:val="TableNormal"/>
     <w:uiPriority w:val="1"/>
     <w:qFormat/>
     <w:rsid w:val="008E0E01"/>
     <w:tblPr>
       <w:tblStyleRowBandSize w:val="1"/>
       <w:tblStyleColBandSize w:val="1"/>
-      <w:tblInd w:w="0" w:type="dxa"/>
       <w:tblBorders>
         <w:top w:val="single" w:sz="8" w:space="0" w:color="00F2F2" w:themeColor="accent1" w:themeTint="BF"/>
         <w:left w:val="single" w:sz="8" w:space="0" w:color="00F2F2" w:themeColor="accent1" w:themeTint="BF"/>
@@ -16004,12 +16198,6 @@
         <w:right w:val="single" w:sz="8" w:space="0" w:color="00F2F2" w:themeColor="accent1" w:themeTint="BF"/>
         <w:insideH w:val="single" w:sz="8" w:space="0" w:color="00F2F2" w:themeColor="accent1" w:themeTint="BF"/>
       </w:tblBorders>
-      <w:tblCellMar>
-        <w:top w:w="0" w:type="dxa"/>
-        <w:left w:w="108" w:type="dxa"/>
-        <w:bottom w:w="0" w:type="dxa"/>
-        <w:right w:w="108" w:type="dxa"/>
-      </w:tblCellMar>
     </w:tblPr>
     <w:tblStylePr w:type="firstRow">
       <w:pPr>
@@ -16091,10 +16279,10 @@
       </w:tcPr>
     </w:tblStylePr>
   </w:style>
-  <w:style w:type="paragraph" w:styleId="Documentstructuur">
+  <w:style w:type="paragraph" w:styleId="DocumentMap">
     <w:name w:val="Document Map"/>
-    <w:basedOn w:val="Normaal"/>
-    <w:link w:val="DocumentstructuurTeken"/>
+    <w:basedOn w:val="Normal"/>
+    <w:link w:val="DocumentMapChar"/>
     <w:uiPriority w:val="99"/>
     <w:semiHidden/>
     <w:unhideWhenUsed/>
@@ -16108,1051 +16296,10 @@
       <w:szCs w:val="24"/>
     </w:rPr>
   </w:style>
-  <w:style w:type="character" w:customStyle="1" w:styleId="DocumentstructuurTeken">
-    <w:name w:val="Documentstructuur Teken"/>
-    <w:basedOn w:val="Standaardalinea-lettertype"/>
-    <w:link w:val="Documentstructuur"/>
-    <w:uiPriority w:val="99"/>
-    <w:semiHidden/>
-    <w:rsid w:val="00A2161D"/>
-    <w:rPr>
-      <w:rFonts w:ascii="Lucida Grande" w:hAnsi="Lucida Grande" w:cs="Lucida Grande"/>
-      <w:sz w:val="24"/>
-      <w:szCs w:val="24"/>
-      <w:lang w:val="el-GR" w:eastAsia="en-US"/>
-    </w:rPr>
-  </w:style>
-</w:styles>
-</file>
-
-<file path=word/stylesWithEffects.xml><?xml version="1.0" encoding="utf-8"?>
-<w:styles xmlns:wpc="http://schemas.microsoft.com/office/word/2010/wordprocessingCanvas" xmlns:mo="http://schemas.microsoft.com/office/mac/office/2008/main" xmlns:mc="http://schemas.openxmlformats.org/markup-compatibility/2006" xmlns:mv="urn:schemas-microsoft-com:mac:vml" xmlns:o="urn:schemas-microsoft-com:office:office" xmlns:r="http://schemas.openxmlformats.org/officeDocument/2006/relationships" xmlns:m="http://schemas.openxmlformats.org/officeDocument/2006/math" xmlns:v="urn:schemas-microsoft-com:vml" xmlns:wp14="http://schemas.microsoft.com/office/word/2010/wordprocessingDrawing" xmlns:wp="http://schemas.openxmlformats.org/drawingml/2006/wordprocessingDrawing" xmlns:w10="urn:schemas-microsoft-com:office:word" xmlns:w="http://schemas.openxmlformats.org/wordprocessingml/2006/main" xmlns:w14="http://schemas.microsoft.com/office/word/2010/wordml" xmlns:wpg="http://schemas.microsoft.com/office/word/2010/wordprocessingGroup" xmlns:wpi="http://schemas.microsoft.com/office/word/2010/wordprocessingInk" xmlns:wne="http://schemas.microsoft.com/office/word/2006/wordml" xmlns:wps="http://schemas.microsoft.com/office/word/2010/wordprocessingShape" mc:Ignorable="w14 wp14">
-  <w:docDefaults>
-    <w:rPrDefault>
-      <w:rPr>
-        <w:rFonts w:ascii="Calibri" w:eastAsia="Calibri" w:hAnsi="Calibri" w:cs="Times New Roman"/>
-        <w:lang w:val="en-GB" w:eastAsia="en-GB" w:bidi="ar-SA"/>
-      </w:rPr>
-    </w:rPrDefault>
-    <w:pPrDefault/>
-  </w:docDefaults>
-  <w:latentStyles w:defLockedState="0" w:defUIPriority="99" w:defSemiHidden="1" w:defUnhideWhenUsed="1" w:defQFormat="0" w:count="276">
-    <w:lsdException w:name="Normal" w:semiHidden="0" w:uiPriority="0" w:unhideWhenUsed="0" w:qFormat="1"/>
-    <w:lsdException w:name="heading 1" w:semiHidden="0" w:uiPriority="9" w:unhideWhenUsed="0" w:qFormat="1"/>
-    <w:lsdException w:name="heading 2" w:uiPriority="9" w:qFormat="1"/>
-    <w:lsdException w:name="heading 3" w:uiPriority="9" w:qFormat="1"/>
-    <w:lsdException w:name="heading 4" w:uiPriority="9" w:qFormat="1"/>
-    <w:lsdException w:name="heading 5" w:uiPriority="9" w:qFormat="1"/>
-    <w:lsdException w:name="heading 6" w:uiPriority="9" w:qFormat="1"/>
-    <w:lsdException w:name="heading 7" w:uiPriority="9" w:qFormat="1"/>
-    <w:lsdException w:name="heading 8" w:uiPriority="9" w:qFormat="1"/>
-    <w:lsdException w:name="heading 9" w:uiPriority="9" w:qFormat="1"/>
-    <w:lsdException w:name="toc 1" w:uiPriority="39"/>
-    <w:lsdException w:name="toc 2" w:uiPriority="39"/>
-    <w:lsdException w:name="toc 3" w:uiPriority="39"/>
-    <w:lsdException w:name="toc 4" w:uiPriority="39"/>
-    <w:lsdException w:name="toc 5" w:uiPriority="39"/>
-    <w:lsdException w:name="toc 6" w:uiPriority="39"/>
-    <w:lsdException w:name="toc 7" w:uiPriority="39"/>
-    <w:lsdException w:name="toc 8" w:uiPriority="39"/>
-    <w:lsdException w:name="toc 9" w:uiPriority="39"/>
-    <w:lsdException w:name="footer" w:qFormat="1"/>
-    <w:lsdException w:name="caption" w:uiPriority="35" w:qFormat="1"/>
-    <w:lsdException w:name="page number" w:uiPriority="0"/>
-    <w:lsdException w:name="Title" w:semiHidden="0" w:uiPriority="10" w:unhideWhenUsed="0" w:qFormat="1"/>
-    <w:lsdException w:name="Default Paragraph Font" w:uiPriority="1"/>
-    <w:lsdException w:name="Subtitle" w:semiHidden="0" w:uiPriority="11" w:unhideWhenUsed="0" w:qFormat="1"/>
-    <w:lsdException w:name="Hyperlink" w:qFormat="1"/>
-    <w:lsdException w:name="Strong" w:semiHidden="0" w:uiPriority="22" w:unhideWhenUsed="0" w:qFormat="1"/>
-    <w:lsdException w:name="Emphasis" w:semiHidden="0" w:uiPriority="20" w:unhideWhenUsed="0" w:qFormat="1"/>
-    <w:lsdException w:name="Table Grid" w:semiHidden="0" w:uiPriority="59" w:unhideWhenUsed="0"/>
-    <w:lsdException w:name="Note Level 1" w:semiHidden="0" w:unhideWhenUsed="0"/>
-    <w:lsdException w:name="Note Level 2" w:semiHidden="0" w:unhideWhenUsed="0"/>
-    <w:lsdException w:name="Note Level 3" w:semiHidden="0" w:unhideWhenUsed="0"/>
-    <w:lsdException w:name="Note Level 4" w:semiHidden="0" w:unhideWhenUsed="0"/>
-    <w:lsdException w:name="Note Level 5" w:semiHidden="0" w:unhideWhenUsed="0"/>
-    <w:lsdException w:name="Note Level 6" w:semiHidden="0" w:unhideWhenUsed="0"/>
-    <w:lsdException w:name="Note Level 7" w:semiHidden="0" w:unhideWhenUsed="0"/>
-    <w:lsdException w:name="Note Level 8" w:semiHidden="0" w:unhideWhenUsed="0"/>
-    <w:lsdException w:name="Note Level 9" w:semiHidden="0" w:unhideWhenUsed="0"/>
-    <w:lsdException w:name="Placeholder Text" w:unhideWhenUsed="0"/>
-    <w:lsdException w:name="No Spacing" w:semiHidden="0" w:unhideWhenUsed="0" w:qFormat="1"/>
-    <w:lsdException w:name="Light Shading" w:semiHidden="0" w:unhideWhenUsed="0"/>
-    <w:lsdException w:name="Light List" w:semiHidden="0" w:unhideWhenUsed="0"/>
-    <w:lsdException w:name="Light Grid" w:semiHidden="0" w:unhideWhenUsed="0"/>
-    <w:lsdException w:name="Medium Shading 1" w:semiHidden="0" w:unhideWhenUsed="0"/>
-    <w:lsdException w:name="Medium Shading 2" w:semiHidden="0" w:unhideWhenUsed="0"/>
-    <w:lsdException w:name="Medium List 1" w:semiHidden="0" w:unhideWhenUsed="0"/>
-    <w:lsdException w:name="Medium List 2" w:semiHidden="0" w:unhideWhenUsed="0"/>
-    <w:lsdException w:name="Medium Grid 1" w:semiHidden="0" w:unhideWhenUsed="0"/>
-    <w:lsdException w:name="Medium Grid 2" w:semiHidden="0" w:unhideWhenUsed="0" w:qFormat="1"/>
-    <w:lsdException w:name="Medium Grid 3" w:semiHidden="0" w:unhideWhenUsed="0"/>
-    <w:lsdException w:name="Dark List" w:semiHidden="0" w:unhideWhenUsed="0"/>
-    <w:lsdException w:name="Colorful Shading" w:semiHidden="0" w:unhideWhenUsed="0"/>
-    <w:lsdException w:name="Colorful List" w:semiHidden="0" w:unhideWhenUsed="0"/>
-    <w:lsdException w:name="Colorful Grid" w:semiHidden="0" w:unhideWhenUsed="0"/>
-    <w:lsdException w:name="Light Shading Accent 1" w:semiHidden="0" w:unhideWhenUsed="0"/>
-    <w:lsdException w:name="Light List Accent 1" w:semiHidden="0" w:unhideWhenUsed="0"/>
-    <w:lsdException w:name="Light Grid Accent 1" w:semiHidden="0" w:unhideWhenUsed="0"/>
-    <w:lsdException w:name="Medium Shading 1 Accent 1" w:semiHidden="0" w:uiPriority="1" w:unhideWhenUsed="0" w:qFormat="1"/>
-    <w:lsdException w:name="Medium Shading 2 Accent 1" w:semiHidden="0" w:uiPriority="60" w:unhideWhenUsed="0"/>
-    <w:lsdException w:name="Medium List 1 Accent 1" w:semiHidden="0" w:uiPriority="61" w:unhideWhenUsed="0"/>
-    <w:lsdException w:name="Revision" w:uiPriority="62" w:unhideWhenUsed="0"/>
-    <w:lsdException w:name="List Paragraph" w:semiHidden="0" w:uiPriority="63" w:unhideWhenUsed="0" w:qFormat="1"/>
-    <w:lsdException w:name="Quote" w:semiHidden="0" w:uiPriority="64" w:unhideWhenUsed="0" w:qFormat="1"/>
-    <w:lsdException w:name="Intense Quote" w:semiHidden="0" w:uiPriority="65" w:unhideWhenUsed="0" w:qFormat="1"/>
-    <w:lsdException w:name="Medium List 2 Accent 1" w:semiHidden="0" w:uiPriority="66" w:unhideWhenUsed="0"/>
-    <w:lsdException w:name="Medium Grid 1 Accent 1" w:semiHidden="0" w:uiPriority="67" w:unhideWhenUsed="0"/>
-    <w:lsdException w:name="Medium Grid 2 Accent 1" w:semiHidden="0" w:uiPriority="68" w:unhideWhenUsed="0"/>
-    <w:lsdException w:name="Medium Grid 3 Accent 1" w:semiHidden="0" w:uiPriority="69" w:unhideWhenUsed="0"/>
-    <w:lsdException w:name="Dark List Accent 1" w:semiHidden="0" w:uiPriority="70" w:unhideWhenUsed="0"/>
-    <w:lsdException w:name="Colorful Shading Accent 1" w:semiHidden="0" w:uiPriority="71" w:unhideWhenUsed="0"/>
-    <w:lsdException w:name="Colorful List Accent 1" w:semiHidden="0" w:uiPriority="72" w:unhideWhenUsed="0" w:qFormat="1"/>
-    <w:lsdException w:name="Colorful Grid Accent 1" w:semiHidden="0" w:uiPriority="73" w:unhideWhenUsed="0" w:qFormat="1"/>
-    <w:lsdException w:name="Light Shading Accent 2" w:semiHidden="0" w:uiPriority="60" w:unhideWhenUsed="0" w:qFormat="1"/>
-    <w:lsdException w:name="Light List Accent 2" w:semiHidden="0" w:uiPriority="61" w:unhideWhenUsed="0"/>
-    <w:lsdException w:name="Light Grid Accent 2" w:semiHidden="0" w:uiPriority="62" w:unhideWhenUsed="0"/>
-    <w:lsdException w:name="Medium Shading 1 Accent 2" w:semiHidden="0" w:uiPriority="63" w:unhideWhenUsed="0"/>
-    <w:lsdException w:name="Medium Shading 2 Accent 2" w:semiHidden="0" w:uiPriority="64" w:unhideWhenUsed="0"/>
-    <w:lsdException w:name="Medium List 1 Accent 2" w:semiHidden="0" w:uiPriority="65" w:unhideWhenUsed="0"/>
-    <w:lsdException w:name="Medium List 2 Accent 2" w:semiHidden="0" w:unhideWhenUsed="0"/>
-    <w:lsdException w:name="Medium Grid 1 Accent 2" w:semiHidden="0" w:uiPriority="34" w:unhideWhenUsed="0" w:qFormat="1"/>
-    <w:lsdException w:name="Medium Grid 2 Accent 2" w:semiHidden="0" w:uiPriority="29" w:unhideWhenUsed="0" w:qFormat="1"/>
-    <w:lsdException w:name="Medium Grid 3 Accent 2" w:semiHidden="0" w:uiPriority="30" w:unhideWhenUsed="0" w:qFormat="1"/>
-    <w:lsdException w:name="Dark List Accent 2" w:semiHidden="0" w:uiPriority="66" w:unhideWhenUsed="0"/>
-    <w:lsdException w:name="Colorful Shading Accent 2" w:semiHidden="0" w:uiPriority="67" w:unhideWhenUsed="0"/>
-    <w:lsdException w:name="Colorful List Accent 2" w:semiHidden="0" w:uiPriority="68" w:unhideWhenUsed="0"/>
-    <w:lsdException w:name="Colorful Grid Accent 2" w:semiHidden="0" w:uiPriority="69" w:unhideWhenUsed="0"/>
-    <w:lsdException w:name="Light Shading Accent 3" w:semiHidden="0" w:uiPriority="70" w:unhideWhenUsed="0"/>
-    <w:lsdException w:name="Light List Accent 3" w:semiHidden="0" w:uiPriority="71" w:unhideWhenUsed="0"/>
-    <w:lsdException w:name="Light Grid Accent 3" w:semiHidden="0" w:uiPriority="72" w:unhideWhenUsed="0"/>
-    <w:lsdException w:name="Medium Shading 1 Accent 3" w:semiHidden="0" w:uiPriority="73" w:unhideWhenUsed="0"/>
-    <w:lsdException w:name="Medium Shading 2 Accent 3" w:semiHidden="0" w:uiPriority="60" w:unhideWhenUsed="0"/>
-    <w:lsdException w:name="Medium List 1 Accent 3" w:semiHidden="0" w:uiPriority="61" w:unhideWhenUsed="0"/>
-    <w:lsdException w:name="Medium List 2 Accent 3" w:semiHidden="0" w:uiPriority="62" w:unhideWhenUsed="0"/>
-    <w:lsdException w:name="Medium Grid 1 Accent 3" w:semiHidden="0" w:uiPriority="63" w:unhideWhenUsed="0"/>
-    <w:lsdException w:name="Medium Grid 2 Accent 3" w:semiHidden="0" w:uiPriority="64" w:unhideWhenUsed="0"/>
-    <w:lsdException w:name="Medium Grid 3 Accent 3" w:semiHidden="0" w:uiPriority="65" w:unhideWhenUsed="0"/>
-    <w:lsdException w:name="Dark List Accent 3" w:semiHidden="0" w:uiPriority="66" w:unhideWhenUsed="0"/>
-    <w:lsdException w:name="Colorful Shading Accent 3" w:semiHidden="0" w:uiPriority="67" w:unhideWhenUsed="0"/>
-    <w:lsdException w:name="Colorful List Accent 3" w:semiHidden="0" w:uiPriority="68" w:unhideWhenUsed="0"/>
-    <w:lsdException w:name="Colorful Grid Accent 3" w:semiHidden="0" w:uiPriority="69" w:unhideWhenUsed="0"/>
-    <w:lsdException w:name="Light Shading Accent 4" w:semiHidden="0" w:uiPriority="70" w:unhideWhenUsed="0"/>
-    <w:lsdException w:name="Light List Accent 4" w:semiHidden="0" w:uiPriority="71" w:unhideWhenUsed="0"/>
-    <w:lsdException w:name="Light Grid Accent 4" w:semiHidden="0" w:uiPriority="72" w:unhideWhenUsed="0"/>
-    <w:lsdException w:name="Medium Shading 1 Accent 4" w:semiHidden="0" w:uiPriority="73" w:unhideWhenUsed="0"/>
-    <w:lsdException w:name="Medium Shading 2 Accent 4" w:semiHidden="0" w:uiPriority="60" w:unhideWhenUsed="0"/>
-    <w:lsdException w:name="Medium List 1 Accent 4" w:semiHidden="0" w:uiPriority="61" w:unhideWhenUsed="0"/>
-    <w:lsdException w:name="Medium List 2 Accent 4" w:semiHidden="0" w:uiPriority="62" w:unhideWhenUsed="0"/>
-    <w:lsdException w:name="Medium Grid 1 Accent 4" w:semiHidden="0" w:uiPriority="63" w:unhideWhenUsed="0"/>
-    <w:lsdException w:name="Medium Grid 2 Accent 4" w:semiHidden="0" w:uiPriority="64" w:unhideWhenUsed="0"/>
-    <w:lsdException w:name="Medium Grid 3 Accent 4" w:semiHidden="0" w:uiPriority="65" w:unhideWhenUsed="0"/>
-    <w:lsdException w:name="Dark List Accent 4" w:semiHidden="0" w:uiPriority="66" w:unhideWhenUsed="0"/>
-    <w:lsdException w:name="Colorful Shading Accent 4" w:semiHidden="0" w:uiPriority="67" w:unhideWhenUsed="0"/>
-    <w:lsdException w:name="Colorful List Accent 4" w:semiHidden="0" w:uiPriority="68" w:unhideWhenUsed="0"/>
-    <w:lsdException w:name="Colorful Grid Accent 4" w:semiHidden="0" w:uiPriority="69" w:unhideWhenUsed="0"/>
-    <w:lsdException w:name="Light Shading Accent 5" w:semiHidden="0" w:uiPriority="70" w:unhideWhenUsed="0"/>
-    <w:lsdException w:name="Light List Accent 5" w:semiHidden="0" w:uiPriority="71" w:unhideWhenUsed="0"/>
-    <w:lsdException w:name="Light Grid Accent 5" w:semiHidden="0" w:uiPriority="72" w:unhideWhenUsed="0"/>
-    <w:lsdException w:name="Medium Shading 1 Accent 5" w:semiHidden="0" w:uiPriority="73" w:unhideWhenUsed="0"/>
-    <w:lsdException w:name="Medium Shading 2 Accent 5" w:semiHidden="0" w:uiPriority="60" w:unhideWhenUsed="0"/>
-    <w:lsdException w:name="Medium List 1 Accent 5" w:semiHidden="0" w:uiPriority="61" w:unhideWhenUsed="0"/>
-    <w:lsdException w:name="Medium List 2 Accent 5" w:semiHidden="0" w:uiPriority="62" w:unhideWhenUsed="0"/>
-    <w:lsdException w:name="Medium Grid 1 Accent 5" w:semiHidden="0" w:uiPriority="63" w:unhideWhenUsed="0"/>
-    <w:lsdException w:name="Medium Grid 2 Accent 5" w:semiHidden="0" w:uiPriority="64" w:unhideWhenUsed="0"/>
-    <w:lsdException w:name="Medium Grid 3 Accent 5" w:semiHidden="0" w:uiPriority="65" w:unhideWhenUsed="0"/>
-    <w:lsdException w:name="Dark List Accent 5" w:semiHidden="0" w:uiPriority="66" w:unhideWhenUsed="0"/>
-    <w:lsdException w:name="Colorful Shading Accent 5" w:semiHidden="0" w:uiPriority="67" w:unhideWhenUsed="0"/>
-    <w:lsdException w:name="Colorful List Accent 5" w:semiHidden="0" w:uiPriority="68" w:unhideWhenUsed="0"/>
-    <w:lsdException w:name="Colorful Grid Accent 5" w:semiHidden="0" w:uiPriority="69" w:unhideWhenUsed="0"/>
-    <w:lsdException w:name="Light Shading Accent 6" w:semiHidden="0" w:uiPriority="70" w:unhideWhenUsed="0"/>
-    <w:lsdException w:name="Light List Accent 6" w:semiHidden="0" w:uiPriority="71" w:unhideWhenUsed="0"/>
-    <w:lsdException w:name="Light Grid Accent 6" w:semiHidden="0" w:uiPriority="72" w:unhideWhenUsed="0"/>
-    <w:lsdException w:name="Medium Shading 1 Accent 6" w:semiHidden="0" w:uiPriority="73" w:unhideWhenUsed="0"/>
-    <w:lsdException w:name="Medium Shading 2 Accent 6" w:semiHidden="0" w:uiPriority="60" w:unhideWhenUsed="0"/>
-    <w:lsdException w:name="Medium List 1 Accent 6" w:semiHidden="0" w:uiPriority="61" w:unhideWhenUsed="0"/>
-    <w:lsdException w:name="Medium List 2 Accent 6" w:semiHidden="0" w:uiPriority="62" w:unhideWhenUsed="0"/>
-    <w:lsdException w:name="Medium Grid 1 Accent 6" w:semiHidden="0" w:uiPriority="63" w:unhideWhenUsed="0"/>
-    <w:lsdException w:name="Medium Grid 2 Accent 6" w:semiHidden="0" w:uiPriority="64" w:unhideWhenUsed="0"/>
-    <w:lsdException w:name="Medium Grid 3 Accent 6" w:semiHidden="0" w:uiPriority="65" w:unhideWhenUsed="0"/>
-    <w:lsdException w:name="Dark List Accent 6" w:semiHidden="0" w:uiPriority="66" w:unhideWhenUsed="0"/>
-    <w:lsdException w:name="Colorful Shading Accent 6" w:semiHidden="0" w:uiPriority="67" w:unhideWhenUsed="0"/>
-    <w:lsdException w:name="Colorful List Accent 6" w:semiHidden="0" w:uiPriority="68" w:unhideWhenUsed="0"/>
-    <w:lsdException w:name="Colorful Grid Accent 6" w:semiHidden="0" w:uiPriority="69" w:unhideWhenUsed="0"/>
-    <w:lsdException w:name="Subtle Emphasis" w:semiHidden="0" w:uiPriority="70" w:unhideWhenUsed="0" w:qFormat="1"/>
-    <w:lsdException w:name="Intense Emphasis" w:semiHidden="0" w:uiPriority="71" w:unhideWhenUsed="0" w:qFormat="1"/>
-    <w:lsdException w:name="Subtle Reference" w:semiHidden="0" w:uiPriority="72" w:unhideWhenUsed="0"/>
-    <w:lsdException w:name="Intense Reference" w:semiHidden="0" w:uiPriority="73" w:unhideWhenUsed="0" w:qFormat="1"/>
-    <w:lsdException w:name="Book Title" w:semiHidden="0" w:uiPriority="60" w:unhideWhenUsed="0" w:qFormat="1"/>
-    <w:lsdException w:name="Bibliography" w:uiPriority="61"/>
-    <w:lsdException w:name="TOC Heading" w:uiPriority="62" w:qFormat="1"/>
-  </w:latentStyles>
-  <w:style w:type="paragraph" w:default="1" w:styleId="Normaal">
-    <w:name w:val="Normal"/>
-    <w:qFormat/>
-    <w:rsid w:val="0022134A"/>
-    <w:pPr>
-      <w:spacing w:after="200" w:line="276" w:lineRule="auto"/>
-    </w:pPr>
-    <w:rPr>
-      <w:sz w:val="22"/>
-      <w:szCs w:val="22"/>
-      <w:lang w:val="el-GR" w:eastAsia="en-US"/>
-    </w:rPr>
-  </w:style>
-  <w:style w:type="paragraph" w:styleId="Kop1">
-    <w:name w:val="heading 1"/>
-    <w:basedOn w:val="Normaal"/>
-    <w:next w:val="Normaal"/>
-    <w:link w:val="Kop1Teken"/>
-    <w:uiPriority w:val="9"/>
-    <w:qFormat/>
-    <w:rsid w:val="00887BC0"/>
-    <w:pPr>
-      <w:keepNext/>
-      <w:keepLines/>
-      <w:spacing w:before="240" w:after="0"/>
-      <w:ind w:left="720"/>
-      <w:outlineLvl w:val="0"/>
-    </w:pPr>
-    <w:rPr>
-      <w:rFonts w:asciiTheme="majorHAnsi" w:eastAsiaTheme="majorEastAsia" w:hAnsiTheme="majorHAnsi" w:cstheme="majorBidi"/>
-      <w:b/>
-      <w:bCs/>
-      <w:color w:val="004D99"/>
-      <w:sz w:val="28"/>
-      <w:szCs w:val="28"/>
-    </w:rPr>
-  </w:style>
-  <w:style w:type="paragraph" w:styleId="Kop2">
-    <w:name w:val="heading 2"/>
-    <w:basedOn w:val="Normaal"/>
-    <w:next w:val="Normaal"/>
-    <w:link w:val="Kop2Teken"/>
-    <w:uiPriority w:val="9"/>
-    <w:unhideWhenUsed/>
-    <w:qFormat/>
-    <w:rsid w:val="003468F2"/>
-    <w:pPr>
-      <w:keepNext/>
-      <w:keepLines/>
-      <w:spacing w:before="200" w:after="0"/>
-      <w:outlineLvl w:val="1"/>
-    </w:pPr>
-    <w:rPr>
-      <w:rFonts w:asciiTheme="majorHAnsi" w:eastAsiaTheme="majorEastAsia" w:hAnsiTheme="majorHAnsi" w:cstheme="majorBidi"/>
-      <w:b/>
-      <w:bCs/>
-      <w:color w:val="009999"/>
-      <w:sz w:val="26"/>
-      <w:szCs w:val="26"/>
-    </w:rPr>
-  </w:style>
-  <w:style w:type="paragraph" w:styleId="Kop3">
-    <w:name w:val="heading 3"/>
-    <w:aliases w:val="Exercise name"/>
-    <w:basedOn w:val="Normaal"/>
-    <w:next w:val="Normaal"/>
-    <w:link w:val="Kop3Teken"/>
-    <w:uiPriority w:val="9"/>
-    <w:unhideWhenUsed/>
-    <w:qFormat/>
-    <w:rsid w:val="00C76E28"/>
-    <w:pPr>
-      <w:keepNext/>
-      <w:keepLines/>
-      <w:spacing w:before="200" w:after="0"/>
-      <w:outlineLvl w:val="2"/>
-    </w:pPr>
-    <w:rPr>
-      <w:rFonts w:asciiTheme="majorHAnsi" w:eastAsiaTheme="majorEastAsia" w:hAnsiTheme="majorHAnsi" w:cstheme="majorBidi"/>
-      <w:b/>
-      <w:bCs/>
-      <w:color w:val="004D99"/>
-      <w:sz w:val="24"/>
-    </w:rPr>
-  </w:style>
-  <w:style w:type="paragraph" w:styleId="Kop4">
-    <w:name w:val="heading 4"/>
-    <w:aliases w:val="Table caption"/>
-    <w:basedOn w:val="Normaal"/>
-    <w:next w:val="Normaal"/>
-    <w:link w:val="Kop4Teken"/>
-    <w:uiPriority w:val="9"/>
-    <w:unhideWhenUsed/>
-    <w:qFormat/>
-    <w:rsid w:val="00186603"/>
-    <w:pPr>
-      <w:keepNext/>
-      <w:keepLines/>
-      <w:spacing w:after="0"/>
-      <w:outlineLvl w:val="3"/>
-    </w:pPr>
-    <w:rPr>
-      <w:rFonts w:asciiTheme="majorHAnsi" w:eastAsiaTheme="majorEastAsia" w:hAnsiTheme="majorHAnsi" w:cstheme="majorBidi"/>
-      <w:bCs/>
-      <w:iCs/>
-      <w:color w:val="009999" w:themeColor="accent1"/>
-    </w:rPr>
-  </w:style>
-  <w:style w:type="character" w:default="1" w:styleId="Standaardalinea-lettertype">
-    <w:name w:val="Default Paragraph Font"/>
-    <w:uiPriority w:val="1"/>
-    <w:semiHidden/>
-    <w:unhideWhenUsed/>
-  </w:style>
-  <w:style w:type="table" w:default="1" w:styleId="Standaardtabel">
-    <w:name w:val="Normal Table"/>
-    <w:uiPriority w:val="99"/>
-    <w:semiHidden/>
-    <w:unhideWhenUsed/>
-    <w:tblPr>
-      <w:tblInd w:w="0" w:type="dxa"/>
-      <w:tblCellMar>
-        <w:top w:w="0" w:type="dxa"/>
-        <w:left w:w="108" w:type="dxa"/>
-        <w:bottom w:w="0" w:type="dxa"/>
-        <w:right w:w="108" w:type="dxa"/>
-      </w:tblCellMar>
-    </w:tblPr>
-  </w:style>
-  <w:style w:type="numbering" w:default="1" w:styleId="Geenlijst">
-    <w:name w:val="No List"/>
-    <w:uiPriority w:val="99"/>
-    <w:semiHidden/>
-    <w:unhideWhenUsed/>
-  </w:style>
-  <w:style w:type="paragraph" w:customStyle="1" w:styleId="MediumGrid1-Accent21">
-    <w:name w:val="Medium Grid 1 - Accent 21"/>
-    <w:basedOn w:val="Normaal"/>
-    <w:uiPriority w:val="34"/>
-    <w:qFormat/>
-    <w:rsid w:val="003468F2"/>
-    <w:pPr>
-      <w:ind w:left="720"/>
-      <w:contextualSpacing/>
-    </w:pPr>
-    <w:rPr>
-      <w:rFonts w:ascii="Verdana" w:hAnsi="Verdana"/>
-    </w:rPr>
-  </w:style>
-  <w:style w:type="table" w:styleId="Tabelraster">
-    <w:name w:val="Table Grid"/>
-    <w:basedOn w:val="Standaardtabel"/>
-    <w:uiPriority w:val="59"/>
-    <w:rsid w:val="0022134A"/>
-    <w:rPr>
-      <w:lang w:val="el-GR"/>
-    </w:rPr>
-    <w:tblPr>
-      <w:tblInd w:w="0" w:type="dxa"/>
-      <w:tblBorders>
-        <w:top w:val="single" w:sz="4" w:space="0" w:color="auto"/>
-        <w:left w:val="single" w:sz="4" w:space="0" w:color="auto"/>
-        <w:bottom w:val="single" w:sz="4" w:space="0" w:color="auto"/>
-        <w:right w:val="single" w:sz="4" w:space="0" w:color="auto"/>
-        <w:insideH w:val="single" w:sz="4" w:space="0" w:color="auto"/>
-        <w:insideV w:val="single" w:sz="4" w:space="0" w:color="auto"/>
-      </w:tblBorders>
-      <w:tblCellMar>
-        <w:top w:w="0" w:type="dxa"/>
-        <w:left w:w="108" w:type="dxa"/>
-        <w:bottom w:w="0" w:type="dxa"/>
-        <w:right w:w="108" w:type="dxa"/>
-      </w:tblCellMar>
-    </w:tblPr>
-  </w:style>
-  <w:style w:type="paragraph" w:customStyle="1" w:styleId="FirstParagraph">
-    <w:name w:val="First Paragraph"/>
-    <w:basedOn w:val="Plattetekst"/>
-    <w:next w:val="Plattetekst"/>
-    <w:qFormat/>
-    <w:rsid w:val="0022134A"/>
-    <w:pPr>
-      <w:spacing w:before="180" w:after="180" w:line="240" w:lineRule="auto"/>
-    </w:pPr>
-    <w:rPr>
-      <w:sz w:val="24"/>
-      <w:szCs w:val="24"/>
-      <w:lang w:val="en-US"/>
-    </w:rPr>
-  </w:style>
-  <w:style w:type="paragraph" w:styleId="Plattetekst">
-    <w:name w:val="Body Text"/>
-    <w:basedOn w:val="Normaal"/>
-    <w:link w:val="PlattetekstTeken"/>
-    <w:uiPriority w:val="99"/>
-    <w:semiHidden/>
-    <w:unhideWhenUsed/>
-    <w:rsid w:val="0022134A"/>
-    <w:pPr>
-      <w:spacing w:after="120"/>
-    </w:pPr>
-  </w:style>
-  <w:style w:type="character" w:customStyle="1" w:styleId="PlattetekstTeken">
-    <w:name w:val="Platte tekst Teken"/>
-    <w:link w:val="Plattetekst"/>
-    <w:uiPriority w:val="99"/>
-    <w:semiHidden/>
-    <w:rsid w:val="0022134A"/>
-    <w:rPr>
-      <w:lang w:val="el-GR"/>
-    </w:rPr>
-  </w:style>
-  <w:style w:type="paragraph" w:styleId="Ballontekst">
-    <w:name w:val="Balloon Text"/>
-    <w:basedOn w:val="Normaal"/>
-    <w:link w:val="BallontekstTeken"/>
-    <w:uiPriority w:val="99"/>
-    <w:semiHidden/>
-    <w:unhideWhenUsed/>
-    <w:rsid w:val="000D0C57"/>
-    <w:pPr>
-      <w:spacing w:after="0" w:line="240" w:lineRule="auto"/>
-    </w:pPr>
-    <w:rPr>
-      <w:rFonts w:ascii="Tahoma" w:hAnsi="Tahoma" w:cs="Tahoma"/>
-      <w:sz w:val="16"/>
-      <w:szCs w:val="16"/>
-    </w:rPr>
-  </w:style>
-  <w:style w:type="character" w:customStyle="1" w:styleId="BallontekstTeken">
-    <w:name w:val="Ballontekst Teken"/>
-    <w:link w:val="Ballontekst"/>
-    <w:uiPriority w:val="99"/>
-    <w:semiHidden/>
-    <w:rsid w:val="000D0C57"/>
-    <w:rPr>
-      <w:rFonts w:ascii="Tahoma" w:hAnsi="Tahoma" w:cs="Tahoma"/>
-      <w:sz w:val="16"/>
-      <w:szCs w:val="16"/>
-      <w:lang w:val="el-GR"/>
-    </w:rPr>
-  </w:style>
-  <w:style w:type="character" w:styleId="Verwijzingopmerking">
-    <w:name w:val="annotation reference"/>
-    <w:uiPriority w:val="99"/>
-    <w:semiHidden/>
-    <w:unhideWhenUsed/>
-    <w:rsid w:val="00660C85"/>
-    <w:rPr>
-      <w:sz w:val="16"/>
-      <w:szCs w:val="16"/>
-    </w:rPr>
-  </w:style>
-  <w:style w:type="paragraph" w:styleId="Tekstopmerking">
-    <w:name w:val="annotation text"/>
-    <w:basedOn w:val="Normaal"/>
-    <w:link w:val="TekstopmerkingTeken"/>
-    <w:uiPriority w:val="99"/>
-    <w:semiHidden/>
-    <w:unhideWhenUsed/>
-    <w:rsid w:val="00660C85"/>
-    <w:pPr>
-      <w:spacing w:line="240" w:lineRule="auto"/>
-    </w:pPr>
-    <w:rPr>
-      <w:sz w:val="20"/>
-      <w:szCs w:val="20"/>
-    </w:rPr>
-  </w:style>
-  <w:style w:type="character" w:customStyle="1" w:styleId="TekstopmerkingTeken">
-    <w:name w:val="Tekst opmerking Teken"/>
-    <w:link w:val="Tekstopmerking"/>
-    <w:uiPriority w:val="99"/>
-    <w:semiHidden/>
-    <w:rsid w:val="00660C85"/>
-    <w:rPr>
-      <w:sz w:val="20"/>
-      <w:szCs w:val="20"/>
-      <w:lang w:val="el-GR"/>
-    </w:rPr>
-  </w:style>
-  <w:style w:type="paragraph" w:styleId="Onderwerpvanopmerking">
-    <w:name w:val="annotation subject"/>
-    <w:basedOn w:val="Tekstopmerking"/>
-    <w:next w:val="Tekstopmerking"/>
-    <w:link w:val="OnderwerpvanopmerkingTeken"/>
-    <w:uiPriority w:val="99"/>
-    <w:semiHidden/>
-    <w:unhideWhenUsed/>
-    <w:rsid w:val="00660C85"/>
-    <w:rPr>
-      <w:b/>
-      <w:bCs/>
-    </w:rPr>
-  </w:style>
-  <w:style w:type="character" w:customStyle="1" w:styleId="OnderwerpvanopmerkingTeken">
-    <w:name w:val="Onderwerp van opmerking Teken"/>
-    <w:link w:val="Onderwerpvanopmerking"/>
-    <w:uiPriority w:val="99"/>
-    <w:semiHidden/>
-    <w:rsid w:val="00660C85"/>
-    <w:rPr>
-      <w:b/>
-      <w:bCs/>
-      <w:sz w:val="20"/>
-      <w:szCs w:val="20"/>
-      <w:lang w:val="el-GR"/>
-    </w:rPr>
-  </w:style>
-  <w:style w:type="paragraph" w:styleId="Koptekst">
-    <w:name w:val="header"/>
-    <w:basedOn w:val="Normaal"/>
-    <w:link w:val="KoptekstTeken"/>
-    <w:uiPriority w:val="99"/>
-    <w:unhideWhenUsed/>
-    <w:rsid w:val="006146D5"/>
-    <w:pPr>
-      <w:tabs>
-        <w:tab w:val="center" w:pos="4513"/>
-        <w:tab w:val="right" w:pos="9026"/>
-      </w:tabs>
-      <w:spacing w:after="0" w:line="240" w:lineRule="auto"/>
-    </w:pPr>
-  </w:style>
-  <w:style w:type="character" w:customStyle="1" w:styleId="KoptekstTeken">
-    <w:name w:val="Koptekst Teken"/>
-    <w:link w:val="Koptekst"/>
-    <w:uiPriority w:val="99"/>
-    <w:rsid w:val="006146D5"/>
-    <w:rPr>
-      <w:lang w:val="el-GR"/>
-    </w:rPr>
-  </w:style>
-  <w:style w:type="paragraph" w:styleId="Voettekst">
-    <w:name w:val="footer"/>
-    <w:basedOn w:val="Normaal"/>
-    <w:link w:val="VoettekstTeken"/>
-    <w:uiPriority w:val="99"/>
-    <w:unhideWhenUsed/>
-    <w:qFormat/>
-    <w:rsid w:val="003468F2"/>
-    <w:pPr>
-      <w:tabs>
-        <w:tab w:val="center" w:pos="4513"/>
-        <w:tab w:val="right" w:pos="9026"/>
-      </w:tabs>
-      <w:spacing w:after="0" w:line="240" w:lineRule="auto"/>
-    </w:pPr>
-    <w:rPr>
-      <w:rFonts w:ascii="Verdana" w:hAnsi="Verdana"/>
-      <w:color w:val="009999"/>
-      <w:sz w:val="20"/>
-    </w:rPr>
-  </w:style>
-  <w:style w:type="character" w:customStyle="1" w:styleId="VoettekstTeken">
-    <w:name w:val="Voettekst Teken"/>
-    <w:link w:val="Voettekst"/>
-    <w:uiPriority w:val="99"/>
-    <w:rsid w:val="003468F2"/>
-    <w:rPr>
-      <w:rFonts w:ascii="Verdana" w:hAnsi="Verdana"/>
-      <w:color w:val="009999"/>
-      <w:szCs w:val="22"/>
-      <w:lang w:val="el-GR" w:eastAsia="en-US"/>
-    </w:rPr>
-  </w:style>
-  <w:style w:type="paragraph" w:styleId="Normaalweb">
-    <w:name w:val="Normal (Web)"/>
-    <w:basedOn w:val="Normaal"/>
-    <w:uiPriority w:val="99"/>
-    <w:unhideWhenUsed/>
-    <w:rsid w:val="006146D5"/>
-    <w:pPr>
-      <w:spacing w:before="100" w:beforeAutospacing="1" w:after="100" w:afterAutospacing="1" w:line="240" w:lineRule="auto"/>
-    </w:pPr>
-    <w:rPr>
-      <w:rFonts w:ascii="Times New Roman" w:eastAsia="Times New Roman" w:hAnsi="Times New Roman"/>
-      <w:sz w:val="24"/>
-      <w:szCs w:val="24"/>
-      <w:lang w:val="en-GB" w:eastAsia="en-GB"/>
-    </w:rPr>
-  </w:style>
-  <w:style w:type="paragraph" w:customStyle="1" w:styleId="Normal1">
-    <w:name w:val="Normal1"/>
-    <w:rsid w:val="00E2089E"/>
-    <w:pPr>
-      <w:spacing w:line="276" w:lineRule="auto"/>
-    </w:pPr>
-    <w:rPr>
-      <w:rFonts w:ascii="Arial" w:eastAsia="Arial" w:hAnsi="Arial" w:cs="Arial"/>
-      <w:color w:val="000000"/>
-      <w:sz w:val="22"/>
-      <w:szCs w:val="22"/>
-      <w:lang w:val="nl-NL" w:eastAsia="nl-NL"/>
-    </w:rPr>
-  </w:style>
-  <w:style w:type="paragraph" w:customStyle="1" w:styleId="MediumList2-Accent21">
-    <w:name w:val="Medium List 2 - Accent 21"/>
-    <w:hidden/>
-    <w:uiPriority w:val="99"/>
-    <w:semiHidden/>
-    <w:rsid w:val="00736BB4"/>
-    <w:rPr>
-      <w:sz w:val="22"/>
-      <w:szCs w:val="22"/>
-      <w:lang w:val="el-GR" w:eastAsia="en-US"/>
-    </w:rPr>
-  </w:style>
-  <w:style w:type="character" w:styleId="Hyperlink">
-    <w:name w:val="Hyperlink"/>
-    <w:uiPriority w:val="99"/>
-    <w:unhideWhenUsed/>
-    <w:qFormat/>
-    <w:rsid w:val="003468F2"/>
-    <w:rPr>
-      <w:rFonts w:ascii="Verdana" w:hAnsi="Verdana"/>
-      <w:color w:val="009999"/>
-      <w:u w:val="single"/>
-    </w:rPr>
-  </w:style>
-  <w:style w:type="paragraph" w:styleId="Subtitel">
-    <w:name w:val="Subtitle"/>
-    <w:basedOn w:val="Normaal"/>
-    <w:next w:val="Normaal"/>
-    <w:link w:val="SubtitelTeken"/>
-    <w:uiPriority w:val="11"/>
-    <w:qFormat/>
-    <w:rsid w:val="003468F2"/>
-    <w:pPr>
-      <w:spacing w:after="60"/>
-      <w:jc w:val="center"/>
-      <w:outlineLvl w:val="1"/>
-    </w:pPr>
-    <w:rPr>
-      <w:rFonts w:ascii="Verdana" w:eastAsia="Times New Roman" w:hAnsi="Verdana"/>
-      <w:sz w:val="24"/>
-      <w:szCs w:val="24"/>
-    </w:rPr>
-  </w:style>
-  <w:style w:type="character" w:customStyle="1" w:styleId="SubtitelTeken">
-    <w:name w:val="Subtitel Teken"/>
-    <w:link w:val="Subtitel"/>
-    <w:uiPriority w:val="11"/>
-    <w:rsid w:val="003468F2"/>
-    <w:rPr>
-      <w:rFonts w:ascii="Verdana" w:eastAsia="Times New Roman" w:hAnsi="Verdana"/>
-      <w:sz w:val="24"/>
-      <w:szCs w:val="24"/>
-      <w:lang w:val="el-GR" w:eastAsia="en-US"/>
-    </w:rPr>
-  </w:style>
-  <w:style w:type="character" w:customStyle="1" w:styleId="IntenseEmphasis1">
-    <w:name w:val="Intense Emphasis1"/>
-    <w:uiPriority w:val="66"/>
-    <w:qFormat/>
-    <w:rsid w:val="00F63F60"/>
-    <w:rPr>
-      <w:b/>
-      <w:bCs/>
-      <w:i/>
-      <w:iCs/>
-      <w:color w:val="4F81BD"/>
-    </w:rPr>
-  </w:style>
-  <w:style w:type="paragraph" w:styleId="Titel">
-    <w:name w:val="Title"/>
-    <w:basedOn w:val="Normaal"/>
-    <w:next w:val="Normaal"/>
-    <w:link w:val="TitelTeken"/>
-    <w:uiPriority w:val="10"/>
-    <w:qFormat/>
-    <w:rsid w:val="00887BC0"/>
-    <w:pPr>
-      <w:spacing w:before="240" w:after="60"/>
-      <w:ind w:left="720"/>
-      <w:outlineLvl w:val="0"/>
-    </w:pPr>
-    <w:rPr>
-      <w:rFonts w:ascii="Verdana" w:eastAsia="Times New Roman" w:hAnsi="Verdana"/>
-      <w:b/>
-      <w:bCs/>
-      <w:kern w:val="28"/>
-      <w:sz w:val="30"/>
-      <w:szCs w:val="32"/>
-    </w:rPr>
-  </w:style>
-  <w:style w:type="character" w:customStyle="1" w:styleId="TitelTeken">
-    <w:name w:val="Titel Teken"/>
-    <w:link w:val="Titel"/>
-    <w:uiPriority w:val="10"/>
-    <w:rsid w:val="00887BC0"/>
-    <w:rPr>
-      <w:rFonts w:ascii="Verdana" w:eastAsia="Times New Roman" w:hAnsi="Verdana"/>
-      <w:b/>
-      <w:bCs/>
-      <w:kern w:val="28"/>
-      <w:sz w:val="30"/>
-      <w:szCs w:val="32"/>
-      <w:lang w:val="el-GR" w:eastAsia="en-US"/>
-    </w:rPr>
-  </w:style>
-  <w:style w:type="character" w:customStyle="1" w:styleId="Kop2Teken">
-    <w:name w:val="Kop 2 Teken"/>
-    <w:basedOn w:val="Standaardalinea-lettertype"/>
-    <w:link w:val="Kop2"/>
-    <w:uiPriority w:val="9"/>
-    <w:rsid w:val="003468F2"/>
-    <w:rPr>
-      <w:rFonts w:asciiTheme="majorHAnsi" w:eastAsiaTheme="majorEastAsia" w:hAnsiTheme="majorHAnsi" w:cstheme="majorBidi"/>
-      <w:b/>
-      <w:bCs/>
-      <w:color w:val="009999"/>
-      <w:sz w:val="26"/>
-      <w:szCs w:val="26"/>
-      <w:lang w:val="el-GR" w:eastAsia="en-US"/>
-    </w:rPr>
-  </w:style>
-  <w:style w:type="paragraph" w:styleId="Citaat">
-    <w:name w:val="Quote"/>
-    <w:basedOn w:val="Normaal"/>
-    <w:next w:val="Normaal"/>
-    <w:link w:val="CitaatTeken"/>
-    <w:uiPriority w:val="64"/>
-    <w:qFormat/>
-    <w:rsid w:val="003468F2"/>
-    <w:rPr>
-      <w:rFonts w:ascii="Verdana" w:hAnsi="Verdana"/>
-      <w:i/>
-      <w:iCs/>
-      <w:color w:val="004D99"/>
-    </w:rPr>
-  </w:style>
-  <w:style w:type="character" w:customStyle="1" w:styleId="CitaatTeken">
-    <w:name w:val="Citaat Teken"/>
-    <w:basedOn w:val="Standaardalinea-lettertype"/>
-    <w:link w:val="Citaat"/>
-    <w:uiPriority w:val="64"/>
-    <w:rsid w:val="003468F2"/>
-    <w:rPr>
-      <w:rFonts w:ascii="Verdana" w:hAnsi="Verdana"/>
-      <w:i/>
-      <w:iCs/>
-      <w:color w:val="004D99"/>
-      <w:sz w:val="22"/>
-      <w:szCs w:val="22"/>
-      <w:lang w:val="el-GR" w:eastAsia="en-US"/>
-    </w:rPr>
-  </w:style>
-  <w:style w:type="paragraph" w:styleId="Duidelijkcitaat">
-    <w:name w:val="Intense Quote"/>
-    <w:basedOn w:val="Normaal"/>
-    <w:next w:val="Normaal"/>
-    <w:link w:val="DuidelijkcitaatTeken"/>
-    <w:uiPriority w:val="65"/>
-    <w:qFormat/>
-    <w:rsid w:val="003468F2"/>
-    <w:pPr>
-      <w:pBdr>
-        <w:bottom w:val="single" w:sz="4" w:space="4" w:color="009999" w:themeColor="accent1"/>
-      </w:pBdr>
-      <w:spacing w:before="200" w:after="280"/>
-      <w:ind w:left="936" w:right="936"/>
-    </w:pPr>
-    <w:rPr>
-      <w:rFonts w:ascii="Verdana" w:hAnsi="Verdana"/>
-      <w:b/>
-      <w:bCs/>
-      <w:i/>
-      <w:iCs/>
-      <w:color w:val="004D99"/>
-    </w:rPr>
-  </w:style>
-  <w:style w:type="character" w:customStyle="1" w:styleId="DuidelijkcitaatTeken">
-    <w:name w:val="Duidelijk citaat Teken"/>
-    <w:basedOn w:val="Standaardalinea-lettertype"/>
-    <w:link w:val="Duidelijkcitaat"/>
-    <w:uiPriority w:val="65"/>
-    <w:rsid w:val="003468F2"/>
-    <w:rPr>
-      <w:rFonts w:ascii="Verdana" w:hAnsi="Verdana"/>
-      <w:b/>
-      <w:bCs/>
-      <w:i/>
-      <w:iCs/>
-      <w:color w:val="004D99"/>
-      <w:sz w:val="22"/>
-      <w:szCs w:val="22"/>
-      <w:lang w:val="el-GR" w:eastAsia="en-US"/>
-    </w:rPr>
-  </w:style>
-  <w:style w:type="character" w:styleId="Nadruk">
-    <w:name w:val="Emphasis"/>
-    <w:basedOn w:val="Standaardalinea-lettertype"/>
-    <w:uiPriority w:val="20"/>
-    <w:qFormat/>
-    <w:rsid w:val="003468F2"/>
-    <w:rPr>
-      <w:rFonts w:ascii="Verdana" w:hAnsi="Verdana"/>
-      <w:i/>
-      <w:iCs/>
-    </w:rPr>
-  </w:style>
-  <w:style w:type="paragraph" w:styleId="Bibliografie">
-    <w:name w:val="Bibliography"/>
-    <w:basedOn w:val="Normaal"/>
-    <w:next w:val="Normaal"/>
-    <w:uiPriority w:val="61"/>
-    <w:rsid w:val="003468F2"/>
-    <w:rPr>
-      <w:rFonts w:ascii="Verdana" w:hAnsi="Verdana"/>
-    </w:rPr>
-  </w:style>
-  <w:style w:type="character" w:styleId="Zwaar">
-    <w:name w:val="Strong"/>
-    <w:basedOn w:val="Standaardalinea-lettertype"/>
-    <w:uiPriority w:val="22"/>
-    <w:qFormat/>
-    <w:rsid w:val="00887BC0"/>
-    <w:rPr>
-      <w:rFonts w:ascii="Verdana" w:hAnsi="Verdana"/>
-      <w:b/>
-      <w:bCs/>
-      <w:color w:val="004D99"/>
-    </w:rPr>
-  </w:style>
-  <w:style w:type="character" w:styleId="Intensieveverwijzing">
-    <w:name w:val="Intense Reference"/>
-    <w:basedOn w:val="Standaardalinea-lettertype"/>
-    <w:uiPriority w:val="73"/>
-    <w:qFormat/>
-    <w:rsid w:val="003468F2"/>
-    <w:rPr>
-      <w:rFonts w:ascii="Verdana" w:hAnsi="Verdana"/>
-      <w:b/>
-      <w:bCs/>
-      <w:smallCaps/>
-      <w:color w:val="696367"/>
-      <w:spacing w:val="5"/>
-      <w:u w:val="single"/>
-    </w:rPr>
-  </w:style>
-  <w:style w:type="character" w:customStyle="1" w:styleId="Kop1Teken">
-    <w:name w:val="Kop 1 Teken"/>
-    <w:basedOn w:val="Standaardalinea-lettertype"/>
-    <w:link w:val="Kop1"/>
-    <w:uiPriority w:val="9"/>
-    <w:rsid w:val="00887BC0"/>
-    <w:rPr>
-      <w:rFonts w:asciiTheme="majorHAnsi" w:eastAsiaTheme="majorEastAsia" w:hAnsiTheme="majorHAnsi" w:cstheme="majorBidi"/>
-      <w:b/>
-      <w:bCs/>
-      <w:color w:val="004D99"/>
-      <w:sz w:val="28"/>
-      <w:szCs w:val="28"/>
-      <w:lang w:val="el-GR" w:eastAsia="en-US"/>
-    </w:rPr>
-  </w:style>
-  <w:style w:type="character" w:customStyle="1" w:styleId="Kop3Teken">
-    <w:name w:val="Kop 3 Teken"/>
-    <w:aliases w:val="Exercise name Teken"/>
-    <w:basedOn w:val="Standaardalinea-lettertype"/>
-    <w:link w:val="Kop3"/>
-    <w:uiPriority w:val="9"/>
-    <w:rsid w:val="00C76E28"/>
-    <w:rPr>
-      <w:rFonts w:asciiTheme="majorHAnsi" w:eastAsiaTheme="majorEastAsia" w:hAnsiTheme="majorHAnsi" w:cstheme="majorBidi"/>
-      <w:b/>
-      <w:bCs/>
-      <w:color w:val="004D99"/>
-      <w:sz w:val="24"/>
-      <w:szCs w:val="22"/>
-      <w:lang w:val="el-GR" w:eastAsia="en-US"/>
-    </w:rPr>
-  </w:style>
-  <w:style w:type="character" w:styleId="Subtieleverwijzing">
-    <w:name w:val="Subtle Reference"/>
-    <w:basedOn w:val="Standaardalinea-lettertype"/>
-    <w:uiPriority w:val="72"/>
-    <w:rsid w:val="003468F2"/>
-    <w:rPr>
-      <w:rFonts w:ascii="Verdana" w:hAnsi="Verdana"/>
-      <w:smallCaps/>
-      <w:color w:val="696367"/>
-      <w:u w:val="single"/>
-    </w:rPr>
-  </w:style>
-  <w:style w:type="character" w:customStyle="1" w:styleId="Kop4Teken">
-    <w:name w:val="Kop 4 Teken"/>
-    <w:aliases w:val="Table caption Teken"/>
-    <w:basedOn w:val="Standaardalinea-lettertype"/>
-    <w:link w:val="Kop4"/>
-    <w:uiPriority w:val="9"/>
-    <w:rsid w:val="00186603"/>
-    <w:rPr>
-      <w:rFonts w:asciiTheme="majorHAnsi" w:eastAsiaTheme="majorEastAsia" w:hAnsiTheme="majorHAnsi" w:cstheme="majorBidi"/>
-      <w:bCs/>
-      <w:iCs/>
-      <w:color w:val="009999" w:themeColor="accent1"/>
-      <w:sz w:val="22"/>
-      <w:szCs w:val="22"/>
-      <w:lang w:val="el-GR" w:eastAsia="en-US"/>
-    </w:rPr>
-  </w:style>
-  <w:style w:type="paragraph" w:styleId="Lijstalinea">
-    <w:name w:val="List Paragraph"/>
-    <w:basedOn w:val="Normaal"/>
-    <w:uiPriority w:val="63"/>
-    <w:qFormat/>
-    <w:rsid w:val="00B951D0"/>
-    <w:pPr>
-      <w:ind w:left="720"/>
-      <w:contextualSpacing/>
-    </w:pPr>
-  </w:style>
-  <w:style w:type="character" w:styleId="Paginanummer">
-    <w:name w:val="page number"/>
-    <w:basedOn w:val="Standaardalinea-lettertype"/>
-    <w:rsid w:val="0068790D"/>
-  </w:style>
-  <w:style w:type="character" w:styleId="GevolgdeHyperlink">
-    <w:name w:val="FollowedHyperlink"/>
-    <w:basedOn w:val="Standaardalinea-lettertype"/>
-    <w:uiPriority w:val="99"/>
-    <w:semiHidden/>
-    <w:unhideWhenUsed/>
-    <w:rsid w:val="00CE3AEC"/>
-    <w:rPr>
-      <w:color w:val="FDAD1E" w:themeColor="followedHyperlink"/>
-      <w:u w:val="single"/>
-    </w:rPr>
-  </w:style>
-  <w:style w:type="character" w:styleId="Tekstvantijdelijkeaanduiding">
-    <w:name w:val="Placeholder Text"/>
-    <w:basedOn w:val="Standaardalinea-lettertype"/>
-    <w:uiPriority w:val="99"/>
-    <w:unhideWhenUsed/>
-    <w:rsid w:val="000F4E6D"/>
-    <w:rPr>
-      <w:color w:val="808080"/>
-    </w:rPr>
-  </w:style>
-  <w:style w:type="table" w:styleId="Gemiddeldearcering1-accent1">
-    <w:name w:val="Medium Shading 1 Accent 1"/>
-    <w:basedOn w:val="Standaardtabel"/>
-    <w:uiPriority w:val="1"/>
-    <w:qFormat/>
-    <w:rsid w:val="008E0E01"/>
-    <w:tblPr>
-      <w:tblStyleRowBandSize w:val="1"/>
-      <w:tblStyleColBandSize w:val="1"/>
-      <w:tblInd w:w="0" w:type="dxa"/>
-      <w:tblBorders>
-        <w:top w:val="single" w:sz="8" w:space="0" w:color="00F2F2" w:themeColor="accent1" w:themeTint="BF"/>
-        <w:left w:val="single" w:sz="8" w:space="0" w:color="00F2F2" w:themeColor="accent1" w:themeTint="BF"/>
-        <w:bottom w:val="single" w:sz="8" w:space="0" w:color="00F2F2" w:themeColor="accent1" w:themeTint="BF"/>
-        <w:right w:val="single" w:sz="8" w:space="0" w:color="00F2F2" w:themeColor="accent1" w:themeTint="BF"/>
-        <w:insideH w:val="single" w:sz="8" w:space="0" w:color="00F2F2" w:themeColor="accent1" w:themeTint="BF"/>
-      </w:tblBorders>
-      <w:tblCellMar>
-        <w:top w:w="0" w:type="dxa"/>
-        <w:left w:w="108" w:type="dxa"/>
-        <w:bottom w:w="0" w:type="dxa"/>
-        <w:right w:w="108" w:type="dxa"/>
-      </w:tblCellMar>
-    </w:tblPr>
-    <w:tblStylePr w:type="firstRow">
-      <w:pPr>
-        <w:spacing w:before="0" w:after="0" w:line="240" w:lineRule="auto"/>
-      </w:pPr>
-      <w:rPr>
-        <w:b/>
-        <w:bCs/>
-        <w:color w:val="FFFFFF" w:themeColor="background1"/>
-      </w:rPr>
-      <w:tblPr/>
-      <w:tcPr>
-        <w:tcBorders>
-          <w:top w:val="single" w:sz="8" w:space="0" w:color="00F2F2" w:themeColor="accent1" w:themeTint="BF"/>
-          <w:left w:val="single" w:sz="8" w:space="0" w:color="00F2F2" w:themeColor="accent1" w:themeTint="BF"/>
-          <w:bottom w:val="single" w:sz="8" w:space="0" w:color="00F2F2" w:themeColor="accent1" w:themeTint="BF"/>
-          <w:right w:val="single" w:sz="8" w:space="0" w:color="00F2F2" w:themeColor="accent1" w:themeTint="BF"/>
-          <w:insideH w:val="nil"/>
-          <w:insideV w:val="nil"/>
-        </w:tcBorders>
-        <w:shd w:val="clear" w:color="auto" w:fill="009999" w:themeFill="accent1"/>
-      </w:tcPr>
-    </w:tblStylePr>
-    <w:tblStylePr w:type="lastRow">
-      <w:pPr>
-        <w:spacing w:before="0" w:after="0" w:line="240" w:lineRule="auto"/>
-      </w:pPr>
-      <w:rPr>
-        <w:b/>
-        <w:bCs/>
-      </w:rPr>
-      <w:tblPr/>
-      <w:tcPr>
-        <w:tcBorders>
-          <w:top w:val="double" w:sz="6" w:space="0" w:color="00F2F2" w:themeColor="accent1" w:themeTint="BF"/>
-          <w:left w:val="single" w:sz="8" w:space="0" w:color="00F2F2" w:themeColor="accent1" w:themeTint="BF"/>
-          <w:bottom w:val="single" w:sz="8" w:space="0" w:color="00F2F2" w:themeColor="accent1" w:themeTint="BF"/>
-          <w:right w:val="single" w:sz="8" w:space="0" w:color="00F2F2" w:themeColor="accent1" w:themeTint="BF"/>
-          <w:insideH w:val="nil"/>
-          <w:insideV w:val="nil"/>
-        </w:tcBorders>
-      </w:tcPr>
-    </w:tblStylePr>
-    <w:tblStylePr w:type="firstCol">
-      <w:rPr>
-        <w:b/>
-        <w:bCs/>
-      </w:rPr>
-    </w:tblStylePr>
-    <w:tblStylePr w:type="lastCol">
-      <w:rPr>
-        <w:b/>
-        <w:bCs/>
-      </w:rPr>
-    </w:tblStylePr>
-    <w:tblStylePr w:type="band1Vert">
-      <w:tblPr/>
-      <w:tcPr>
-        <w:shd w:val="clear" w:color="auto" w:fill="A6FFFF" w:themeFill="accent1" w:themeFillTint="3F"/>
-      </w:tcPr>
-    </w:tblStylePr>
-    <w:tblStylePr w:type="band1Horz">
-      <w:tblPr/>
-      <w:tcPr>
-        <w:tcBorders>
-          <w:insideH w:val="nil"/>
-          <w:insideV w:val="nil"/>
-        </w:tcBorders>
-        <w:shd w:val="clear" w:color="auto" w:fill="A6FFFF" w:themeFill="accent1" w:themeFillTint="3F"/>
-      </w:tcPr>
-    </w:tblStylePr>
-    <w:tblStylePr w:type="band2Horz">
-      <w:tblPr/>
-      <w:tcPr>
-        <w:tcBorders>
-          <w:insideH w:val="nil"/>
-          <w:insideV w:val="nil"/>
-        </w:tcBorders>
-      </w:tcPr>
-    </w:tblStylePr>
-  </w:style>
-  <w:style w:type="paragraph" w:styleId="Documentstructuur">
-    <w:name w:val="Document Map"/>
-    <w:basedOn w:val="Normaal"/>
-    <w:link w:val="DocumentstructuurTeken"/>
-    <w:uiPriority w:val="99"/>
-    <w:semiHidden/>
-    <w:unhideWhenUsed/>
-    <w:rsid w:val="00A2161D"/>
-    <w:pPr>
-      <w:spacing w:after="0" w:line="240" w:lineRule="auto"/>
-    </w:pPr>
-    <w:rPr>
-      <w:rFonts w:ascii="Lucida Grande" w:hAnsi="Lucida Grande" w:cs="Lucida Grande"/>
-      <w:sz w:val="24"/>
-      <w:szCs w:val="24"/>
-    </w:rPr>
-  </w:style>
-  <w:style w:type="character" w:customStyle="1" w:styleId="DocumentstructuurTeken">
-    <w:name w:val="Documentstructuur Teken"/>
-    <w:basedOn w:val="Standaardalinea-lettertype"/>
-    <w:link w:val="Documentstructuur"/>
+  <w:style w:type="character" w:customStyle="1" w:styleId="DocumentMapChar">
+    <w:name w:val="Document Map Char"/>
+    <w:basedOn w:val="DefaultParagraphFont"/>
+    <w:link w:val="DocumentMap"/>
     <w:uiPriority w:val="99"/>
     <w:semiHidden/>
     <w:rsid w:val="00A2161D"/>
@@ -17456,7 +16603,7 @@
 </file>
 
 <file path=customXml/itemProps1.xml><?xml version="1.0" encoding="utf-8"?>
-<ds:datastoreItem xmlns:ds="http://schemas.openxmlformats.org/officeDocument/2006/customXml" ds:itemID="{1316FEF9-F8D3-234C-B8E3-7606FF682E78}">
+<ds:datastoreItem xmlns:ds="http://schemas.openxmlformats.org/officeDocument/2006/customXml" ds:itemID="{C62F07AD-D954-4F9C-BA05-384B62D41E29}">
   <ds:schemaRefs>
     <ds:schemaRef ds:uri="http://schemas.openxmlformats.org/officeDocument/2006/bibliography"/>
   </ds:schemaRefs>

</xml_diff>